<commit_message>
docs: add GitHub repo URL to cover and colophon
</commit_message>
<xml_diff>
--- a/docs/S3 Salle de Bain - Rapport Technique v3.docx
+++ b/docs/S3 Salle de Bain - Rapport Technique v3.docx
@@ -598,19 +598,22 @@
                 <w:sz w:val="12"/>
                 <w:szCs w:val="12"/>
               </w:rPr>
-              <w:t xml:space="preserve">REFERENCE</w:t>
-            </w:r>
-          </w:p>
-          <w:p>
-            <w:r>
-              <w:rPr>
-                <w:rFonts w:ascii="Courier New" w:cs="Courier New" w:eastAsia="Courier New" w:hAnsi="Courier New"/>
-                <w:color w:val="0F1419"/>
-                <w:sz w:val="17"/>
-                <w:szCs w:val="17"/>
-              </w:rPr>
-              <w:t xml:space="preserve">s3-salle-de-bain.yaml</w:t>
-            </w:r>
+              <w:t xml:space="preserve">DEPOT SOURCE</w:t>
+            </w:r>
+          </w:p>
+          <w:p>
+            <w:hyperlink w:history="1" r:id="rIduw3kryqilwq83xvwlxfcc">
+              <w:r>
+                <w:rPr>
+                  <w:rFonts w:ascii="Courier New" w:cs="Courier New" w:eastAsia="Courier New" w:hAnsi="Courier New"/>
+                  <w:color w:val="0B5563"/>
+                  <w:sz w:val="15"/>
+                  <w:szCs w:val="15"/>
+                  <w:u w:val="single"/>
+                </w:rPr>
+                <w:t xml:space="preserve">github.com/hanafi09/s3-salle-de-bain</w:t>
+              </w:r>
+            </w:hyperlink>
           </w:p>
         </w:tc>
         <w:tc>
@@ -7103,7 +7106,7 @@
             </w:tcMar>
           </w:tcPr>
           <w:p>
-            <w:hyperlink w:history="1" r:id="rIdwbx1xd09drqogjslzpffn">
+            <w:hyperlink w:history="1" r:id="rIdmhe3_fbumvygnkhrtommi">
               <w:r>
                 <w:rPr>
                   <w:rFonts w:ascii="Courier New" w:cs="Courier New" w:eastAsia="Courier New" w:hAnsi="Courier New"/>
@@ -7218,7 +7221,7 @@
             </w:tcMar>
           </w:tcPr>
           <w:p>
-            <w:hyperlink w:history="1" r:id="rId4qpbmgjr-8rgcigfsfsbg">
+            <w:hyperlink w:history="1" r:id="rId6lmruktoz3dxit6_vgglu">
               <w:r>
                 <w:rPr>
                   <w:rFonts w:ascii="Courier New" w:cs="Courier New" w:eastAsia="Courier New" w:hAnsi="Courier New"/>
@@ -7333,7 +7336,7 @@
             </w:tcMar>
           </w:tcPr>
           <w:p>
-            <w:hyperlink w:history="1" r:id="rIde_rg7lydg7f4x0baeywn9">
+            <w:hyperlink w:history="1" r:id="rId9mewnvgbvavnqdcfrtysa">
               <w:r>
                 <w:rPr>
                   <w:rFonts w:ascii="Courier New" w:cs="Courier New" w:eastAsia="Courier New" w:hAnsi="Courier New"/>
@@ -7448,7 +7451,7 @@
             </w:tcMar>
           </w:tcPr>
           <w:p>
-            <w:hyperlink w:history="1" r:id="rIdis3mmoco5oz1amludpt15">
+            <w:hyperlink w:history="1" r:id="rId_e0moeg-eanq2dedthury">
               <w:r>
                 <w:rPr>
                   <w:rFonts w:ascii="Courier New" w:cs="Courier New" w:eastAsia="Courier New" w:hAnsi="Courier New"/>
@@ -7563,7 +7566,7 @@
             </w:tcMar>
           </w:tcPr>
           <w:p>
-            <w:hyperlink w:history="1" r:id="rId9etzxw0lcc_43nxjcpkbg">
+            <w:hyperlink w:history="1" r:id="rIdq6hzmbno15nra-wcwmyyz">
               <w:r>
                 <w:rPr>
                   <w:rFonts w:ascii="Courier New" w:cs="Courier New" w:eastAsia="Courier New" w:hAnsi="Courier New"/>
@@ -7678,7 +7681,7 @@
             </w:tcMar>
           </w:tcPr>
           <w:p>
-            <w:hyperlink w:history="1" r:id="rIdnuuakoeahmylgz4jtcwnf">
+            <w:hyperlink w:history="1" r:id="rIdk8adro-q3ob6gkualhfj4">
               <w:r>
                 <w:rPr>
                   <w:rFonts w:ascii="Courier New" w:cs="Courier New" w:eastAsia="Courier New" w:hAnsi="Courier New"/>
@@ -7793,7 +7796,7 @@
             </w:tcMar>
           </w:tcPr>
           <w:p>
-            <w:hyperlink w:history="1" r:id="rIdienoyt0adz0oens4uvf1a">
+            <w:hyperlink w:history="1" r:id="rIdbk-ggn4lm3hudu2yaqmad">
               <w:r>
                 <w:rPr>
                   <w:rFonts w:ascii="Courier New" w:cs="Courier New" w:eastAsia="Courier New" w:hAnsi="Courier New"/>
@@ -7908,7 +7911,7 @@
             </w:tcMar>
           </w:tcPr>
           <w:p>
-            <w:hyperlink w:history="1" r:id="rId5xgrbrfermjp1r5fwzc0a">
+            <w:hyperlink w:history="1" r:id="rIdfdtghwqfdw69apjm8vxta">
               <w:r>
                 <w:rPr>
                   <w:rFonts w:ascii="Courier New" w:cs="Courier New" w:eastAsia="Courier New" w:hAnsi="Courier New"/>
@@ -8023,7 +8026,7 @@
             </w:tcMar>
           </w:tcPr>
           <w:p>
-            <w:hyperlink w:history="1" r:id="rIdeiqd8iwstgrvhatbx54yc">
+            <w:hyperlink w:history="1" r:id="rIdrdjn6jiefg-gpi7v1qegf">
               <w:r>
                 <w:rPr>
                   <w:rFonts w:ascii="Courier New" w:cs="Courier New" w:eastAsia="Courier New" w:hAnsi="Courier New"/>
@@ -8138,7 +8141,7 @@
             </w:tcMar>
           </w:tcPr>
           <w:p>
-            <w:hyperlink w:history="1" r:id="rIdswq3ulxkbs2hinp7cvurl">
+            <w:hyperlink w:history="1" r:id="rId_48dfdsw8km-midra5r5l">
               <w:r>
                 <w:rPr>
                   <w:rFonts w:ascii="Courier New" w:cs="Courier New" w:eastAsia="Courier New" w:hAnsi="Courier New"/>
@@ -8253,7 +8256,7 @@
             </w:tcMar>
           </w:tcPr>
           <w:p>
-            <w:hyperlink w:history="1" r:id="rIdjz6clpycb_latw8edtrmt">
+            <w:hyperlink w:history="1" r:id="rIdsovrhaif3tmwdhbsnbefh">
               <w:r>
                 <w:rPr>
                   <w:rFonts w:ascii="Courier New" w:cs="Courier New" w:eastAsia="Courier New" w:hAnsi="Courier New"/>
@@ -8368,7 +8371,7 @@
             </w:tcMar>
           </w:tcPr>
           <w:p>
-            <w:hyperlink w:history="1" r:id="rId1qemjv9p4boq--wkakvme">
+            <w:hyperlink w:history="1" r:id="rId6_kjf_agej5pv1_3ha0fv">
               <w:r>
                 <w:rPr>
                   <w:rFonts w:ascii="Courier New" w:cs="Courier New" w:eastAsia="Courier New" w:hAnsi="Courier New"/>
@@ -8483,7 +8486,7 @@
             </w:tcMar>
           </w:tcPr>
           <w:p>
-            <w:hyperlink w:history="1" r:id="rIdhkqrcbukpd_bu4m44mp-2">
+            <w:hyperlink w:history="1" r:id="rIdg02o557riim1eg0uhaigy">
               <w:r>
                 <w:rPr>
                   <w:rFonts w:ascii="Courier New" w:cs="Courier New" w:eastAsia="Courier New" w:hAnsi="Courier New"/>
@@ -8598,7 +8601,7 @@
             </w:tcMar>
           </w:tcPr>
           <w:p>
-            <w:hyperlink w:history="1" r:id="rIdprvnwzijh0razbu6vflpv">
+            <w:hyperlink w:history="1" r:id="rIdne4axdaj1y76bgnis6zg-">
               <w:r>
                 <w:rPr>
                   <w:rFonts w:ascii="Courier New" w:cs="Courier New" w:eastAsia="Courier New" w:hAnsi="Courier New"/>
@@ -8713,7 +8716,7 @@
             </w:tcMar>
           </w:tcPr>
           <w:p>
-            <w:hyperlink w:history="1" r:id="rIdecodlqm3vxctlwpzjlsxp">
+            <w:hyperlink w:history="1" r:id="rIddxjylwzh-wdfd1ygav6_d">
               <w:r>
                 <w:rPr>
                   <w:rFonts w:ascii="Courier New" w:cs="Courier New" w:eastAsia="Courier New" w:hAnsi="Courier New"/>
@@ -8828,7 +8831,7 @@
             </w:tcMar>
           </w:tcPr>
           <w:p>
-            <w:hyperlink w:history="1" r:id="rIdcyr58g0xxirauz2prug4e">
+            <w:hyperlink w:history="1" r:id="rIdn_g0fp5g9xx6wsjfbsko9">
               <w:r>
                 <w:rPr>
                   <w:rFonts w:ascii="Courier New" w:cs="Courier New" w:eastAsia="Courier New" w:hAnsi="Courier New"/>
@@ -22824,7 +22827,7 @@
             </w:tcMar>
           </w:tcPr>
           <w:p>
-            <w:hyperlink w:history="1" r:id="rIdua-89wxqvvj5waugspeuy">
+            <w:hyperlink w:history="1" r:id="rIdg-bpytivsmhq-9r1tybra">
               <w:r>
                 <w:rPr>
                   <w:rFonts w:ascii="Courier New" w:cs="Courier New" w:eastAsia="Courier New" w:hAnsi="Courier New"/>
@@ -22855,7 +22858,7 @@
             </w:tcMar>
           </w:tcPr>
           <w:p>
-            <w:hyperlink w:history="1" r:id="rIdcroo8a4qqfiibzh6nfs74">
+            <w:hyperlink w:history="1" r:id="rIdbwwmahxecso2tuag5ymul">
               <w:r>
                 <w:rPr>
                   <w:rFonts w:ascii="Courier New" w:cs="Courier New" w:eastAsia="Courier New" w:hAnsi="Courier New"/>
@@ -22943,7 +22946,7 @@
             </w:tcMar>
           </w:tcPr>
           <w:p>
-            <w:hyperlink w:history="1" r:id="rIdub89pk4bmeg4mgkt-khr8">
+            <w:hyperlink w:history="1" r:id="rId6wbxuvqnjsaw_qqxeeyej">
               <w:r>
                 <w:rPr>
                   <w:rFonts w:ascii="Courier New" w:cs="Courier New" w:eastAsia="Courier New" w:hAnsi="Courier New"/>
@@ -22974,7 +22977,7 @@
             </w:tcMar>
           </w:tcPr>
           <w:p>
-            <w:hyperlink w:history="1" r:id="rId55iuosyvgbebv097knqzl">
+            <w:hyperlink w:history="1" r:id="rId69tldmi0b6xpt4crs3tem">
               <w:r>
                 <w:rPr>
                   <w:rFonts w:ascii="Courier New" w:cs="Courier New" w:eastAsia="Courier New" w:hAnsi="Courier New"/>
@@ -23062,7 +23065,7 @@
             </w:tcMar>
           </w:tcPr>
           <w:p>
-            <w:hyperlink w:history="1" r:id="rIdil_w33owoezoe0io7qdx_">
+            <w:hyperlink w:history="1" r:id="rIdcl05usnyecaohlpwhe4r6">
               <w:r>
                 <w:rPr>
                   <w:rFonts w:ascii="Courier New" w:cs="Courier New" w:eastAsia="Courier New" w:hAnsi="Courier New"/>
@@ -23093,7 +23096,7 @@
             </w:tcMar>
           </w:tcPr>
           <w:p>
-            <w:hyperlink w:history="1" r:id="rIdxkiz5bozacbv1xjdaxyor">
+            <w:hyperlink w:history="1" r:id="rIdm555aeqm786geywlrxr3u">
               <w:r>
                 <w:rPr>
                   <w:rFonts w:ascii="Courier New" w:cs="Courier New" w:eastAsia="Courier New" w:hAnsi="Courier New"/>
@@ -23181,7 +23184,7 @@
             </w:tcMar>
           </w:tcPr>
           <w:p>
-            <w:hyperlink w:history="1" r:id="rIdkcs1a4shbn_ccusadeowh">
+            <w:hyperlink w:history="1" r:id="rIdfummefgsyga5mobdllvny">
               <w:r>
                 <w:rPr>
                   <w:rFonts w:ascii="Courier New" w:cs="Courier New" w:eastAsia="Courier New" w:hAnsi="Courier New"/>
@@ -23212,7 +23215,7 @@
             </w:tcMar>
           </w:tcPr>
           <w:p>
-            <w:hyperlink w:history="1" r:id="rIdvsdbsstszgoeyiijm7yra">
+            <w:hyperlink w:history="1" r:id="rIdkiph9mfqafztsne_qllnt">
               <w:r>
                 <w:rPr>
                   <w:rFonts w:ascii="Courier New" w:cs="Courier New" w:eastAsia="Courier New" w:hAnsi="Courier New"/>
@@ -23300,7 +23303,7 @@
             </w:tcMar>
           </w:tcPr>
           <w:p>
-            <w:hyperlink w:history="1" r:id="rIdbeewtxu0wxmkmncmfbjb7">
+            <w:hyperlink w:history="1" r:id="rIdsn6muhhquywyv2b4gjrin">
               <w:r>
                 <w:rPr>
                   <w:rFonts w:ascii="Courier New" w:cs="Courier New" w:eastAsia="Courier New" w:hAnsi="Courier New"/>
@@ -23331,7 +23334,7 @@
             </w:tcMar>
           </w:tcPr>
           <w:p>
-            <w:hyperlink w:history="1" r:id="rIdfs4-_j-kkkuqgqqx2silu">
+            <w:hyperlink w:history="1" r:id="rId3mh_g3o-jjeeelkqre8b9">
               <w:r>
                 <w:rPr>
                   <w:rFonts w:ascii="Courier New" w:cs="Courier New" w:eastAsia="Courier New" w:hAnsi="Courier New"/>
@@ -23393,7 +23396,7 @@
             </w:tcMar>
           </w:tcPr>
           <w:p>
-            <w:hyperlink w:history="1" r:id="rIduezj-s74tjccmjpz1q7ab">
+            <w:hyperlink w:history="1" r:id="rIduiqnxzfisftgnydgtarmz">
               <w:r>
                 <w:rPr>
                   <w:rFonts w:ascii="Courier New" w:cs="Courier New" w:eastAsia="Courier New" w:hAnsi="Courier New"/>
@@ -26216,6 +26219,66 @@
               </w:rPr>
               <w:t xml:space="preserve">s3-salle-de-bain.yaml</w:t>
             </w:r>
+          </w:p>
+        </w:tc>
+      </w:tr>
+      <w:tr>
+        <w:tc>
+          <w:tcPr>
+            <w:tcW w:type="dxa" w:w="2400"/>
+            <w:tcBorders>
+              <w:top w:val="none" w:color="FFFFFF" w:sz="0"/>
+              <w:left w:val="none" w:color="FFFFFF" w:sz="0"/>
+              <w:bottom w:val="single" w:color="D9DCE0" w:sz="4"/>
+              <w:right w:val="none" w:color="FFFFFF" w:sz="0"/>
+            </w:tcBorders>
+            <w:tcMar>
+              <w:top w:type="dxa" w:w="80"/>
+              <w:left w:type="dxa" w:w="0"/>
+              <w:bottom w:type="dxa" w:w="80"/>
+              <w:right w:type="dxa" w:w="60"/>
+            </w:tcMar>
+          </w:tcPr>
+          <w:p>
+            <w:r>
+              <w:rPr>
+                <w:color w:val="6B7280"/>
+                <w:sz w:val="16"/>
+                <w:szCs w:val="16"/>
+              </w:rPr>
+              <w:t xml:space="preserve">Depot</w:t>
+            </w:r>
+          </w:p>
+        </w:tc>
+        <w:tc>
+          <w:tcPr>
+            <w:tcW w:type="dxa" w:w="7012"/>
+            <w:tcBorders>
+              <w:top w:val="none" w:color="FFFFFF" w:sz="0"/>
+              <w:left w:val="none" w:color="FFFFFF" w:sz="0"/>
+              <w:bottom w:val="single" w:color="D9DCE0" w:sz="4"/>
+              <w:right w:val="none" w:color="FFFFFF" w:sz="0"/>
+            </w:tcBorders>
+            <w:tcMar>
+              <w:top w:type="dxa" w:w="80"/>
+              <w:left w:type="dxa" w:w="0"/>
+              <w:bottom w:type="dxa" w:w="80"/>
+              <w:right w:type="dxa" w:w="0"/>
+            </w:tcMar>
+          </w:tcPr>
+          <w:p>
+            <w:hyperlink w:history="1" r:id="rIdtjov-91mmdgawpfjihmnq">
+              <w:r>
+                <w:rPr>
+                  <w:rFonts w:ascii="Courier New" w:cs="Courier New" w:eastAsia="Courier New" w:hAnsi="Courier New"/>
+                  <w:color w:val="0B5563"/>
+                  <w:sz w:val="16"/>
+                  <w:szCs w:val="16"/>
+                  <w:u w:val="single"/>
+                </w:rPr>
+                <w:t xml:space="preserve">github.com/hanafi09/s3-salle-de-bain</w:t>
+              </w:r>
+            </w:hyperlink>
           </w:p>
         </w:tc>
       </w:tr>

</xml_diff>

<commit_message>
docs: maj rapport technique (boitier v4 + carte 76.7x108)
Sections 10 (Boitier 3D), 11 (Vue eclatee/nomenclature) et bloc CAO
reecrites pour refleter tous les changements :
- galet rectangulaire 121x90x57 mm en PA-CF (au lieu du cylindre ABS Ø110)
- carte porteuse 76,7 x 108 mm, 4 entretoises M3 sur trous MK1-MK4 reels
- 2 HP 40 mm front-firing, molette EC11 centrale, fermeture press-fit
- fichiers CAO : v4_base / v4_top / v4_speaker_gasket (STL + STEP + .3mf)
- figures 4 et 5 remplacees par les rendus CAO du galet v4

Co-Authored-By: Claude Opus 4.8 <noreply@anthropic.com>
</commit_message>
<xml_diff>
--- a/docs/S3 Salle de Bain - Rapport Technique v3.docx
+++ b/docs/S3 Salle de Bain - Rapport Technique v3.docx
@@ -628,7 +628,7 @@
             </w:r>
           </w:p>
           <w:p>
-            <w:hyperlink w:history="1" r:id="rIdclj-v1vvwhs7-eibsycqa">
+            <w:hyperlink w:history="1" r:id="rIdtbdhhhbk0db3c5uxhjvcz">
               <w:r>
                 <w:rPr>
                   <w:rFonts w:ascii="Courier New" w:cs="Courier New" w:eastAsia="Courier New" w:hAnsi="Courier New"/>
@@ -1762,7 +1762,7 @@
                 <w:sz w:val="15"/>
                 <w:szCs w:val="15"/>
               </w:rPr>
-              <w:t xml:space="preserve">Design epure, ABS matte, haut-parleurs stereo integres</w:t>
+              <w:t xml:space="preserve">Galet compact PA-CF, facade haut-parleurs, molette centrale</w:t>
             </w:r>
           </w:p>
         </w:tc>
@@ -7156,7 +7156,7 @@
             </w:tcMar>
           </w:tcPr>
           <w:p>
-            <w:hyperlink w:history="1" r:id="rIdlsejzzfvaejtohckc-wpt">
+            <w:hyperlink w:history="1" r:id="rIddlzhd-6yatkmcshrafr5t">
               <w:r>
                 <w:rPr>
                   <w:rFonts w:ascii="Courier New" w:cs="Courier New" w:eastAsia="Courier New" w:hAnsi="Courier New"/>
@@ -7271,7 +7271,7 @@
             </w:tcMar>
           </w:tcPr>
           <w:p>
-            <w:hyperlink w:history="1" r:id="rIdyht5x1bvobc9agcmigiwy">
+            <w:hyperlink w:history="1" r:id="rIdtjqkhuyrorzujs5z336my">
               <w:r>
                 <w:rPr>
                   <w:rFonts w:ascii="Courier New" w:cs="Courier New" w:eastAsia="Courier New" w:hAnsi="Courier New"/>
@@ -7386,7 +7386,7 @@
             </w:tcMar>
           </w:tcPr>
           <w:p>
-            <w:hyperlink w:history="1" r:id="rIdnkamjvlgfs82qpicwovl2">
+            <w:hyperlink w:history="1" r:id="rIdywk9m_fnraxbmjyf4taiq">
               <w:r>
                 <w:rPr>
                   <w:rFonts w:ascii="Courier New" w:cs="Courier New" w:eastAsia="Courier New" w:hAnsi="Courier New"/>
@@ -7501,7 +7501,7 @@
             </w:tcMar>
           </w:tcPr>
           <w:p>
-            <w:hyperlink w:history="1" r:id="rIdwpvq9i4th3flwmcceztmi">
+            <w:hyperlink w:history="1" r:id="rId6xtvvu2v9yg8z-qa-5laa">
               <w:r>
                 <w:rPr>
                   <w:rFonts w:ascii="Courier New" w:cs="Courier New" w:eastAsia="Courier New" w:hAnsi="Courier New"/>
@@ -7616,7 +7616,7 @@
             </w:tcMar>
           </w:tcPr>
           <w:p>
-            <w:hyperlink w:history="1" r:id="rId_o2rgvxngqhk0_u1jicif">
+            <w:hyperlink w:history="1" r:id="rIdn6i9nmhroym-rf8dsudkn">
               <w:r>
                 <w:rPr>
                   <w:rFonts w:ascii="Courier New" w:cs="Courier New" w:eastAsia="Courier New" w:hAnsi="Courier New"/>
@@ -7731,7 +7731,7 @@
             </w:tcMar>
           </w:tcPr>
           <w:p>
-            <w:hyperlink w:history="1" r:id="rIdlcrteyj4zmadr6jy2buxy">
+            <w:hyperlink w:history="1" r:id="rId9stgotnklabpy2y43wd27">
               <w:r>
                 <w:rPr>
                   <w:rFonts w:ascii="Courier New" w:cs="Courier New" w:eastAsia="Courier New" w:hAnsi="Courier New"/>
@@ -7846,7 +7846,7 @@
             </w:tcMar>
           </w:tcPr>
           <w:p>
-            <w:hyperlink w:history="1" r:id="rId4gppsa3raixvkfff_nu6t">
+            <w:hyperlink w:history="1" r:id="rIdm4zokheoozdfpoqlgnklh">
               <w:r>
                 <w:rPr>
                   <w:rFonts w:ascii="Courier New" w:cs="Courier New" w:eastAsia="Courier New" w:hAnsi="Courier New"/>
@@ -7961,7 +7961,7 @@
             </w:tcMar>
           </w:tcPr>
           <w:p>
-            <w:hyperlink w:history="1" r:id="rIdhq5mm7_hmhz_rupjdtj6l">
+            <w:hyperlink w:history="1" r:id="rIdwnjz0ptv-uvgectqmvpjr">
               <w:r>
                 <w:rPr>
                   <w:rFonts w:ascii="Courier New" w:cs="Courier New" w:eastAsia="Courier New" w:hAnsi="Courier New"/>
@@ -8076,7 +8076,7 @@
             </w:tcMar>
           </w:tcPr>
           <w:p>
-            <w:hyperlink w:history="1" r:id="rIdd3ynxira6syqoj6yobfy4">
+            <w:hyperlink w:history="1" r:id="rIdprwp9a9nepiwus1-zjxcu">
               <w:r>
                 <w:rPr>
                   <w:rFonts w:ascii="Courier New" w:cs="Courier New" w:eastAsia="Courier New" w:hAnsi="Courier New"/>
@@ -8191,7 +8191,7 @@
             </w:tcMar>
           </w:tcPr>
           <w:p>
-            <w:hyperlink w:history="1" r:id="rIdrp198plrqzo1dbqtxqmhk">
+            <w:hyperlink w:history="1" r:id="rIdy7uxqzz89iro0unn9kye8">
               <w:r>
                 <w:rPr>
                   <w:rFonts w:ascii="Courier New" w:cs="Courier New" w:eastAsia="Courier New" w:hAnsi="Courier New"/>
@@ -8306,7 +8306,7 @@
             </w:tcMar>
           </w:tcPr>
           <w:p>
-            <w:hyperlink w:history="1" r:id="rIdmafh108ejthqkprxdubo1">
+            <w:hyperlink w:history="1" r:id="rIdkpr1qgbfycm8uomwnzrpw">
               <w:r>
                 <w:rPr>
                   <w:rFonts w:ascii="Courier New" w:cs="Courier New" w:eastAsia="Courier New" w:hAnsi="Courier New"/>
@@ -8421,7 +8421,7 @@
             </w:tcMar>
           </w:tcPr>
           <w:p>
-            <w:hyperlink w:history="1" r:id="rId4qizoqtteetd7fx-xaumm">
+            <w:hyperlink w:history="1" r:id="rId16geg3i8pcwdkikbdzyk8">
               <w:r>
                 <w:rPr>
                   <w:rFonts w:ascii="Courier New" w:cs="Courier New" w:eastAsia="Courier New" w:hAnsi="Courier New"/>
@@ -8536,7 +8536,7 @@
             </w:tcMar>
           </w:tcPr>
           <w:p>
-            <w:hyperlink w:history="1" r:id="rIdgrop3ayuec_ypv6eynncj">
+            <w:hyperlink w:history="1" r:id="rIdcexaryekbqoyz9tnuygkj">
               <w:r>
                 <w:rPr>
                   <w:rFonts w:ascii="Courier New" w:cs="Courier New" w:eastAsia="Courier New" w:hAnsi="Courier New"/>
@@ -8651,7 +8651,7 @@
             </w:tcMar>
           </w:tcPr>
           <w:p>
-            <w:hyperlink w:history="1" r:id="rIdgd1o4x6y5hgntdg95a6ls">
+            <w:hyperlink w:history="1" r:id="rIdgpaiea5gogkx2fup78jzy">
               <w:r>
                 <w:rPr>
                   <w:rFonts w:ascii="Courier New" w:cs="Courier New" w:eastAsia="Courier New" w:hAnsi="Courier New"/>
@@ -8766,7 +8766,7 @@
             </w:tcMar>
           </w:tcPr>
           <w:p>
-            <w:hyperlink w:history="1" r:id="rIdxs2torxly4voxqz7nvleu">
+            <w:hyperlink w:history="1" r:id="rIdazcoulg8tyieu_vtdpxkh">
               <w:r>
                 <w:rPr>
                   <w:rFonts w:ascii="Courier New" w:cs="Courier New" w:eastAsia="Courier New" w:hAnsi="Courier New"/>
@@ -8881,7 +8881,7 @@
             </w:tcMar>
           </w:tcPr>
           <w:p>
-            <w:hyperlink w:history="1" r:id="rId2pr65egx0g36uqgnui3d3">
+            <w:hyperlink w:history="1" r:id="rIdojhrzsihayh06uoqigybj">
               <w:r>
                 <w:rPr>
                   <w:rFonts w:ascii="Courier New" w:cs="Courier New" w:eastAsia="Courier New" w:hAnsi="Courier New"/>
@@ -18766,7 +18766,7 @@
           <w:sz w:val="19"/>
           <w:szCs w:val="19"/>
         </w:rPr>
-        <w:t xml:space="preserve">Design epure, ABS matte, haut-parleurs stereo integres</w:t>
+        <w:t xml:space="preserve">Galet compact PA-CF, facade haut-parleurs, molette centrale</w:t>
       </w:r>
     </w:p>
     <w:p>
@@ -18776,9 +18776,9 @@
       <w:r>
         <w:drawing>
           <wp:inline distT="0" distB="0" distL="0" distR="0">
-            <wp:extent cx="5762625" cy="3219450"/>
+            <wp:extent cx="5400675" cy="4429125"/>
             <wp:effectExtent t="0" r="0" b="0" l="0"/>
-            <wp:docPr id="1" name="p16_00_Image1.jpg" descr="p16_00_Image1.jpg" title="p16_00_Image1.jpg"/>
+            <wp:docPr id="1" name="boitier_v4_closed.png" descr="boitier_v4_closed.png" title="boitier_v4_closed.png"/>
             <wp:cNvGraphicFramePr>
               <a:graphicFrameLocks xmlns:a="http://schemas.openxmlformats.org/drawingml/2006/main" noChangeAspect="1"/>
             </wp:cNvGraphicFramePr>
@@ -18801,7 +18801,7 @@
                   <pic:spPr bwMode="auto">
                     <a:xfrm>
                       <a:off x="0" y="0"/>
-                      <a:ext cx="5762625" cy="3219450"/>
+                      <a:ext cx="5400675" cy="4429125"/>
                     </a:xfrm>
                     <a:prstGeom prst="rect">
                       <a:avLst/>
@@ -18827,7 +18827,7 @@
           <w:sz w:val="14"/>
           <w:szCs w:val="14"/>
         </w:rPr>
-        <w:t xml:space="preserve">Fig. 4 - S3 Salle de Bain en situation, finition ABS blanc mat.</w:t>
+        <w:t xml:space="preserve">Fig. 4 - Boitier v4, galet rectangulaire arrondi (rendu CAO), impression PA-CF.</w:t>
       </w:r>
     </w:p>
     <w:p>
@@ -18865,7 +18865,7 @@
           <w:sz w:val="17"/>
           <w:szCs w:val="17"/>
         </w:rPr>
-        <w:t xml:space="preserve">Le boitier adopte une forme de galet cylindrique de 110 mm de diametre pour 55 mm de hauteur. Les aretes sont adoucies par un chanfrein superieur de 2 mm, les vis sont invisibles et l'assemblage repose exclusivement sur des clips internes et des inserts filetes thermofondus. L'inspiration puise dans la tradition Dieter Rams / Braun : minimalisme, fonction evidente, absence totale d'ornement superflu.</w:t>
+        <w:t xml:space="preserve">Le boitier adopte une forme de galet rectangulaire arrondi (coins R22) de 121 x 90 mm pour 57 mm de hauteur, dimensionne au plus juste autour de la carte porteuse 76,7 x 108 mm. Le capot et le bac se ferment par une levre peripherique en press-fit : aucune vis n'est visible sur le dessus, seule une encoche laterale discrete permet le demontage. L'inspiration puise dans la tradition Dieter Rams / Braun : minimalisme, fonction evidente, absence totale d'ornement superflu.</w:t>
       </w:r>
     </w:p>
     <w:p>
@@ -18879,7 +18879,7 @@
           <w:sz w:val="17"/>
           <w:szCs w:val="17"/>
         </w:rPr>
-        <w:t xml:space="preserve">Imprime en ABS blanc mat, le boitier tolere l'humidite et les ecarts thermiques d'une salle de bain. Deux grilles stereo laterales decoupees en motif hexagonal diffusent le son de deux haut-parleurs pleine-bande de 40 mm orientes a 35 degres pour elargir l'image sonore. L'anneau LED WS2812 est masque par un diffuseur en PETG translucide qui lisse les 12 LEDs en une couronne lumineuse homogene.</w:t>
+        <w:t xml:space="preserve">Imprime en PA-CF (nylon charge fibre de carbone), le boitier offre rigidite et stabilite dimensionnelle et tolere l'humidite et les ecarts thermiques d'une salle de bain. Deux haut-parleurs pleine-bande de 40 mm tirent droit devant (front-firing) au travers de grilles hexagonales en facade. L'anneau LED WS2812, monte sous le capot, est lisse par une gorge diffusante en une couronne lumineuse homogene autour de la molette centrale.</w:t>
       </w:r>
     </w:p>
     <w:p>
@@ -18903,7 +18903,7 @@
           <w:sz w:val="17"/>
           <w:szCs w:val="17"/>
         </w:rPr>
-        <w:t xml:space="preserve">Le cercle parfait elimine tout 'devant' ou 'derriere' visuel : l'objet trouve sa place sur n'importe quelle etagere ou rebord de lavabo. La hauteur basse projette le son vers les oreilles de l'utilisateur debout.</w:t>
+        <w:t xml:space="preserve">La molette centrale (encodeur EC11 a montage panneau + anneau LED) tombe naturellement sous le doigt ; le format galet compact se pose sur n'importe quelle etagere ou rebord de lavabo, haut-parleurs diriges vers l'utilisateur.</w:t>
       </w:r>
     </w:p>
     <w:tbl>
@@ -18959,6 +18959,710 @@
                 <w:szCs w:val="13"/>
               </w:rPr>
               <w:t xml:space="preserve">DIMENSIONS</w:t>
+            </w:r>
+          </w:p>
+          <w:tbl>
+            <w:tblPr>
+              <w:tblW w:type="dxa" w:w="3019"/>
+              <w:tblBorders>
+                <w:top w:val="none" w:color="FFFFFF" w:sz="0"/>
+                <w:left w:val="none" w:color="FFFFFF" w:sz="0"/>
+                <w:bottom w:val="none" w:color="FFFFFF" w:sz="0"/>
+                <w:right w:val="none" w:color="FFFFFF" w:sz="0"/>
+                <w:insideH w:val="none" w:color="FFFFFF" w:sz="0"/>
+                <w:insideV w:val="none" w:color="FFFFFF" w:sz="0"/>
+              </w:tblBorders>
+            </w:tblPr>
+            <w:tblGrid>
+              <w:gridCol w:w="1569"/>
+              <w:gridCol w:w="1450"/>
+            </w:tblGrid>
+            <w:tr>
+              <w:tc>
+                <w:tcPr>
+                  <w:tcW w:type="dxa" w:w="1569"/>
+                  <w:tcBorders>
+                    <w:top w:val="none" w:color="FFFFFF" w:sz="0"/>
+                    <w:left w:val="none" w:color="FFFFFF" w:sz="0"/>
+                    <w:bottom w:val="single" w:color="E5DECF" w:sz="4"/>
+                    <w:right w:val="none" w:color="FFFFFF" w:sz="0"/>
+                  </w:tcBorders>
+                  <w:tcMar>
+                    <w:top w:type="dxa" w:w="80"/>
+                    <w:left w:type="dxa" w:w="0"/>
+                    <w:bottom w:type="dxa" w:w="80"/>
+                    <w:right w:type="dxa" w:w="60"/>
+                  </w:tcMar>
+                </w:tcPr>
+                <w:p>
+                  <w:r>
+                    <w:rPr>
+                      <w:color w:val="8A7D6E"/>
+                      <w:sz w:val="16"/>
+                      <w:szCs w:val="16"/>
+                    </w:rPr>
+                    <w:t xml:space="preserve">Encombrement</w:t>
+                  </w:r>
+                </w:p>
+              </w:tc>
+              <w:tc>
+                <w:tcPr>
+                  <w:tcW w:type="dxa" w:w="1450"/>
+                  <w:tcBorders>
+                    <w:top w:val="none" w:color="FFFFFF" w:sz="0"/>
+                    <w:left w:val="none" w:color="FFFFFF" w:sz="0"/>
+                    <w:bottom w:val="single" w:color="E5DECF" w:sz="4"/>
+                    <w:right w:val="none" w:color="FFFFFF" w:sz="0"/>
+                  </w:tcBorders>
+                  <w:tcMar>
+                    <w:top w:type="dxa" w:w="80"/>
+                    <w:left w:type="dxa" w:w="0"/>
+                    <w:bottom w:type="dxa" w:w="80"/>
+                    <w:right w:type="dxa" w:w="0"/>
+                  </w:tcMar>
+                </w:tcPr>
+                <w:p>
+                  <w:r>
+                    <w:rPr>
+                      <w:color w:val="4A4036"/>
+                      <w:sz w:val="17"/>
+                      <w:szCs w:val="17"/>
+                    </w:rPr>
+                    <w:t xml:space="preserve">121 x 90 x 57 mm</w:t>
+                  </w:r>
+                </w:p>
+              </w:tc>
+            </w:tr>
+            <w:tr>
+              <w:tc>
+                <w:tcPr>
+                  <w:tcW w:type="dxa" w:w="1569"/>
+                  <w:tcBorders>
+                    <w:top w:val="none" w:color="FFFFFF" w:sz="0"/>
+                    <w:left w:val="none" w:color="FFFFFF" w:sz="0"/>
+                    <w:bottom w:val="single" w:color="E5DECF" w:sz="4"/>
+                    <w:right w:val="none" w:color="FFFFFF" w:sz="0"/>
+                  </w:tcBorders>
+                  <w:tcMar>
+                    <w:top w:type="dxa" w:w="80"/>
+                    <w:left w:type="dxa" w:w="0"/>
+                    <w:bottom w:type="dxa" w:w="80"/>
+                    <w:right w:type="dxa" w:w="60"/>
+                  </w:tcMar>
+                </w:tcPr>
+                <w:p>
+                  <w:r>
+                    <w:rPr>
+                      <w:color w:val="8A7D6E"/>
+                      <w:sz w:val="16"/>
+                      <w:szCs w:val="16"/>
+                    </w:rPr>
+                    <w:t xml:space="preserve">Carte</w:t>
+                  </w:r>
+                </w:p>
+              </w:tc>
+              <w:tc>
+                <w:tcPr>
+                  <w:tcW w:type="dxa" w:w="1450"/>
+                  <w:tcBorders>
+                    <w:top w:val="none" w:color="FFFFFF" w:sz="0"/>
+                    <w:left w:val="none" w:color="FFFFFF" w:sz="0"/>
+                    <w:bottom w:val="single" w:color="E5DECF" w:sz="4"/>
+                    <w:right w:val="none" w:color="FFFFFF" w:sz="0"/>
+                  </w:tcBorders>
+                  <w:tcMar>
+                    <w:top w:type="dxa" w:w="80"/>
+                    <w:left w:type="dxa" w:w="0"/>
+                    <w:bottom w:type="dxa" w:w="80"/>
+                    <w:right w:type="dxa" w:w="0"/>
+                  </w:tcMar>
+                </w:tcPr>
+                <w:p>
+                  <w:r>
+                    <w:rPr>
+                      <w:color w:val="4A4036"/>
+                      <w:sz w:val="17"/>
+                      <w:szCs w:val="17"/>
+                    </w:rPr>
+                    <w:t xml:space="preserve">76,7 x 108 mm</w:t>
+                  </w:r>
+                </w:p>
+              </w:tc>
+            </w:tr>
+            <w:tr>
+              <w:tc>
+                <w:tcPr>
+                  <w:tcW w:type="dxa" w:w="1569"/>
+                  <w:tcBorders>
+                    <w:top w:val="none" w:color="FFFFFF" w:sz="0"/>
+                    <w:left w:val="none" w:color="FFFFFF" w:sz="0"/>
+                    <w:bottom w:val="single" w:color="E5DECF" w:sz="4"/>
+                    <w:right w:val="none" w:color="FFFFFF" w:sz="0"/>
+                  </w:tcBorders>
+                  <w:tcMar>
+                    <w:top w:type="dxa" w:w="80"/>
+                    <w:left w:type="dxa" w:w="0"/>
+                    <w:bottom w:type="dxa" w:w="80"/>
+                    <w:right w:type="dxa" w:w="60"/>
+                  </w:tcMar>
+                </w:tcPr>
+                <w:p>
+                  <w:r>
+                    <w:rPr>
+                      <w:color w:val="8A7D6E"/>
+                      <w:sz w:val="16"/>
+                      <w:szCs w:val="16"/>
+                    </w:rPr>
+                    <w:t xml:space="preserve">Coins</w:t>
+                  </w:r>
+                </w:p>
+              </w:tc>
+              <w:tc>
+                <w:tcPr>
+                  <w:tcW w:type="dxa" w:w="1450"/>
+                  <w:tcBorders>
+                    <w:top w:val="none" w:color="FFFFFF" w:sz="0"/>
+                    <w:left w:val="none" w:color="FFFFFF" w:sz="0"/>
+                    <w:bottom w:val="single" w:color="E5DECF" w:sz="4"/>
+                    <w:right w:val="none" w:color="FFFFFF" w:sz="0"/>
+                  </w:tcBorders>
+                  <w:tcMar>
+                    <w:top w:type="dxa" w:w="80"/>
+                    <w:left w:type="dxa" w:w="0"/>
+                    <w:bottom w:type="dxa" w:w="80"/>
+                    <w:right w:type="dxa" w:w="0"/>
+                  </w:tcMar>
+                </w:tcPr>
+                <w:p>
+                  <w:r>
+                    <w:rPr>
+                      <w:color w:val="4A4036"/>
+                      <w:sz w:val="17"/>
+                      <w:szCs w:val="17"/>
+                    </w:rPr>
+                    <w:t xml:space="preserve">R22 (galet)</w:t>
+                  </w:r>
+                </w:p>
+              </w:tc>
+            </w:tr>
+            <w:tr>
+              <w:tc>
+                <w:tcPr>
+                  <w:tcW w:type="dxa" w:w="1569"/>
+                  <w:tcBorders>
+                    <w:top w:val="none" w:color="FFFFFF" w:sz="0"/>
+                    <w:left w:val="none" w:color="FFFFFF" w:sz="0"/>
+                    <w:bottom w:val="single" w:color="E5DECF" w:sz="4"/>
+                    <w:right w:val="none" w:color="FFFFFF" w:sz="0"/>
+                  </w:tcBorders>
+                  <w:tcMar>
+                    <w:top w:type="dxa" w:w="80"/>
+                    <w:left w:type="dxa" w:w="0"/>
+                    <w:bottom w:type="dxa" w:w="80"/>
+                    <w:right w:type="dxa" w:w="60"/>
+                  </w:tcMar>
+                </w:tcPr>
+                <w:p>
+                  <w:r>
+                    <w:rPr>
+                      <w:color w:val="8A7D6E"/>
+                      <w:sz w:val="16"/>
+                      <w:szCs w:val="16"/>
+                    </w:rPr>
+                    <w:t xml:space="preserve">Paroi / fond</w:t>
+                  </w:r>
+                </w:p>
+              </w:tc>
+              <w:tc>
+                <w:tcPr>
+                  <w:tcW w:type="dxa" w:w="1450"/>
+                  <w:tcBorders>
+                    <w:top w:val="none" w:color="FFFFFF" w:sz="0"/>
+                    <w:left w:val="none" w:color="FFFFFF" w:sz="0"/>
+                    <w:bottom w:val="single" w:color="E5DECF" w:sz="4"/>
+                    <w:right w:val="none" w:color="FFFFFF" w:sz="0"/>
+                  </w:tcBorders>
+                  <w:tcMar>
+                    <w:top w:type="dxa" w:w="80"/>
+                    <w:left w:type="dxa" w:w="0"/>
+                    <w:bottom w:type="dxa" w:w="80"/>
+                    <w:right w:type="dxa" w:w="0"/>
+                  </w:tcMar>
+                </w:tcPr>
+                <w:p>
+                  <w:r>
+                    <w:rPr>
+                      <w:color w:val="4A4036"/>
+                      <w:sz w:val="17"/>
+                      <w:szCs w:val="17"/>
+                    </w:rPr>
+                    <w:t xml:space="preserve">2,6 / 3,0 mm</w:t>
+                  </w:r>
+                </w:p>
+              </w:tc>
+            </w:tr>
+            <w:tr>
+              <w:tc>
+                <w:tcPr>
+                  <w:tcW w:type="dxa" w:w="1569"/>
+                  <w:tcBorders>
+                    <w:top w:val="none" w:color="FFFFFF" w:sz="0"/>
+                    <w:left w:val="none" w:color="FFFFFF" w:sz="0"/>
+                    <w:bottom w:val="none" w:color="FFFFFF" w:sz="0"/>
+                    <w:right w:val="none" w:color="FFFFFF" w:sz="0"/>
+                  </w:tcBorders>
+                  <w:tcMar>
+                    <w:top w:type="dxa" w:w="80"/>
+                    <w:left w:type="dxa" w:w="0"/>
+                    <w:bottom w:type="dxa" w:w="80"/>
+                    <w:right w:type="dxa" w:w="60"/>
+                  </w:tcMar>
+                </w:tcPr>
+                <w:p>
+                  <w:r>
+                    <w:rPr>
+                      <w:color w:val="8A7D6E"/>
+                      <w:sz w:val="16"/>
+                      <w:szCs w:val="16"/>
+                    </w:rPr>
+                    <w:t xml:space="preserve">Forme</w:t>
+                  </w:r>
+                </w:p>
+              </w:tc>
+              <w:tc>
+                <w:tcPr>
+                  <w:tcW w:type="dxa" w:w="1450"/>
+                  <w:tcBorders>
+                    <w:top w:val="none" w:color="FFFFFF" w:sz="0"/>
+                    <w:left w:val="none" w:color="FFFFFF" w:sz="0"/>
+                    <w:bottom w:val="none" w:color="FFFFFF" w:sz="0"/>
+                    <w:right w:val="none" w:color="FFFFFF" w:sz="0"/>
+                  </w:tcBorders>
+                  <w:tcMar>
+                    <w:top w:type="dxa" w:w="80"/>
+                    <w:left w:type="dxa" w:w="0"/>
+                    <w:bottom w:type="dxa" w:w="80"/>
+                    <w:right w:type="dxa" w:w="0"/>
+                  </w:tcMar>
+                </w:tcPr>
+                <w:p>
+                  <w:r>
+                    <w:rPr>
+                      <w:color w:val="4A4036"/>
+                      <w:sz w:val="17"/>
+                      <w:szCs w:val="17"/>
+                    </w:rPr>
+                    <w:t xml:space="preserve">galet rectangulaire</w:t>
+                  </w:r>
+                </w:p>
+              </w:tc>
+            </w:tr>
+          </w:tbl>
+          <w:p/>
+        </w:tc>
+        <w:tc>
+          <w:tcPr>
+            <w:tcW w:type="dxa" w:w="240"/>
+            <w:tcBorders>
+              <w:top w:val="none" w:color="FFFFFF" w:sz="0"/>
+              <w:left w:val="none" w:color="FFFFFF" w:sz="0"/>
+              <w:bottom w:val="none" w:color="FFFFFF" w:sz="0"/>
+              <w:right w:val="none" w:color="FFFFFF" w:sz="0"/>
+            </w:tcBorders>
+            <w:tcMar>
+              <w:top w:type="dxa" w:w="0"/>
+              <w:left w:type="dxa" w:w="0"/>
+              <w:bottom w:type="dxa" w:w="0"/>
+              <w:right w:type="dxa" w:w="0"/>
+            </w:tcMar>
+          </w:tcPr>
+          <w:p/>
+        </w:tc>
+        <w:tc>
+          <w:tcPr>
+            <w:tcW w:type="dxa" w:w="2939"/>
+            <w:tcBorders>
+              <w:top w:val="none" w:color="FFFFFF" w:sz="0"/>
+              <w:left w:val="none" w:color="FFFFFF" w:sz="0"/>
+              <w:bottom w:val="none" w:color="FFFFFF" w:sz="0"/>
+              <w:right w:val="none" w:color="FFFFFF" w:sz="0"/>
+            </w:tcBorders>
+            <w:tcMar>
+              <w:top w:type="dxa" w:w="0"/>
+              <w:left w:type="dxa" w:w="0"/>
+              <w:bottom w:type="dxa" w:w="0"/>
+              <w:right w:type="dxa" w:w="0"/>
+            </w:tcMar>
+          </w:tcPr>
+          <w:p>
+            <w:pPr>
+              <w:pBdr>
+                <w:bottom w:val="single" w:color="E5DECF" w:sz="4" w:space="4"/>
+              </w:pBdr>
+              <w:spacing w:after="60"/>
+            </w:pPr>
+            <w:r>
+              <w:rPr>
+                <w:b/>
+                <w:bCs/>
+                <w:color w:val="8A7D6E"/>
+                <w:spacing w:val="20"/>
+                <w:sz w:val="13"/>
+                <w:szCs w:val="13"/>
+              </w:rPr>
+              <w:t xml:space="preserve">IMPRESSION 3D</w:t>
+            </w:r>
+          </w:p>
+          <w:tbl>
+            <w:tblPr>
+              <w:tblW w:type="dxa" w:w="3019"/>
+              <w:tblBorders>
+                <w:top w:val="none" w:color="FFFFFF" w:sz="0"/>
+                <w:left w:val="none" w:color="FFFFFF" w:sz="0"/>
+                <w:bottom w:val="none" w:color="FFFFFF" w:sz="0"/>
+                <w:right w:val="none" w:color="FFFFFF" w:sz="0"/>
+                <w:insideH w:val="none" w:color="FFFFFF" w:sz="0"/>
+                <w:insideV w:val="none" w:color="FFFFFF" w:sz="0"/>
+              </w:tblBorders>
+            </w:tblPr>
+            <w:tblGrid>
+              <w:gridCol w:w="1660"/>
+              <w:gridCol w:w="1359"/>
+            </w:tblGrid>
+            <w:tr>
+              <w:tc>
+                <w:tcPr>
+                  <w:tcW w:type="dxa" w:w="1660"/>
+                  <w:tcBorders>
+                    <w:top w:val="none" w:color="FFFFFF" w:sz="0"/>
+                    <w:left w:val="none" w:color="FFFFFF" w:sz="0"/>
+                    <w:bottom w:val="single" w:color="E5DECF" w:sz="4"/>
+                    <w:right w:val="none" w:color="FFFFFF" w:sz="0"/>
+                  </w:tcBorders>
+                  <w:tcMar>
+                    <w:top w:type="dxa" w:w="80"/>
+                    <w:left w:type="dxa" w:w="0"/>
+                    <w:bottom w:type="dxa" w:w="80"/>
+                    <w:right w:type="dxa" w:w="60"/>
+                  </w:tcMar>
+                </w:tcPr>
+                <w:p>
+                  <w:r>
+                    <w:rPr>
+                      <w:color w:val="8A7D6E"/>
+                      <w:sz w:val="16"/>
+                      <w:szCs w:val="16"/>
+                    </w:rPr>
+                    <w:t xml:space="preserve">Matiere</w:t>
+                  </w:r>
+                </w:p>
+              </w:tc>
+              <w:tc>
+                <w:tcPr>
+                  <w:tcW w:type="dxa" w:w="1359"/>
+                  <w:tcBorders>
+                    <w:top w:val="none" w:color="FFFFFF" w:sz="0"/>
+                    <w:left w:val="none" w:color="FFFFFF" w:sz="0"/>
+                    <w:bottom w:val="single" w:color="E5DECF" w:sz="4"/>
+                    <w:right w:val="none" w:color="FFFFFF" w:sz="0"/>
+                  </w:tcBorders>
+                  <w:tcMar>
+                    <w:top w:type="dxa" w:w="80"/>
+                    <w:left w:type="dxa" w:w="0"/>
+                    <w:bottom w:type="dxa" w:w="80"/>
+                    <w:right w:type="dxa" w:w="0"/>
+                  </w:tcMar>
+                </w:tcPr>
+                <w:p>
+                  <w:r>
+                    <w:rPr>
+                      <w:color w:val="4A4036"/>
+                      <w:sz w:val="17"/>
+                      <w:szCs w:val="17"/>
+                    </w:rPr>
+                    <w:t xml:space="preserve">PA-CF</w:t>
+                  </w:r>
+                </w:p>
+              </w:tc>
+            </w:tr>
+            <w:tr>
+              <w:tc>
+                <w:tcPr>
+                  <w:tcW w:type="dxa" w:w="1660"/>
+                  <w:tcBorders>
+                    <w:top w:val="none" w:color="FFFFFF" w:sz="0"/>
+                    <w:left w:val="none" w:color="FFFFFF" w:sz="0"/>
+                    <w:bottom w:val="single" w:color="E5DECF" w:sz="4"/>
+                    <w:right w:val="none" w:color="FFFFFF" w:sz="0"/>
+                  </w:tcBorders>
+                  <w:tcMar>
+                    <w:top w:type="dxa" w:w="80"/>
+                    <w:left w:type="dxa" w:w="0"/>
+                    <w:bottom w:type="dxa" w:w="80"/>
+                    <w:right w:type="dxa" w:w="60"/>
+                  </w:tcMar>
+                </w:tcPr>
+                <w:p>
+                  <w:r>
+                    <w:rPr>
+                      <w:color w:val="8A7D6E"/>
+                      <w:sz w:val="16"/>
+                      <w:szCs w:val="16"/>
+                    </w:rPr>
+                    <w:t xml:space="preserve">Remplissage</w:t>
+                  </w:r>
+                </w:p>
+              </w:tc>
+              <w:tc>
+                <w:tcPr>
+                  <w:tcW w:type="dxa" w:w="1359"/>
+                  <w:tcBorders>
+                    <w:top w:val="none" w:color="FFFFFF" w:sz="0"/>
+                    <w:left w:val="none" w:color="FFFFFF" w:sz="0"/>
+                    <w:bottom w:val="single" w:color="E5DECF" w:sz="4"/>
+                    <w:right w:val="none" w:color="FFFFFF" w:sz="0"/>
+                  </w:tcBorders>
+                  <w:tcMar>
+                    <w:top w:type="dxa" w:w="80"/>
+                    <w:left w:type="dxa" w:w="0"/>
+                    <w:bottom w:type="dxa" w:w="80"/>
+                    <w:right w:type="dxa" w:w="0"/>
+                  </w:tcMar>
+                </w:tcPr>
+                <w:p>
+                  <w:r>
+                    <w:rPr>
+                      <w:color w:val="4A4036"/>
+                      <w:sz w:val="17"/>
+                      <w:szCs w:val="17"/>
+                    </w:rPr>
+                    <w:t xml:space="preserve">gyroid 25 %</w:t>
+                  </w:r>
+                </w:p>
+              </w:tc>
+            </w:tr>
+            <w:tr>
+              <w:tc>
+                <w:tcPr>
+                  <w:tcW w:type="dxa" w:w="1660"/>
+                  <w:tcBorders>
+                    <w:top w:val="none" w:color="FFFFFF" w:sz="0"/>
+                    <w:left w:val="none" w:color="FFFFFF" w:sz="0"/>
+                    <w:bottom w:val="single" w:color="E5DECF" w:sz="4"/>
+                    <w:right w:val="none" w:color="FFFFFF" w:sz="0"/>
+                  </w:tcBorders>
+                  <w:tcMar>
+                    <w:top w:type="dxa" w:w="80"/>
+                    <w:left w:type="dxa" w:w="0"/>
+                    <w:bottom w:type="dxa" w:w="80"/>
+                    <w:right w:type="dxa" w:w="60"/>
+                  </w:tcMar>
+                </w:tcPr>
+                <w:p>
+                  <w:r>
+                    <w:rPr>
+                      <w:color w:val="8A7D6E"/>
+                      <w:sz w:val="16"/>
+                      <w:szCs w:val="16"/>
+                    </w:rPr>
+                    <w:t xml:space="preserve">Parois</w:t>
+                  </w:r>
+                </w:p>
+              </w:tc>
+              <w:tc>
+                <w:tcPr>
+                  <w:tcW w:type="dxa" w:w="1359"/>
+                  <w:tcBorders>
+                    <w:top w:val="none" w:color="FFFFFF" w:sz="0"/>
+                    <w:left w:val="none" w:color="FFFFFF" w:sz="0"/>
+                    <w:bottom w:val="single" w:color="E5DECF" w:sz="4"/>
+                    <w:right w:val="none" w:color="FFFFFF" w:sz="0"/>
+                  </w:tcBorders>
+                  <w:tcMar>
+                    <w:top w:type="dxa" w:w="80"/>
+                    <w:left w:type="dxa" w:w="0"/>
+                    <w:bottom w:type="dxa" w:w="80"/>
+                    <w:right w:type="dxa" w:w="0"/>
+                  </w:tcMar>
+                </w:tcPr>
+                <w:p>
+                  <w:r>
+                    <w:rPr>
+                      <w:color w:val="4A4036"/>
+                      <w:sz w:val="17"/>
+                      <w:szCs w:val="17"/>
+                    </w:rPr>
+                    <w:t xml:space="preserve">4 perimetres</w:t>
+                  </w:r>
+                </w:p>
+              </w:tc>
+            </w:tr>
+            <w:tr>
+              <w:tc>
+                <w:tcPr>
+                  <w:tcW w:type="dxa" w:w="1660"/>
+                  <w:tcBorders>
+                    <w:top w:val="none" w:color="FFFFFF" w:sz="0"/>
+                    <w:left w:val="none" w:color="FFFFFF" w:sz="0"/>
+                    <w:bottom w:val="single" w:color="E5DECF" w:sz="4"/>
+                    <w:right w:val="none" w:color="FFFFFF" w:sz="0"/>
+                  </w:tcBorders>
+                  <w:tcMar>
+                    <w:top w:type="dxa" w:w="80"/>
+                    <w:left w:type="dxa" w:w="0"/>
+                    <w:bottom w:type="dxa" w:w="80"/>
+                    <w:right w:type="dxa" w:w="60"/>
+                  </w:tcMar>
+                </w:tcPr>
+                <w:p>
+                  <w:r>
+                    <w:rPr>
+                      <w:color w:val="8A7D6E"/>
+                      <w:sz w:val="16"/>
+                      <w:szCs w:val="16"/>
+                    </w:rPr>
+                    <w:t xml:space="preserve">Dessus / dessous</w:t>
+                  </w:r>
+                </w:p>
+              </w:tc>
+              <w:tc>
+                <w:tcPr>
+                  <w:tcW w:type="dxa" w:w="1359"/>
+                  <w:tcBorders>
+                    <w:top w:val="none" w:color="FFFFFF" w:sz="0"/>
+                    <w:left w:val="none" w:color="FFFFFF" w:sz="0"/>
+                    <w:bottom w:val="single" w:color="E5DECF" w:sz="4"/>
+                    <w:right w:val="none" w:color="FFFFFF" w:sz="0"/>
+                  </w:tcBorders>
+                  <w:tcMar>
+                    <w:top w:type="dxa" w:w="80"/>
+                    <w:left w:type="dxa" w:w="0"/>
+                    <w:bottom w:type="dxa" w:w="80"/>
+                    <w:right w:type="dxa" w:w="0"/>
+                  </w:tcMar>
+                </w:tcPr>
+                <w:p>
+                  <w:r>
+                    <w:rPr>
+                      <w:color w:val="4A4036"/>
+                      <w:sz w:val="17"/>
+                      <w:szCs w:val="17"/>
+                    </w:rPr>
+                    <w:t xml:space="preserve">5 couches</w:t>
+                  </w:r>
+                </w:p>
+              </w:tc>
+            </w:tr>
+            <w:tr>
+              <w:tc>
+                <w:tcPr>
+                  <w:tcW w:type="dxa" w:w="1660"/>
+                  <w:tcBorders>
+                    <w:top w:val="none" w:color="FFFFFF" w:sz="0"/>
+                    <w:left w:val="none" w:color="FFFFFF" w:sz="0"/>
+                    <w:bottom w:val="none" w:color="FFFFFF" w:sz="0"/>
+                    <w:right w:val="none" w:color="FFFFFF" w:sz="0"/>
+                  </w:tcBorders>
+                  <w:tcMar>
+                    <w:top w:type="dxa" w:w="80"/>
+                    <w:left w:type="dxa" w:w="0"/>
+                    <w:bottom w:type="dxa" w:w="80"/>
+                    <w:right w:type="dxa" w:w="60"/>
+                  </w:tcMar>
+                </w:tcPr>
+                <w:p>
+                  <w:r>
+                    <w:rPr>
+                      <w:color w:val="8A7D6E"/>
+                      <w:sz w:val="16"/>
+                      <w:szCs w:val="16"/>
+                    </w:rPr>
+                    <w:t xml:space="preserve">Buse / plateau</w:t>
+                  </w:r>
+                </w:p>
+              </w:tc>
+              <w:tc>
+                <w:tcPr>
+                  <w:tcW w:type="dxa" w:w="1359"/>
+                  <w:tcBorders>
+                    <w:top w:val="none" w:color="FFFFFF" w:sz="0"/>
+                    <w:left w:val="none" w:color="FFFFFF" w:sz="0"/>
+                    <w:bottom w:val="none" w:color="FFFFFF" w:sz="0"/>
+                    <w:right w:val="none" w:color="FFFFFF" w:sz="0"/>
+                  </w:tcBorders>
+                  <w:tcMar>
+                    <w:top w:type="dxa" w:w="80"/>
+                    <w:left w:type="dxa" w:w="0"/>
+                    <w:bottom w:type="dxa" w:w="80"/>
+                    <w:right w:type="dxa" w:w="0"/>
+                  </w:tcMar>
+                </w:tcPr>
+                <w:p>
+                  <w:r>
+                    <w:rPr>
+                      <w:color w:val="4A4036"/>
+                      <w:sz w:val="17"/>
+                      <w:szCs w:val="17"/>
+                    </w:rPr>
+                    <w:t xml:space="preserve">290 / 100 C</w:t>
+                  </w:r>
+                </w:p>
+              </w:tc>
+            </w:tr>
+          </w:tbl>
+          <w:p/>
+        </w:tc>
+        <w:tc>
+          <w:tcPr>
+            <w:tcW w:type="dxa" w:w="240"/>
+            <w:tcBorders>
+              <w:top w:val="none" w:color="FFFFFF" w:sz="0"/>
+              <w:left w:val="none" w:color="FFFFFF" w:sz="0"/>
+              <w:bottom w:val="none" w:color="FFFFFF" w:sz="0"/>
+              <w:right w:val="none" w:color="FFFFFF" w:sz="0"/>
+            </w:tcBorders>
+            <w:tcMar>
+              <w:top w:type="dxa" w:w="0"/>
+              <w:left w:type="dxa" w:w="0"/>
+              <w:bottom w:type="dxa" w:w="0"/>
+              <w:right w:type="dxa" w:w="0"/>
+            </w:tcMar>
+          </w:tcPr>
+          <w:p/>
+        </w:tc>
+        <w:tc>
+          <w:tcPr>
+            <w:tcW w:type="dxa" w:w="2939"/>
+            <w:tcBorders>
+              <w:top w:val="none" w:color="FFFFFF" w:sz="0"/>
+              <w:left w:val="none" w:color="FFFFFF" w:sz="0"/>
+              <w:bottom w:val="none" w:color="FFFFFF" w:sz="0"/>
+              <w:right w:val="none" w:color="FFFFFF" w:sz="0"/>
+            </w:tcBorders>
+            <w:tcMar>
+              <w:top w:type="dxa" w:w="0"/>
+              <w:left w:type="dxa" w:w="0"/>
+              <w:bottom w:type="dxa" w:w="0"/>
+              <w:right w:type="dxa" w:w="0"/>
+            </w:tcMar>
+          </w:tcPr>
+          <w:p>
+            <w:pPr>
+              <w:pBdr>
+                <w:bottom w:val="single" w:color="E5DECF" w:sz="4" w:space="4"/>
+              </w:pBdr>
+              <w:spacing w:after="60"/>
+            </w:pPr>
+            <w:r>
+              <w:rPr>
+                <w:b/>
+                <w:bCs/>
+                <w:color w:val="8A7D6E"/>
+                <w:spacing w:val="20"/>
+                <w:sz w:val="13"/>
+                <w:szCs w:val="13"/>
+              </w:rPr>
+              <w:t xml:space="preserve">FINITIONS</w:t>
             </w:r>
           </w:p>
           <w:tbl>
@@ -19001,7 +19705,7 @@
                       <w:sz w:val="16"/>
                       <w:szCs w:val="16"/>
                     </w:rPr>
-                    <w:t xml:space="preserve">Diametre</w:t>
+                    <w:t xml:space="preserve">Fermeture</w:t>
                   </w:r>
                 </w:p>
               </w:tc>
@@ -19028,7 +19732,7 @@
                       <w:sz w:val="17"/>
                       <w:szCs w:val="17"/>
                     </w:rPr>
-                    <w:t xml:space="preserve">110 mm</w:t>
+                    <w:t xml:space="preserve">levre press-fit</w:t>
                   </w:r>
                 </w:p>
               </w:tc>
@@ -19057,7 +19761,7 @@
                       <w:sz w:val="16"/>
                       <w:szCs w:val="16"/>
                     </w:rPr>
-                    <w:t xml:space="preserve">Hauteur</w:t>
+                    <w:t xml:space="preserve">Bouton</w:t>
                   </w:r>
                 </w:p>
               </w:tc>
@@ -19084,7 +19788,7 @@
                       <w:sz w:val="17"/>
                       <w:szCs w:val="17"/>
                     </w:rPr>
-                    <w:t xml:space="preserve">55 mm</w:t>
+                    <w:t xml:space="preserve">Alu 6061 brosse anodise</w:t>
                   </w:r>
                 </w:p>
               </w:tc>
@@ -19113,7 +19817,7 @@
                       <w:sz w:val="16"/>
                       <w:szCs w:val="16"/>
                     </w:rPr>
-                    <w:t xml:space="preserve">Chanfrein sup.</w:t>
+                    <w:t xml:space="preserve">Anneau LED</w:t>
                   </w:r>
                 </w:p>
               </w:tc>
@@ -19140,7 +19844,7 @@
                       <w:sz w:val="17"/>
                       <w:szCs w:val="17"/>
                     </w:rPr>
-                    <w:t xml:space="preserve">2 mm</w:t>
+                    <w:t xml:space="preserve">gorge diffusante</w:t>
                   </w:r>
                 </w:p>
               </w:tc>
@@ -19169,7 +19873,7 @@
                       <w:sz w:val="16"/>
                       <w:szCs w:val="16"/>
                     </w:rPr>
-                    <w:t xml:space="preserve">Volume scelle</w:t>
+                    <w:t xml:space="preserve">Pieds</w:t>
                   </w:r>
                 </w:p>
               </w:tc>
@@ -19196,7 +19900,7 @@
                       <w:sz w:val="17"/>
                       <w:szCs w:val="17"/>
                     </w:rPr>
-                    <w:t xml:space="preserve">~85 cm3</w:t>
+                    <w:t xml:space="preserve">silicone</w:t>
                   </w:r>
                 </w:p>
               </w:tc>
@@ -19225,717 +19929,13 @@
                       <w:sz w:val="16"/>
                       <w:szCs w:val="16"/>
                     </w:rPr>
-                    <w:t xml:space="preserve">Forme</w:t>
+                    <w:t xml:space="preserve">Assemblage</w:t>
                   </w:r>
                 </w:p>
               </w:tc>
               <w:tc>
                 <w:tcPr>
                   <w:tcW w:type="dxa" w:w="1510"/>
-                  <w:tcBorders>
-                    <w:top w:val="none" w:color="FFFFFF" w:sz="0"/>
-                    <w:left w:val="none" w:color="FFFFFF" w:sz="0"/>
-                    <w:bottom w:val="none" w:color="FFFFFF" w:sz="0"/>
-                    <w:right w:val="none" w:color="FFFFFF" w:sz="0"/>
-                  </w:tcBorders>
-                  <w:tcMar>
-                    <w:top w:type="dxa" w:w="80"/>
-                    <w:left w:type="dxa" w:w="0"/>
-                    <w:bottom w:type="dxa" w:w="80"/>
-                    <w:right w:type="dxa" w:w="0"/>
-                  </w:tcMar>
-                </w:tcPr>
-                <w:p>
-                  <w:r>
-                    <w:rPr>
-                      <w:color w:val="4A4036"/>
-                      <w:sz w:val="17"/>
-                      <w:szCs w:val="17"/>
-                    </w:rPr>
-                    <w:t xml:space="preserve">galet cylindrique</w:t>
-                  </w:r>
-                </w:p>
-              </w:tc>
-            </w:tr>
-          </w:tbl>
-          <w:p/>
-        </w:tc>
-        <w:tc>
-          <w:tcPr>
-            <w:tcW w:type="dxa" w:w="240"/>
-            <w:tcBorders>
-              <w:top w:val="none" w:color="FFFFFF" w:sz="0"/>
-              <w:left w:val="none" w:color="FFFFFF" w:sz="0"/>
-              <w:bottom w:val="none" w:color="FFFFFF" w:sz="0"/>
-              <w:right w:val="none" w:color="FFFFFF" w:sz="0"/>
-            </w:tcBorders>
-            <w:tcMar>
-              <w:top w:type="dxa" w:w="0"/>
-              <w:left w:type="dxa" w:w="0"/>
-              <w:bottom w:type="dxa" w:w="0"/>
-              <w:right w:type="dxa" w:w="0"/>
-            </w:tcMar>
-          </w:tcPr>
-          <w:p/>
-        </w:tc>
-        <w:tc>
-          <w:tcPr>
-            <w:tcW w:type="dxa" w:w="2939"/>
-            <w:tcBorders>
-              <w:top w:val="none" w:color="FFFFFF" w:sz="0"/>
-              <w:left w:val="none" w:color="FFFFFF" w:sz="0"/>
-              <w:bottom w:val="none" w:color="FFFFFF" w:sz="0"/>
-              <w:right w:val="none" w:color="FFFFFF" w:sz="0"/>
-            </w:tcBorders>
-            <w:tcMar>
-              <w:top w:type="dxa" w:w="0"/>
-              <w:left w:type="dxa" w:w="0"/>
-              <w:bottom w:type="dxa" w:w="0"/>
-              <w:right w:type="dxa" w:w="0"/>
-            </w:tcMar>
-          </w:tcPr>
-          <w:p>
-            <w:pPr>
-              <w:pBdr>
-                <w:bottom w:val="single" w:color="E5DECF" w:sz="4" w:space="4"/>
-              </w:pBdr>
-              <w:spacing w:after="60"/>
-            </w:pPr>
-            <w:r>
-              <w:rPr>
-                <w:b/>
-                <w:bCs/>
-                <w:color w:val="8A7D6E"/>
-                <w:spacing w:val="20"/>
-                <w:sz w:val="13"/>
-                <w:szCs w:val="13"/>
-              </w:rPr>
-              <w:t xml:space="preserve">IMPRESSION 3D</w:t>
-            </w:r>
-          </w:p>
-          <w:tbl>
-            <w:tblPr>
-              <w:tblW w:type="dxa" w:w="3019"/>
-              <w:tblBorders>
-                <w:top w:val="none" w:color="FFFFFF" w:sz="0"/>
-                <w:left w:val="none" w:color="FFFFFF" w:sz="0"/>
-                <w:bottom w:val="none" w:color="FFFFFF" w:sz="0"/>
-                <w:right w:val="none" w:color="FFFFFF" w:sz="0"/>
-                <w:insideH w:val="none" w:color="FFFFFF" w:sz="0"/>
-                <w:insideV w:val="none" w:color="FFFFFF" w:sz="0"/>
-              </w:tblBorders>
-            </w:tblPr>
-            <w:tblGrid>
-              <w:gridCol w:w="1509"/>
-              <w:gridCol w:w="1510"/>
-            </w:tblGrid>
-            <w:tr>
-              <w:tc>
-                <w:tcPr>
-                  <w:tcW w:type="dxa" w:w="1509"/>
-                  <w:tcBorders>
-                    <w:top w:val="none" w:color="FFFFFF" w:sz="0"/>
-                    <w:left w:val="none" w:color="FFFFFF" w:sz="0"/>
-                    <w:bottom w:val="single" w:color="E5DECF" w:sz="4"/>
-                    <w:right w:val="none" w:color="FFFFFF" w:sz="0"/>
-                  </w:tcBorders>
-                  <w:tcMar>
-                    <w:top w:type="dxa" w:w="80"/>
-                    <w:left w:type="dxa" w:w="0"/>
-                    <w:bottom w:type="dxa" w:w="80"/>
-                    <w:right w:type="dxa" w:w="60"/>
-                  </w:tcMar>
-                </w:tcPr>
-                <w:p>
-                  <w:r>
-                    <w:rPr>
-                      <w:color w:val="8A7D6E"/>
-                      <w:sz w:val="16"/>
-                      <w:szCs w:val="16"/>
-                    </w:rPr>
-                    <w:t xml:space="preserve">Matiere</w:t>
-                  </w:r>
-                </w:p>
-              </w:tc>
-              <w:tc>
-                <w:tcPr>
-                  <w:tcW w:type="dxa" w:w="1510"/>
-                  <w:tcBorders>
-                    <w:top w:val="none" w:color="FFFFFF" w:sz="0"/>
-                    <w:left w:val="none" w:color="FFFFFF" w:sz="0"/>
-                    <w:bottom w:val="single" w:color="E5DECF" w:sz="4"/>
-                    <w:right w:val="none" w:color="FFFFFF" w:sz="0"/>
-                  </w:tcBorders>
-                  <w:tcMar>
-                    <w:top w:type="dxa" w:w="80"/>
-                    <w:left w:type="dxa" w:w="0"/>
-                    <w:bottom w:type="dxa" w:w="80"/>
-                    <w:right w:type="dxa" w:w="0"/>
-                  </w:tcMar>
-                </w:tcPr>
-                <w:p>
-                  <w:r>
-                    <w:rPr>
-                      <w:color w:val="4A4036"/>
-                      <w:sz w:val="17"/>
-                      <w:szCs w:val="17"/>
-                    </w:rPr>
-                    <w:t xml:space="preserve">ABS blanc mat</w:t>
-                  </w:r>
-                </w:p>
-              </w:tc>
-            </w:tr>
-            <w:tr>
-              <w:tc>
-                <w:tcPr>
-                  <w:tcW w:type="dxa" w:w="1509"/>
-                  <w:tcBorders>
-                    <w:top w:val="none" w:color="FFFFFF" w:sz="0"/>
-                    <w:left w:val="none" w:color="FFFFFF" w:sz="0"/>
-                    <w:bottom w:val="single" w:color="E5DECF" w:sz="4"/>
-                    <w:right w:val="none" w:color="FFFFFF" w:sz="0"/>
-                  </w:tcBorders>
-                  <w:tcMar>
-                    <w:top w:type="dxa" w:w="80"/>
-                    <w:left w:type="dxa" w:w="0"/>
-                    <w:bottom w:type="dxa" w:w="80"/>
-                    <w:right w:type="dxa" w:w="60"/>
-                  </w:tcMar>
-                </w:tcPr>
-                <w:p>
-                  <w:r>
-                    <w:rPr>
-                      <w:color w:val="8A7D6E"/>
-                      <w:sz w:val="16"/>
-                      <w:szCs w:val="16"/>
-                    </w:rPr>
-                    <w:t xml:space="preserve">Remplissage</w:t>
-                  </w:r>
-                </w:p>
-              </w:tc>
-              <w:tc>
-                <w:tcPr>
-                  <w:tcW w:type="dxa" w:w="1510"/>
-                  <w:tcBorders>
-                    <w:top w:val="none" w:color="FFFFFF" w:sz="0"/>
-                    <w:left w:val="none" w:color="FFFFFF" w:sz="0"/>
-                    <w:bottom w:val="single" w:color="E5DECF" w:sz="4"/>
-                    <w:right w:val="none" w:color="FFFFFF" w:sz="0"/>
-                  </w:tcBorders>
-                  <w:tcMar>
-                    <w:top w:type="dxa" w:w="80"/>
-                    <w:left w:type="dxa" w:w="0"/>
-                    <w:bottom w:type="dxa" w:w="80"/>
-                    <w:right w:type="dxa" w:w="0"/>
-                  </w:tcMar>
-                </w:tcPr>
-                <w:p>
-                  <w:r>
-                    <w:rPr>
-                      <w:color w:val="4A4036"/>
-                      <w:sz w:val="17"/>
-                      <w:szCs w:val="17"/>
-                    </w:rPr>
-                    <w:t xml:space="preserve">gyroid 25 %</w:t>
-                  </w:r>
-                </w:p>
-              </w:tc>
-            </w:tr>
-            <w:tr>
-              <w:tc>
-                <w:tcPr>
-                  <w:tcW w:type="dxa" w:w="1509"/>
-                  <w:tcBorders>
-                    <w:top w:val="none" w:color="FFFFFF" w:sz="0"/>
-                    <w:left w:val="none" w:color="FFFFFF" w:sz="0"/>
-                    <w:bottom w:val="single" w:color="E5DECF" w:sz="4"/>
-                    <w:right w:val="none" w:color="FFFFFF" w:sz="0"/>
-                  </w:tcBorders>
-                  <w:tcMar>
-                    <w:top w:type="dxa" w:w="80"/>
-                    <w:left w:type="dxa" w:w="0"/>
-                    <w:bottom w:type="dxa" w:w="80"/>
-                    <w:right w:type="dxa" w:w="60"/>
-                  </w:tcMar>
-                </w:tcPr>
-                <w:p>
-                  <w:r>
-                    <w:rPr>
-                      <w:color w:val="8A7D6E"/>
-                      <w:sz w:val="16"/>
-                      <w:szCs w:val="16"/>
-                    </w:rPr>
-                    <w:t xml:space="preserve">Parois</w:t>
-                  </w:r>
-                </w:p>
-              </w:tc>
-              <w:tc>
-                <w:tcPr>
-                  <w:tcW w:type="dxa" w:w="1510"/>
-                  <w:tcBorders>
-                    <w:top w:val="none" w:color="FFFFFF" w:sz="0"/>
-                    <w:left w:val="none" w:color="FFFFFF" w:sz="0"/>
-                    <w:bottom w:val="single" w:color="E5DECF" w:sz="4"/>
-                    <w:right w:val="none" w:color="FFFFFF" w:sz="0"/>
-                  </w:tcBorders>
-                  <w:tcMar>
-                    <w:top w:type="dxa" w:w="80"/>
-                    <w:left w:type="dxa" w:w="0"/>
-                    <w:bottom w:type="dxa" w:w="80"/>
-                    <w:right w:type="dxa" w:w="0"/>
-                  </w:tcMar>
-                </w:tcPr>
-                <w:p>
-                  <w:r>
-                    <w:rPr>
-                      <w:color w:val="4A4036"/>
-                      <w:sz w:val="17"/>
-                      <w:szCs w:val="17"/>
-                    </w:rPr>
-                    <w:t xml:space="preserve">4 perimetres</w:t>
-                  </w:r>
-                </w:p>
-              </w:tc>
-            </w:tr>
-            <w:tr>
-              <w:tc>
-                <w:tcPr>
-                  <w:tcW w:type="dxa" w:w="1509"/>
-                  <w:tcBorders>
-                    <w:top w:val="none" w:color="FFFFFF" w:sz="0"/>
-                    <w:left w:val="none" w:color="FFFFFF" w:sz="0"/>
-                    <w:bottom w:val="single" w:color="E5DECF" w:sz="4"/>
-                    <w:right w:val="none" w:color="FFFFFF" w:sz="0"/>
-                  </w:tcBorders>
-                  <w:tcMar>
-                    <w:top w:type="dxa" w:w="80"/>
-                    <w:left w:type="dxa" w:w="0"/>
-                    <w:bottom w:type="dxa" w:w="80"/>
-                    <w:right w:type="dxa" w:w="60"/>
-                  </w:tcMar>
-                </w:tcPr>
-                <w:p>
-                  <w:r>
-                    <w:rPr>
-                      <w:color w:val="8A7D6E"/>
-                      <w:sz w:val="16"/>
-                      <w:szCs w:val="16"/>
-                    </w:rPr>
-                    <w:t xml:space="preserve">Anneau diffuseur</w:t>
-                  </w:r>
-                </w:p>
-              </w:tc>
-              <w:tc>
-                <w:tcPr>
-                  <w:tcW w:type="dxa" w:w="1510"/>
-                  <w:tcBorders>
-                    <w:top w:val="none" w:color="FFFFFF" w:sz="0"/>
-                    <w:left w:val="none" w:color="FFFFFF" w:sz="0"/>
-                    <w:bottom w:val="single" w:color="E5DECF" w:sz="4"/>
-                    <w:right w:val="none" w:color="FFFFFF" w:sz="0"/>
-                  </w:tcBorders>
-                  <w:tcMar>
-                    <w:top w:type="dxa" w:w="80"/>
-                    <w:left w:type="dxa" w:w="0"/>
-                    <w:bottom w:type="dxa" w:w="80"/>
-                    <w:right w:type="dxa" w:w="0"/>
-                  </w:tcMar>
-                </w:tcPr>
-                <w:p>
-                  <w:r>
-                    <w:rPr>
-                      <w:color w:val="4A4036"/>
-                      <w:sz w:val="17"/>
-                      <w:szCs w:val="17"/>
-                    </w:rPr>
-                    <w:t xml:space="preserve">PETG, 0.8 mm</w:t>
-                  </w:r>
-                </w:p>
-              </w:tc>
-            </w:tr>
-            <w:tr>
-              <w:tc>
-                <w:tcPr>
-                  <w:tcW w:type="dxa" w:w="1509"/>
-                  <w:tcBorders>
-                    <w:top w:val="none" w:color="FFFFFF" w:sz="0"/>
-                    <w:left w:val="none" w:color="FFFFFF" w:sz="0"/>
-                    <w:bottom w:val="none" w:color="FFFFFF" w:sz="0"/>
-                    <w:right w:val="none" w:color="FFFFFF" w:sz="0"/>
-                  </w:tcBorders>
-                  <w:tcMar>
-                    <w:top w:type="dxa" w:w="80"/>
-                    <w:left w:type="dxa" w:w="0"/>
-                    <w:bottom w:type="dxa" w:w="80"/>
-                    <w:right w:type="dxa" w:w="60"/>
-                  </w:tcMar>
-                </w:tcPr>
-                <w:p>
-                  <w:r>
-                    <w:rPr>
-                      <w:color w:val="8A7D6E"/>
-                      <w:sz w:val="16"/>
-                      <w:szCs w:val="16"/>
-                    </w:rPr>
-                    <w:t xml:space="preserve">Inserts</w:t>
-                  </w:r>
-                </w:p>
-              </w:tc>
-              <w:tc>
-                <w:tcPr>
-                  <w:tcW w:type="dxa" w:w="1510"/>
-                  <w:tcBorders>
-                    <w:top w:val="none" w:color="FFFFFF" w:sz="0"/>
-                    <w:left w:val="none" w:color="FFFFFF" w:sz="0"/>
-                    <w:bottom w:val="none" w:color="FFFFFF" w:sz="0"/>
-                    <w:right w:val="none" w:color="FFFFFF" w:sz="0"/>
-                  </w:tcBorders>
-                  <w:tcMar>
-                    <w:top w:type="dxa" w:w="80"/>
-                    <w:left w:type="dxa" w:w="0"/>
-                    <w:bottom w:type="dxa" w:w="80"/>
-                    <w:right w:type="dxa" w:w="0"/>
-                  </w:tcMar>
-                </w:tcPr>
-                <w:p>
-                  <w:r>
-                    <w:rPr>
-                      <w:color w:val="4A4036"/>
-                      <w:sz w:val="17"/>
-                      <w:szCs w:val="17"/>
-                    </w:rPr>
-                    <w:t xml:space="preserve">M3 thermofondus</w:t>
-                  </w:r>
-                </w:p>
-              </w:tc>
-            </w:tr>
-          </w:tbl>
-          <w:p/>
-        </w:tc>
-        <w:tc>
-          <w:tcPr>
-            <w:tcW w:type="dxa" w:w="240"/>
-            <w:tcBorders>
-              <w:top w:val="none" w:color="FFFFFF" w:sz="0"/>
-              <w:left w:val="none" w:color="FFFFFF" w:sz="0"/>
-              <w:bottom w:val="none" w:color="FFFFFF" w:sz="0"/>
-              <w:right w:val="none" w:color="FFFFFF" w:sz="0"/>
-            </w:tcBorders>
-            <w:tcMar>
-              <w:top w:type="dxa" w:w="0"/>
-              <w:left w:type="dxa" w:w="0"/>
-              <w:bottom w:type="dxa" w:w="0"/>
-              <w:right w:type="dxa" w:w="0"/>
-            </w:tcMar>
-          </w:tcPr>
-          <w:p/>
-        </w:tc>
-        <w:tc>
-          <w:tcPr>
-            <w:tcW w:type="dxa" w:w="2939"/>
-            <w:tcBorders>
-              <w:top w:val="none" w:color="FFFFFF" w:sz="0"/>
-              <w:left w:val="none" w:color="FFFFFF" w:sz="0"/>
-              <w:bottom w:val="none" w:color="FFFFFF" w:sz="0"/>
-              <w:right w:val="none" w:color="FFFFFF" w:sz="0"/>
-            </w:tcBorders>
-            <w:tcMar>
-              <w:top w:type="dxa" w:w="0"/>
-              <w:left w:type="dxa" w:w="0"/>
-              <w:bottom w:type="dxa" w:w="0"/>
-              <w:right w:type="dxa" w:w="0"/>
-            </w:tcMar>
-          </w:tcPr>
-          <w:p>
-            <w:pPr>
-              <w:pBdr>
-                <w:bottom w:val="single" w:color="E5DECF" w:sz="4" w:space="4"/>
-              </w:pBdr>
-              <w:spacing w:after="60"/>
-            </w:pPr>
-            <w:r>
-              <w:rPr>
-                <w:b/>
-                <w:bCs/>
-                <w:color w:val="8A7D6E"/>
-                <w:spacing w:val="20"/>
-                <w:sz w:val="13"/>
-                <w:szCs w:val="13"/>
-              </w:rPr>
-              <w:t xml:space="preserve">FINITIONS</w:t>
-            </w:r>
-          </w:p>
-          <w:tbl>
-            <w:tblPr>
-              <w:tblW w:type="dxa" w:w="3019"/>
-              <w:tblBorders>
-                <w:top w:val="none" w:color="FFFFFF" w:sz="0"/>
-                <w:left w:val="none" w:color="FFFFFF" w:sz="0"/>
-                <w:bottom w:val="none" w:color="FFFFFF" w:sz="0"/>
-                <w:right w:val="none" w:color="FFFFFF" w:sz="0"/>
-                <w:insideH w:val="none" w:color="FFFFFF" w:sz="0"/>
-                <w:insideV w:val="none" w:color="FFFFFF" w:sz="0"/>
-              </w:tblBorders>
-            </w:tblPr>
-            <w:tblGrid>
-              <w:gridCol w:w="1660"/>
-              <w:gridCol w:w="1359"/>
-            </w:tblGrid>
-            <w:tr>
-              <w:tc>
-                <w:tcPr>
-                  <w:tcW w:type="dxa" w:w="1660"/>
-                  <w:tcBorders>
-                    <w:top w:val="none" w:color="FFFFFF" w:sz="0"/>
-                    <w:left w:val="none" w:color="FFFFFF" w:sz="0"/>
-                    <w:bottom w:val="single" w:color="E5DECF" w:sz="4"/>
-                    <w:right w:val="none" w:color="FFFFFF" w:sz="0"/>
-                  </w:tcBorders>
-                  <w:tcMar>
-                    <w:top w:type="dxa" w:w="80"/>
-                    <w:left w:type="dxa" w:w="0"/>
-                    <w:bottom w:type="dxa" w:w="80"/>
-                    <w:right w:type="dxa" w:w="60"/>
-                  </w:tcMar>
-                </w:tcPr>
-                <w:p>
-                  <w:r>
-                    <w:rPr>
-                      <w:color w:val="8A7D6E"/>
-                      <w:sz w:val="16"/>
-                      <w:szCs w:val="16"/>
-                    </w:rPr>
-                    <w:t xml:space="preserve">Surface ABS</w:t>
-                  </w:r>
-                </w:p>
-              </w:tc>
-              <w:tc>
-                <w:tcPr>
-                  <w:tcW w:type="dxa" w:w="1359"/>
-                  <w:tcBorders>
-                    <w:top w:val="none" w:color="FFFFFF" w:sz="0"/>
-                    <w:left w:val="none" w:color="FFFFFF" w:sz="0"/>
-                    <w:bottom w:val="single" w:color="E5DECF" w:sz="4"/>
-                    <w:right w:val="none" w:color="FFFFFF" w:sz="0"/>
-                  </w:tcBorders>
-                  <w:tcMar>
-                    <w:top w:type="dxa" w:w="80"/>
-                    <w:left w:type="dxa" w:w="0"/>
-                    <w:bottom w:type="dxa" w:w="80"/>
-                    <w:right w:type="dxa" w:w="0"/>
-                  </w:tcMar>
-                </w:tcPr>
-                <w:p>
-                  <w:r>
-                    <w:rPr>
-                      <w:color w:val="4A4036"/>
-                      <w:sz w:val="17"/>
-                      <w:szCs w:val="17"/>
-                    </w:rPr>
-                    <w:t xml:space="preserve">ponce + vapeur acetone</w:t>
-                  </w:r>
-                </w:p>
-              </w:tc>
-            </w:tr>
-            <w:tr>
-              <w:tc>
-                <w:tcPr>
-                  <w:tcW w:type="dxa" w:w="1660"/>
-                  <w:tcBorders>
-                    <w:top w:val="none" w:color="FFFFFF" w:sz="0"/>
-                    <w:left w:val="none" w:color="FFFFFF" w:sz="0"/>
-                    <w:bottom w:val="single" w:color="E5DECF" w:sz="4"/>
-                    <w:right w:val="none" w:color="FFFFFF" w:sz="0"/>
-                  </w:tcBorders>
-                  <w:tcMar>
-                    <w:top w:type="dxa" w:w="80"/>
-                    <w:left w:type="dxa" w:w="0"/>
-                    <w:bottom w:type="dxa" w:w="80"/>
-                    <w:right w:type="dxa" w:w="60"/>
-                  </w:tcMar>
-                </w:tcPr>
-                <w:p>
-                  <w:r>
-                    <w:rPr>
-                      <w:color w:val="8A7D6E"/>
-                      <w:sz w:val="16"/>
-                      <w:szCs w:val="16"/>
-                    </w:rPr>
-                    <w:t xml:space="preserve">Effet</w:t>
-                  </w:r>
-                </w:p>
-              </w:tc>
-              <w:tc>
-                <w:tcPr>
-                  <w:tcW w:type="dxa" w:w="1359"/>
-                  <w:tcBorders>
-                    <w:top w:val="none" w:color="FFFFFF" w:sz="0"/>
-                    <w:left w:val="none" w:color="FFFFFF" w:sz="0"/>
-                    <w:bottom w:val="single" w:color="E5DECF" w:sz="4"/>
-                    <w:right w:val="none" w:color="FFFFFF" w:sz="0"/>
-                  </w:tcBorders>
-                  <w:tcMar>
-                    <w:top w:type="dxa" w:w="80"/>
-                    <w:left w:type="dxa" w:w="0"/>
-                    <w:bottom w:type="dxa" w:w="80"/>
-                    <w:right w:type="dxa" w:w="0"/>
-                  </w:tcMar>
-                </w:tcPr>
-                <w:p>
-                  <w:r>
-                    <w:rPr>
-                      <w:color w:val="4A4036"/>
-                      <w:sz w:val="17"/>
-                      <w:szCs w:val="17"/>
-                    </w:rPr>
-                    <w:t xml:space="preserve">laque satine</w:t>
-                  </w:r>
-                </w:p>
-              </w:tc>
-            </w:tr>
-            <w:tr>
-              <w:tc>
-                <w:tcPr>
-                  <w:tcW w:type="dxa" w:w="1660"/>
-                  <w:tcBorders>
-                    <w:top w:val="none" w:color="FFFFFF" w:sz="0"/>
-                    <w:left w:val="none" w:color="FFFFFF" w:sz="0"/>
-                    <w:bottom w:val="single" w:color="E5DECF" w:sz="4"/>
-                    <w:right w:val="none" w:color="FFFFFF" w:sz="0"/>
-                  </w:tcBorders>
-                  <w:tcMar>
-                    <w:top w:type="dxa" w:w="80"/>
-                    <w:left w:type="dxa" w:w="0"/>
-                    <w:bottom w:type="dxa" w:w="80"/>
-                    <w:right w:type="dxa" w:w="60"/>
-                  </w:tcMar>
-                </w:tcPr>
-                <w:p>
-                  <w:r>
-                    <w:rPr>
-                      <w:color w:val="8A7D6E"/>
-                      <w:sz w:val="16"/>
-                      <w:szCs w:val="16"/>
-                    </w:rPr>
-                    <w:t xml:space="preserve">Bouton</w:t>
-                  </w:r>
-                </w:p>
-              </w:tc>
-              <w:tc>
-                <w:tcPr>
-                  <w:tcW w:type="dxa" w:w="1359"/>
-                  <w:tcBorders>
-                    <w:top w:val="none" w:color="FFFFFF" w:sz="0"/>
-                    <w:left w:val="none" w:color="FFFFFF" w:sz="0"/>
-                    <w:bottom w:val="single" w:color="E5DECF" w:sz="4"/>
-                    <w:right w:val="none" w:color="FFFFFF" w:sz="0"/>
-                  </w:tcBorders>
-                  <w:tcMar>
-                    <w:top w:type="dxa" w:w="80"/>
-                    <w:left w:type="dxa" w:w="0"/>
-                    <w:bottom w:type="dxa" w:w="80"/>
-                    <w:right w:type="dxa" w:w="0"/>
-                  </w:tcMar>
-                </w:tcPr>
-                <w:p>
-                  <w:r>
-                    <w:rPr>
-                      <w:color w:val="4A4036"/>
-                      <w:sz w:val="17"/>
-                      <w:szCs w:val="17"/>
-                    </w:rPr>
-                    <w:t xml:space="preserve">Alu 6061 brosse anodise</w:t>
-                  </w:r>
-                </w:p>
-              </w:tc>
-            </w:tr>
-            <w:tr>
-              <w:tc>
-                <w:tcPr>
-                  <w:tcW w:type="dxa" w:w="1660"/>
-                  <w:tcBorders>
-                    <w:top w:val="none" w:color="FFFFFF" w:sz="0"/>
-                    <w:left w:val="none" w:color="FFFFFF" w:sz="0"/>
-                    <w:bottom w:val="single" w:color="E5DECF" w:sz="4"/>
-                    <w:right w:val="none" w:color="FFFFFF" w:sz="0"/>
-                  </w:tcBorders>
-                  <w:tcMar>
-                    <w:top w:type="dxa" w:w="80"/>
-                    <w:left w:type="dxa" w:w="0"/>
-                    <w:bottom w:type="dxa" w:w="80"/>
-                    <w:right w:type="dxa" w:w="60"/>
-                  </w:tcMar>
-                </w:tcPr>
-                <w:p>
-                  <w:r>
-                    <w:rPr>
-                      <w:color w:val="8A7D6E"/>
-                      <w:sz w:val="16"/>
-                      <w:szCs w:val="16"/>
-                    </w:rPr>
-                    <w:t xml:space="preserve">Anneau LED</w:t>
-                  </w:r>
-                </w:p>
-              </w:tc>
-              <w:tc>
-                <w:tcPr>
-                  <w:tcW w:type="dxa" w:w="1359"/>
-                  <w:tcBorders>
-                    <w:top w:val="none" w:color="FFFFFF" w:sz="0"/>
-                    <w:left w:val="none" w:color="FFFFFF" w:sz="0"/>
-                    <w:bottom w:val="single" w:color="E5DECF" w:sz="4"/>
-                    <w:right w:val="none" w:color="FFFFFF" w:sz="0"/>
-                  </w:tcBorders>
-                  <w:tcMar>
-                    <w:top w:type="dxa" w:w="80"/>
-                    <w:left w:type="dxa" w:w="0"/>
-                    <w:bottom w:type="dxa" w:w="80"/>
-                    <w:right w:type="dxa" w:w="0"/>
-                  </w:tcMar>
-                </w:tcPr>
-                <w:p>
-                  <w:r>
-                    <w:rPr>
-                      <w:color w:val="4A4036"/>
-                      <w:sz w:val="17"/>
-                      <w:szCs w:val="17"/>
-                    </w:rPr>
-                    <w:t xml:space="preserve">PETG +0.4 mm</w:t>
-                  </w:r>
-                </w:p>
-              </w:tc>
-            </w:tr>
-            <w:tr>
-              <w:tc>
-                <w:tcPr>
-                  <w:tcW w:type="dxa" w:w="1660"/>
-                  <w:tcBorders>
-                    <w:top w:val="none" w:color="FFFFFF" w:sz="0"/>
-                    <w:left w:val="none" w:color="FFFFFF" w:sz="0"/>
-                    <w:bottom w:val="none" w:color="FFFFFF" w:sz="0"/>
-                    <w:right w:val="none" w:color="FFFFFF" w:sz="0"/>
-                  </w:tcBorders>
-                  <w:tcMar>
-                    <w:top w:type="dxa" w:w="80"/>
-                    <w:left w:type="dxa" w:w="0"/>
-                    <w:bottom w:type="dxa" w:w="80"/>
-                    <w:right w:type="dxa" w:w="60"/>
-                  </w:tcMar>
-                </w:tcPr>
-                <w:p>
-                  <w:r>
-                    <w:rPr>
-                      <w:color w:val="8A7D6E"/>
-                      <w:sz w:val="16"/>
-                      <w:szCs w:val="16"/>
-                    </w:rPr>
-                    <w:t xml:space="preserve">Assemblage</w:t>
-                  </w:r>
-                </w:p>
-              </w:tc>
-              <w:tc>
-                <w:tcPr>
-                  <w:tcW w:type="dxa" w:w="1359"/>
                   <w:tcBorders>
                     <w:top w:val="none" w:color="FFFFFF" w:sz="0"/>
                     <w:left w:val="none" w:color="FFFFFF" w:sz="0"/>
@@ -20029,9 +20029,9 @@
       <w:r>
         <w:drawing>
           <wp:inline distT="0" distB="0" distL="0" distR="0">
-            <wp:extent cx="5762625" cy="3219450"/>
+            <wp:extent cx="5400675" cy="5048250"/>
             <wp:effectExtent t="0" r="0" b="0" l="0"/>
-            <wp:docPr id="1" name="p17_00_Image1.jpg" descr="p17_00_Image1.jpg" title="p17_00_Image1.jpg"/>
+            <wp:docPr id="1" name="boitier_v4_eclate.png" descr="boitier_v4_eclate.png" title="boitier_v4_eclate.png"/>
             <wp:cNvGraphicFramePr>
               <a:graphicFrameLocks xmlns:a="http://schemas.openxmlformats.org/drawingml/2006/main" noChangeAspect="1"/>
             </wp:cNvGraphicFramePr>
@@ -20054,7 +20054,7 @@
                   <pic:spPr bwMode="auto">
                     <a:xfrm>
                       <a:off x="0" y="0"/>
-                      <a:ext cx="5762625" cy="3219450"/>
+                      <a:ext cx="5400675" cy="5048250"/>
                     </a:xfrm>
                     <a:prstGeom prst="rect">
                       <a:avLst/>
@@ -20080,7 +20080,7 @@
           <w:sz w:val="14"/>
           <w:szCs w:val="14"/>
         </w:rPr>
-        <w:t xml:space="preserve">Fig. 5 - Exploded view de l’enclosure, composants et finition.</w:t>
+        <w:t xml:space="preserve">Fig. 5 - Vue eclatee du boitier v4 : capot a molette centrale + bac a facade HP.</w:t>
       </w:r>
     </w:p>
     <w:tbl>
@@ -20213,7 +20213,7 @@
                             <w:sz w:val="16"/>
                             <w:szCs w:val="16"/>
                           </w:rPr>
-                          <w:t xml:space="preserve">1. Capot superieur</w:t>
+                          <w:t xml:space="preserve">1. Capot</w:t>
                         </w:r>
                       </w:p>
                     </w:tc>
@@ -20240,7 +20240,7 @@
                             <w:sz w:val="17"/>
                             <w:szCs w:val="17"/>
                           </w:rPr>
-                          <w:t xml:space="preserve">Disque ABS, aperture encodeur, fenetre diffuseur PETG clipsee</w:t>
+                          <w:t xml:space="preserve">Plaque PA-CF, molette centrale, gorge anneau LED, levre press-fit</w:t>
                         </w:r>
                       </w:p>
                     </w:tc>
@@ -20269,7 +20269,7 @@
                             <w:sz w:val="16"/>
                             <w:szCs w:val="16"/>
                           </w:rPr>
-                          <w:t xml:space="preserve">2. Bouton central</w:t>
+                          <w:t xml:space="preserve">2. Encodeur EC11</w:t>
                         </w:r>
                       </w:p>
                     </w:tc>
@@ -20296,7 +20296,7 @@
                             <w:sz w:val="17"/>
                             <w:szCs w:val="17"/>
                           </w:rPr>
-                          <w:t xml:space="preserve">Pastille aluminium brosse, aimants de rappel, dome tactile</w:t>
+                          <w:t xml:space="preserve">Montage panneau (douille M7), cable aux connecteurs SW1/DS1</w:t>
                         </w:r>
                       </w:p>
                     </w:tc>
@@ -20325,7 +20325,7 @@
                             <w:sz w:val="16"/>
                             <w:szCs w:val="16"/>
                           </w:rPr>
-                          <w:t xml:space="preserve">3. Anneau diffuseur</w:t>
+                          <w:t xml:space="preserve">3. Anneau LED</w:t>
                         </w:r>
                       </w:p>
                     </w:tc>
@@ -20352,7 +20352,7 @@
                             <w:sz w:val="17"/>
                             <w:szCs w:val="17"/>
                           </w:rPr>
-                          <w:t xml:space="preserve">PETG translucide, anneau LED PCB circulaire 12 WS2812</w:t>
+                          <w:t xml:space="preserve">WS2812 sous capot, gorge diffusante (O60/44 mm)</w:t>
                         </w:r>
                       </w:p>
                     </w:tc>
@@ -20408,7 +20408,7 @@
                             <w:sz w:val="17"/>
                             <w:szCs w:val="17"/>
                           </w:rPr>
-                          <w:t xml:space="preserve">Carte fille collee, prise de son par canal conique 0.8 mm</w:t>
+                          <w:t xml:space="preserve">Pinhole conique 0.8 mm, place au-dessus du module INMP441</w:t>
                         </w:r>
                       </w:p>
                     </w:tc>
@@ -20437,7 +20437,7 @@
                             <w:sz w:val="16"/>
                             <w:szCs w:val="16"/>
                           </w:rPr>
-                          <w:t xml:space="preserve">5. PCB principal</w:t>
+                          <w:t xml:space="preserve">5. PCB porteur</w:t>
                         </w:r>
                       </w:p>
                     </w:tc>
@@ -20464,7 +20464,7 @@
                             <w:sz w:val="17"/>
                             <w:szCs w:val="17"/>
                           </w:rPr>
-                          <w:t xml:space="preserve">ESP32-S3, PCM5102, ampli PAM8403, connecteurs JST-PH</w:t>
+                          <w:t xml:space="preserve">ESP32-S3, PCM5102, ampli PAM8403 - carte 76,7 x 108 mm</w:t>
                         </w:r>
                       </w:p>
                     </w:tc>
@@ -20493,7 +20493,7 @@
                             <w:sz w:val="16"/>
                             <w:szCs w:val="16"/>
                           </w:rPr>
-                          <w:t xml:space="preserve">6. Baffle stereo</w:t>
+                          <w:t xml:space="preserve">6. Haut-parleurs</w:t>
                         </w:r>
                       </w:p>
                     </w:tc>
@@ -20520,7 +20520,7 @@
                             <w:sz w:val="17"/>
                             <w:szCs w:val="17"/>
                           </w:rPr>
-                          <w:t xml:space="preserve">Plaque ABS nervuree, 2 HP 40 mm inclines 35 degres</w:t>
+                          <w:t xml:space="preserve">2 HP 40 mm front-firing, grilles hexagonales en facade</w:t>
                         </w:r>
                       </w:p>
                     </w:tc>
@@ -20549,7 +20549,7 @@
                             <w:sz w:val="16"/>
                             <w:szCs w:val="16"/>
                           </w:rPr>
-                          <w:t xml:space="preserve">7. Chambre acoustique</w:t>
+                          <w:t xml:space="preserve">7. Entretoises</w:t>
                         </w:r>
                       </w:p>
                     </w:tc>
@@ -20576,7 +20576,7 @@
                             <w:sz w:val="17"/>
                             <w:szCs w:val="17"/>
                           </w:rPr>
-                          <w:t xml:space="preserve">Volume scelle (~85 cm3) avec mousse melamine</w:t>
+                          <w:t xml:space="preserve">4 x M3 alignees sur les trous MK1-MK4 reels du PCB</w:t>
                         </w:r>
                       </w:p>
                     </w:tc>
@@ -20605,7 +20605,7 @@
                             <w:sz w:val="16"/>
                             <w:szCs w:val="16"/>
                           </w:rPr>
-                          <w:t xml:space="preserve">8. Fond</w:t>
+                          <w:t xml:space="preserve">8. Bac</w:t>
                         </w:r>
                       </w:p>
                     </w:tc>
@@ -20632,7 +20632,7 @@
                             <w:sz w:val="17"/>
                             <w:szCs w:val="17"/>
                           </w:rPr>
-                          <w:t xml:space="preserve">Plaque ABS, pieds silicone, port USB-C, events de refroidissement</w:t>
+                          <w:t xml:space="preserve">PA-CF, pieds silicone, port USB-C (sur J2), events de fond</w:t>
                         </w:r>
                       </w:p>
                     </w:tc>
@@ -20830,7 +20830,7 @@
                             <w:sz w:val="16"/>
                             <w:szCs w:val="16"/>
                           </w:rPr>
-                          <w:t xml:space="preserve">Inclinaison 35 degres</w:t>
+                          <w:t xml:space="preserve">Orientation front-firing</w:t>
                         </w:r>
                       </w:p>
                     </w:tc>
@@ -20857,7 +20857,7 @@
                             <w:sz w:val="17"/>
                             <w:szCs w:val="17"/>
                           </w:rPr>
-                          <w:t xml:space="preserve">elargir l'image stereo</w:t>
+                          <w:t xml:space="preserve">son dirige vers l'utilisateur</w:t>
                         </w:r>
                       </w:p>
                     </w:tc>
@@ -20886,7 +20886,7 @@
                             <w:sz w:val="16"/>
                             <w:szCs w:val="16"/>
                           </w:rPr>
-                          <w:t xml:space="preserve">Chambre close en ABS</w:t>
+                          <w:t xml:space="preserve">Anneaux de vissage M2.5</w:t>
                         </w:r>
                       </w:p>
                     </w:tc>
@@ -20913,7 +20913,7 @@
                             <w:sz w:val="17"/>
                             <w:szCs w:val="17"/>
                           </w:rPr>
-                          <w:t xml:space="preserve">nervuree (anti-resonances)</w:t>
+                          <w:t xml:space="preserve">fixation HP en facade</w:t>
                         </w:r>
                       </w:p>
                     </w:tc>
@@ -20942,7 +20942,7 @@
                             <w:sz w:val="16"/>
                             <w:szCs w:val="16"/>
                           </w:rPr>
-                          <w:t xml:space="preserve">Joints silicone</w:t>
+                          <w:t xml:space="preserve">Joints d'enceinte TPU</w:t>
                         </w:r>
                       </w:p>
                     </w:tc>
@@ -20969,7 +20969,7 @@
                             <w:sz w:val="17"/>
                             <w:szCs w:val="17"/>
                           </w:rPr>
-                          <w:t xml:space="preserve">baffle et coque (decouplage)</w:t>
+                          <w:t xml:space="preserve">etancheite / compression</w:t>
                         </w:r>
                       </w:p>
                     </w:tc>
@@ -20998,7 +20998,7 @@
                             <w:sz w:val="16"/>
                             <w:szCs w:val="16"/>
                           </w:rPr>
-                          <w:t xml:space="preserve">Mousse melamine au fond</w:t>
+                          <w:t xml:space="preserve">Coque PA-CF rigide</w:t>
                         </w:r>
                       </w:p>
                     </w:tc>
@@ -21025,7 +21025,7 @@
                             <w:sz w:val="17"/>
                             <w:szCs w:val="17"/>
                           </w:rPr>
-                          <w:t xml:space="preserve">amortir les reflexions</w:t>
+                          <w:t xml:space="preserve">limite les resonances</w:t>
                         </w:r>
                       </w:p>
                     </w:tc>
@@ -21081,7 +21081,7 @@
                             <w:sz w:val="17"/>
                             <w:szCs w:val="17"/>
                           </w:rPr>
-                          <w:t xml:space="preserve">laser-compatible (DXF inclus)</w:t>
+                          <w:t xml:space="preserve">integree (motif imprime 3D)</w:t>
                         </w:r>
                       </w:p>
                     </w:tc>
@@ -21410,7 +21410,7 @@
                 <w:sz w:val="16"/>
                 <w:szCs w:val="16"/>
               </w:rPr>
-              <w:t xml:space="preserve">Capot superieur</w:t>
+              <w:t xml:space="preserve">Capot (v4_top)</w:t>
             </w:r>
           </w:p>
         </w:tc>
@@ -21437,7 +21437,7 @@
                 <w:sz w:val="16"/>
                 <w:szCs w:val="16"/>
               </w:rPr>
-              <w:t xml:space="preserve">ABS blanc mat</w:t>
+              <w:t xml:space="preserve">PA-CF</w:t>
             </w:r>
           </w:p>
         </w:tc>
@@ -21520,7 +21520,7 @@
                 <w:sz w:val="16"/>
                 <w:szCs w:val="16"/>
               </w:rPr>
-              <w:t xml:space="preserve">Fond</w:t>
+              <w:t xml:space="preserve">Bac (v4_base)</w:t>
             </w:r>
           </w:p>
         </w:tc>
@@ -21547,7 +21547,7 @@
                 <w:sz w:val="16"/>
                 <w:szCs w:val="16"/>
               </w:rPr>
-              <w:t xml:space="preserve">ABS blanc mat</w:t>
+              <w:t xml:space="preserve">PA-CF</w:t>
             </w:r>
           </w:p>
         </w:tc>
@@ -21601,7 +21601,7 @@
                 <w:sz w:val="16"/>
                 <w:szCs w:val="16"/>
               </w:rPr>
-              <w:t xml:space="preserve">Impression 3D, events integres</w:t>
+              <w:t xml:space="preserve">Facade HP, USB-C, entretoises integres</w:t>
             </w:r>
           </w:p>
         </w:tc>
@@ -21630,7 +21630,7 @@
                 <w:sz w:val="16"/>
                 <w:szCs w:val="16"/>
               </w:rPr>
-              <w:t xml:space="preserve">Corps cylindrique</w:t>
+              <w:t xml:space="preserve">Joints d'enceinte</w:t>
             </w:r>
           </w:p>
         </w:tc>
@@ -21657,7 +21657,7 @@
                 <w:sz w:val="16"/>
                 <w:szCs w:val="16"/>
               </w:rPr>
-              <w:t xml:space="preserve">ABS blanc mat</w:t>
+              <w:t xml:space="preserve">TPU 95A</w:t>
             </w:r>
           </w:p>
         </w:tc>
@@ -21684,7 +21684,7 @@
                 <w:sz w:val="16"/>
                 <w:szCs w:val="16"/>
               </w:rPr>
-              <w:t xml:space="preserve">1</w:t>
+              <w:t xml:space="preserve">2</w:t>
             </w:r>
           </w:p>
         </w:tc>
@@ -21711,7 +21711,7 @@
                 <w:sz w:val="16"/>
                 <w:szCs w:val="16"/>
               </w:rPr>
-              <w:t xml:space="preserve">Grilles stereo, paroi 4</w:t>
+              <w:t xml:space="preserve">v4_speaker_gasket, compression</w:t>
             </w:r>
           </w:p>
         </w:tc>
@@ -21740,7 +21740,7 @@
                 <w:sz w:val="16"/>
                 <w:szCs w:val="16"/>
               </w:rPr>
-              <w:t xml:space="preserve">Baffle stereo</w:t>
+              <w:t xml:space="preserve">Bouton central</w:t>
             </w:r>
           </w:p>
         </w:tc>
@@ -21767,7 +21767,7 @@
                 <w:sz w:val="16"/>
                 <w:szCs w:val="16"/>
               </w:rPr>
-              <w:t xml:space="preserve">ABS blanc</w:t>
+              <w:t xml:space="preserve">Alu 6061 brosse anodise</w:t>
             </w:r>
           </w:p>
         </w:tc>
@@ -21821,7 +21821,7 @@
                 <w:sz w:val="16"/>
                 <w:szCs w:val="16"/>
               </w:rPr>
-              <w:t xml:space="preserve">Impression 3D nervuree</w:t>
+              <w:t xml:space="preserve">Sur encodeur EC11 (douille M7)</w:t>
             </w:r>
           </w:p>
         </w:tc>
@@ -21850,7 +21850,7 @@
                 <w:sz w:val="16"/>
                 <w:szCs w:val="16"/>
               </w:rPr>
-              <w:t xml:space="preserve">Anneau diffuseur</w:t>
+              <w:t xml:space="preserve">Anneau LED</w:t>
             </w:r>
           </w:p>
         </w:tc>
@@ -21877,7 +21877,7 @@
                 <w:sz w:val="16"/>
                 <w:szCs w:val="16"/>
               </w:rPr>
-              <w:t xml:space="preserve">PETG translucide</w:t>
+              <w:t xml:space="preserve">WS2812 (12 LED)</w:t>
             </w:r>
           </w:p>
         </w:tc>
@@ -21931,7 +21931,7 @@
                 <w:sz w:val="16"/>
                 <w:szCs w:val="16"/>
               </w:rPr>
-              <w:t xml:space="preserve">Impression 3D, paroi 0.8 mm</w:t>
+              <w:t xml:space="preserve">Monte sous capot, gorge diffusante</w:t>
             </w:r>
           </w:p>
         </w:tc>
@@ -21960,7 +21960,7 @@
                 <w:sz w:val="16"/>
                 <w:szCs w:val="16"/>
               </w:rPr>
-              <w:t xml:space="preserve">Bouton central</w:t>
+              <w:t xml:space="preserve">Haut-parleurs</w:t>
             </w:r>
           </w:p>
         </w:tc>
@@ -21987,7 +21987,7 @@
                 <w:sz w:val="16"/>
                 <w:szCs w:val="16"/>
               </w:rPr>
-              <w:t xml:space="preserve">Alu 6061 brosse anodise</w:t>
+              <w:t xml:space="preserve">40 mm / 4 ohms / 3 W</w:t>
             </w:r>
           </w:p>
         </w:tc>
@@ -22014,7 +22014,7 @@
                 <w:sz w:val="16"/>
                 <w:szCs w:val="16"/>
               </w:rPr>
-              <w:t xml:space="preserve">1</w:t>
+              <w:t xml:space="preserve">2</w:t>
             </w:r>
           </w:p>
         </w:tc>
@@ -22041,7 +22041,7 @@
                 <w:sz w:val="16"/>
                 <w:szCs w:val="16"/>
               </w:rPr>
-              <w:t xml:space="preserve">Tournage ou pastille collee</w:t>
+              <w:t xml:space="preserve">Pleine-bande, front-firing</w:t>
             </w:r>
           </w:p>
         </w:tc>
@@ -22070,7 +22070,7 @@
                 <w:sz w:val="16"/>
                 <w:szCs w:val="16"/>
               </w:rPr>
-              <w:t xml:space="preserve">Haut-parleurs</w:t>
+              <w:t xml:space="preserve">Vis M3</w:t>
             </w:r>
           </w:p>
         </w:tc>
@@ -22097,7 +22097,7 @@
                 <w:sz w:val="16"/>
                 <w:szCs w:val="16"/>
               </w:rPr>
-              <w:t xml:space="preserve">40 mm / 4 ohms / 3 W</w:t>
+              <w:t xml:space="preserve">Inox</w:t>
             </w:r>
           </w:p>
         </w:tc>
@@ -22124,7 +22124,7 @@
                 <w:sz w:val="16"/>
                 <w:szCs w:val="16"/>
               </w:rPr>
-              <w:t xml:space="preserve">2</w:t>
+              <w:t xml:space="preserve">4</w:t>
             </w:r>
           </w:p>
         </w:tc>
@@ -22151,7 +22151,7 @@
                 <w:sz w:val="16"/>
                 <w:szCs w:val="16"/>
               </w:rPr>
-              <w:t xml:space="preserve">Pleine-bande neodyme</w:t>
+              <w:t xml:space="preserve">Fixation PCB (trous MK1-MK4)</w:t>
             </w:r>
           </w:p>
         </w:tc>
@@ -22180,7 +22180,7 @@
                 <w:sz w:val="16"/>
                 <w:szCs w:val="16"/>
               </w:rPr>
-              <w:t xml:space="preserve">Inserts filetes M3</w:t>
+              <w:t xml:space="preserve">Vis M2.5</w:t>
             </w:r>
           </w:p>
         </w:tc>
@@ -22207,7 +22207,7 @@
                 <w:sz w:val="16"/>
                 <w:szCs w:val="16"/>
               </w:rPr>
-              <w:t xml:space="preserve">Laiton thermofondu</w:t>
+              <w:t xml:space="preserve">Inox</w:t>
             </w:r>
           </w:p>
         </w:tc>
@@ -22234,7 +22234,7 @@
                 <w:sz w:val="16"/>
                 <w:szCs w:val="16"/>
               </w:rPr>
-              <w:t xml:space="preserve">3</w:t>
+              <w:t xml:space="preserve">8</w:t>
             </w:r>
           </w:p>
         </w:tc>
@@ -22261,7 +22261,7 @@
                 <w:sz w:val="16"/>
                 <w:szCs w:val="16"/>
               </w:rPr>
-              <w:t xml:space="preserve">Sous le fond, maintenance</w:t>
+              <w:t xml:space="preserve">Fixation HP en facade</w:t>
             </w:r>
           </w:p>
         </w:tc>
@@ -22290,7 +22290,7 @@
                 <w:sz w:val="16"/>
                 <w:szCs w:val="16"/>
               </w:rPr>
-              <w:t xml:space="preserve">Joints silicone</w:t>
+              <w:t xml:space="preserve">Pieds silicone</w:t>
             </w:r>
           </w:p>
         </w:tc>
@@ -22344,7 +22344,7 @@
                 <w:sz w:val="16"/>
                 <w:szCs w:val="16"/>
               </w:rPr>
-              <w:t xml:space="preserve">2</w:t>
+              <w:t xml:space="preserve">4</w:t>
             </w:r>
           </w:p>
         </w:tc>
@@ -22371,227 +22371,7 @@
                 <w:sz w:val="16"/>
                 <w:szCs w:val="16"/>
               </w:rPr>
-              <w:t xml:space="preserve">Decouplage baffle / coque</w:t>
-            </w:r>
-          </w:p>
-        </w:tc>
-      </w:tr>
-      <w:tr>
-        <w:tc>
-          <w:tcPr>
-            <w:tcW w:type="dxa" w:w="2600"/>
-            <w:tcBorders>
-              <w:top w:val="none" w:color="FFFFFF" w:sz="0"/>
-              <w:left w:val="none" w:color="FFFFFF" w:sz="0"/>
-              <w:bottom w:val="single" w:color="E5DECF" w:sz="4"/>
-              <w:right w:val="none" w:color="FFFFFF" w:sz="0"/>
-            </w:tcBorders>
-            <w:tcMar>
-              <w:top w:type="dxa" w:w="100"/>
-              <w:left w:type="dxa" w:w="0"/>
-              <w:bottom w:type="dxa" w:w="100"/>
-              <w:right w:type="dxa" w:w="80"/>
-            </w:tcMar>
-          </w:tcPr>
-          <w:p>
-            <w:r>
-              <w:rPr>
-                <w:color w:val="4A4036"/>
-                <w:sz w:val="16"/>
-                <w:szCs w:val="16"/>
-              </w:rPr>
-              <w:t xml:space="preserve">Grille laterale hexagonale</w:t>
-            </w:r>
-          </w:p>
-        </w:tc>
-        <w:tc>
-          <w:tcPr>
-            <w:tcW w:type="dxa" w:w="2700"/>
-            <w:tcBorders>
-              <w:top w:val="none" w:color="FFFFFF" w:sz="0"/>
-              <w:left w:val="none" w:color="FFFFFF" w:sz="0"/>
-              <w:bottom w:val="single" w:color="E5DECF" w:sz="4"/>
-              <w:right w:val="none" w:color="FFFFFF" w:sz="0"/>
-            </w:tcBorders>
-            <w:tcMar>
-              <w:top w:type="dxa" w:w="100"/>
-              <w:left w:type="dxa" w:w="0"/>
-              <w:bottom w:type="dxa" w:w="100"/>
-              <w:right w:type="dxa" w:w="80"/>
-            </w:tcMar>
-          </w:tcPr>
-          <w:p>
-            <w:r>
-              <w:rPr>
-                <w:color w:val="4A4036"/>
-                <w:sz w:val="16"/>
-                <w:szCs w:val="16"/>
-              </w:rPr>
-              <w:t xml:space="preserve">Maille acier ou laser ABS</w:t>
-            </w:r>
-          </w:p>
-        </w:tc>
-        <w:tc>
-          <w:tcPr>
-            <w:tcW w:type="dxa" w:w="700"/>
-            <w:tcBorders>
-              <w:top w:val="none" w:color="FFFFFF" w:sz="0"/>
-              <w:left w:val="none" w:color="FFFFFF" w:sz="0"/>
-              <w:bottom w:val="single" w:color="E5DECF" w:sz="4"/>
-              <w:right w:val="none" w:color="FFFFFF" w:sz="0"/>
-            </w:tcBorders>
-            <w:tcMar>
-              <w:top w:type="dxa" w:w="100"/>
-              <w:left w:type="dxa" w:w="0"/>
-              <w:bottom w:type="dxa" w:w="100"/>
-              <w:right w:type="dxa" w:w="80"/>
-            </w:tcMar>
-          </w:tcPr>
-          <w:p>
-            <w:r>
-              <w:rPr>
-                <w:color w:val="4A4036"/>
-                <w:sz w:val="16"/>
-                <w:szCs w:val="16"/>
-              </w:rPr>
-              <w:t xml:space="preserve">2</w:t>
-            </w:r>
-          </w:p>
-        </w:tc>
-        <w:tc>
-          <w:tcPr>
-            <w:tcW w:type="dxa" w:w="3298"/>
-            <w:tcBorders>
-              <w:top w:val="none" w:color="FFFFFF" w:sz="0"/>
-              <w:left w:val="none" w:color="FFFFFF" w:sz="0"/>
-              <w:bottom w:val="single" w:color="E5DECF" w:sz="4"/>
-              <w:right w:val="none" w:color="FFFFFF" w:sz="0"/>
-            </w:tcBorders>
-            <w:tcMar>
-              <w:top w:type="dxa" w:w="100"/>
-              <w:left w:type="dxa" w:w="0"/>
-              <w:bottom w:type="dxa" w:w="100"/>
-              <w:right w:type="dxa" w:w="80"/>
-            </w:tcMar>
-          </w:tcPr>
-          <w:p>
-            <w:r>
-              <w:rPr>
-                <w:color w:val="4A4036"/>
-                <w:sz w:val="16"/>
-                <w:szCs w:val="16"/>
-              </w:rPr>
-              <w:t xml:space="preserve">DXF inclus</w:t>
-            </w:r>
-          </w:p>
-        </w:tc>
-      </w:tr>
-      <w:tr>
-        <w:tc>
-          <w:tcPr>
-            <w:tcW w:type="dxa" w:w="2600"/>
-            <w:tcBorders>
-              <w:top w:val="none" w:color="FFFFFF" w:sz="0"/>
-              <w:left w:val="none" w:color="FFFFFF" w:sz="0"/>
-              <w:bottom w:val="single" w:color="E5DECF" w:sz="4"/>
-              <w:right w:val="none" w:color="FFFFFF" w:sz="0"/>
-            </w:tcBorders>
-            <w:tcMar>
-              <w:top w:type="dxa" w:w="100"/>
-              <w:left w:type="dxa" w:w="0"/>
-              <w:bottom w:type="dxa" w:w="100"/>
-              <w:right w:type="dxa" w:w="80"/>
-            </w:tcMar>
-          </w:tcPr>
-          <w:p>
-            <w:r>
-              <w:rPr>
-                <w:color w:val="4A4036"/>
-                <w:sz w:val="16"/>
-                <w:szCs w:val="16"/>
-              </w:rPr>
-              <w:t xml:space="preserve">Connecteurs</w:t>
-            </w:r>
-          </w:p>
-        </w:tc>
-        <w:tc>
-          <w:tcPr>
-            <w:tcW w:type="dxa" w:w="2700"/>
-            <w:tcBorders>
-              <w:top w:val="none" w:color="FFFFFF" w:sz="0"/>
-              <w:left w:val="none" w:color="FFFFFF" w:sz="0"/>
-              <w:bottom w:val="single" w:color="E5DECF" w:sz="4"/>
-              <w:right w:val="none" w:color="FFFFFF" w:sz="0"/>
-            </w:tcBorders>
-            <w:tcMar>
-              <w:top w:type="dxa" w:w="100"/>
-              <w:left w:type="dxa" w:w="0"/>
-              <w:bottom w:type="dxa" w:w="100"/>
-              <w:right w:type="dxa" w:w="80"/>
-            </w:tcMar>
-          </w:tcPr>
-          <w:p>
-            <w:r>
-              <w:rPr>
-                <w:color w:val="4A4036"/>
-                <w:sz w:val="16"/>
-                <w:szCs w:val="16"/>
-              </w:rPr>
-              <w:t xml:space="preserve">JST-PH 2 et 4 broches</w:t>
-            </w:r>
-          </w:p>
-        </w:tc>
-        <w:tc>
-          <w:tcPr>
-            <w:tcW w:type="dxa" w:w="700"/>
-            <w:tcBorders>
-              <w:top w:val="none" w:color="FFFFFF" w:sz="0"/>
-              <w:left w:val="none" w:color="FFFFFF" w:sz="0"/>
-              <w:bottom w:val="single" w:color="E5DECF" w:sz="4"/>
-              <w:right w:val="none" w:color="FFFFFF" w:sz="0"/>
-            </w:tcBorders>
-            <w:tcMar>
-              <w:top w:type="dxa" w:w="100"/>
-              <w:left w:type="dxa" w:w="0"/>
-              <w:bottom w:type="dxa" w:w="100"/>
-              <w:right w:type="dxa" w:w="80"/>
-            </w:tcMar>
-          </w:tcPr>
-          <w:p>
-            <w:r>
-              <w:rPr>
-                <w:color w:val="4A4036"/>
-                <w:sz w:val="16"/>
-                <w:szCs w:val="16"/>
-              </w:rPr>
-              <w:t xml:space="preserve">5</w:t>
-            </w:r>
-          </w:p>
-        </w:tc>
-        <w:tc>
-          <w:tcPr>
-            <w:tcW w:type="dxa" w:w="3298"/>
-            <w:tcBorders>
-              <w:top w:val="none" w:color="FFFFFF" w:sz="0"/>
-              <w:left w:val="none" w:color="FFFFFF" w:sz="0"/>
-              <w:bottom w:val="single" w:color="E5DECF" w:sz="4"/>
-              <w:right w:val="none" w:color="FFFFFF" w:sz="0"/>
-            </w:tcBorders>
-            <w:tcMar>
-              <w:top w:type="dxa" w:w="100"/>
-              <w:left w:type="dxa" w:w="0"/>
-              <w:bottom w:type="dxa" w:w="100"/>
-              <w:right w:type="dxa" w:w="80"/>
-            </w:tcMar>
-          </w:tcPr>
-          <w:p>
-            <w:r>
-              <w:rPr>
-                <w:color w:val="4A4036"/>
-                <w:sz w:val="16"/>
-                <w:szCs w:val="16"/>
-              </w:rPr>
-              <w:t xml:space="preserve">PCB modulaire</w:t>
+              <w:t xml:space="preserve">Anti-derapant, sous le bac</w:t>
             </w:r>
           </w:p>
         </w:tc>
@@ -22644,7 +22424,7 @@
           <w:sz w:val="17"/>
           <w:szCs w:val="17"/>
         </w:rPr>
-        <w:t xml:space="preserve">Les cinq pieces du boitier sont fournies sous forme de sources parametriques </w:t>
+        <w:t xml:space="preserve">Les trois pieces du boitier sont fournies en sources parametriques </w:t>
       </w:r>
       <w:r>
         <w:rPr>
@@ -22661,7 +22441,7 @@
           <w:sz w:val="17"/>
           <w:szCs w:val="17"/>
         </w:rPr>
-        <w:t xml:space="preserve"> et d'apercus </w:t>
+        <w:t xml:space="preserve">, en maillages </w:t>
       </w:r>
       <w:r>
         <w:rPr>
@@ -22670,7 +22450,7 @@
           <w:sz w:val="16"/>
           <w:szCs w:val="16"/>
         </w:rPr>
-        <w:t xml:space="preserve">STL binaires</w:t>
+        <w:t xml:space="preserve">STL</w:t>
       </w:r>
       <w:r>
         <w:rPr>
@@ -22678,7 +22458,41 @@
           <w:sz w:val="17"/>
           <w:szCs w:val="17"/>
         </w:rPr>
-        <w:t xml:space="preserve">. Les sources sont la verite du design : ouvrez-les dans OpenSCAD pour ajuster les cotes a vos composants reels, puis exportez des STL precis. Les STL fournis ici sont des volumes simplifies destines au prototypage et a la visualisation rapide.</w:t>
+        <w:t xml:space="preserve">, en solides </w:t>
+      </w:r>
+      <w:r>
+        <w:rPr>
+          <w:rFonts w:ascii="Courier New" w:cs="Courier New" w:eastAsia="Courier New" w:hAnsi="Courier New"/>
+          <w:color w:val="8C6E3D"/>
+          <w:sz w:val="16"/>
+          <w:szCs w:val="16"/>
+        </w:rPr>
+        <w:t xml:space="preserve">STEP</w:t>
+      </w:r>
+      <w:r>
+        <w:rPr>
+          <w:color w:val="4A4036"/>
+          <w:sz w:val="17"/>
+          <w:szCs w:val="17"/>
+        </w:rPr>
+        <w:t xml:space="preserve"> (reference CAO / fabricant) et en projet OrcaSlicer </w:t>
+      </w:r>
+      <w:r>
+        <w:rPr>
+          <w:rFonts w:ascii="Courier New" w:cs="Courier New" w:eastAsia="Courier New" w:hAnsi="Courier New"/>
+          <w:color w:val="8C6E3D"/>
+          <w:sz w:val="16"/>
+          <w:szCs w:val="16"/>
+        </w:rPr>
+        <w:t xml:space="preserve">.3mf</w:t>
+      </w:r>
+      <w:r>
+        <w:rPr>
+          <w:color w:val="4A4036"/>
+          <w:sz w:val="17"/>
+          <w:szCs w:val="17"/>
+        </w:rPr>
+        <w:t xml:space="preserve"> pret a trancher (reglages PA-CF). Les sources .scad sont la verite du design (tout est pilote par params.scad) ; le .3mf permet d'imprimer directement sur RatRig V-Core 3 400.</w:t>
       </w:r>
     </w:p>
     <w:tbl>
@@ -22694,8 +22508,8 @@
         </w:tblBorders>
       </w:tblPr>
       <w:tblGrid>
-        <w:gridCol w:w="2100"/>
-        <w:gridCol w:w="3798"/>
+        <w:gridCol w:w="2700"/>
+        <w:gridCol w:w="3198"/>
         <w:gridCol w:w="1700"/>
         <w:gridCol w:w="1700"/>
       </w:tblGrid>
@@ -22705,7 +22519,7 @@
         </w:trPr>
         <w:tc>
           <w:tcPr>
-            <w:tcW w:type="dxa" w:w="2100"/>
+            <w:tcW w:type="dxa" w:w="2700"/>
             <w:tcBorders>
               <w:top w:val="none" w:color="FFFFFF" w:sz="0"/>
               <w:left w:val="none" w:color="FFFFFF" w:sz="0"/>
@@ -22729,13 +22543,13 @@
                 <w:sz w:val="13"/>
                 <w:szCs w:val="13"/>
               </w:rPr>
-              <w:t xml:space="preserve">SLUG</w:t>
-            </w:r>
-          </w:p>
-        </w:tc>
-        <w:tc>
-          <w:tcPr>
-            <w:tcW w:type="dxa" w:w="3798"/>
+              <w:t xml:space="preserve">PIECE</w:t>
+            </w:r>
+          </w:p>
+        </w:tc>
+        <w:tc>
+          <w:tcPr>
+            <w:tcW w:type="dxa" w:w="3198"/>
             <w:tcBorders>
               <w:top w:val="none" w:color="FFFFFF" w:sz="0"/>
               <w:left w:val="none" w:color="FFFFFF" w:sz="0"/>
@@ -22789,7 +22603,7 @@
                 <w:sz w:val="13"/>
                 <w:szCs w:val="13"/>
               </w:rPr>
-              <w:t xml:space="preserve">SOURCE</w:t>
+              <w:t xml:space="preserve">STL</w:t>
             </w:r>
           </w:p>
         </w:tc>
@@ -22819,7 +22633,7 @@
                 <w:sz w:val="13"/>
                 <w:szCs w:val="13"/>
               </w:rPr>
-              <w:t xml:space="preserve">APERCU</w:t>
+              <w:t xml:space="preserve">STEP</w:t>
             </w:r>
           </w:p>
         </w:tc>
@@ -22827,7 +22641,7 @@
       <w:tr>
         <w:tc>
           <w:tcPr>
-            <w:tcW w:type="dxa" w:w="2100"/>
+            <w:tcW w:type="dxa" w:w="2700"/>
             <w:tcBorders>
               <w:top w:val="none" w:color="FFFFFF" w:sz="0"/>
               <w:left w:val="none" w:color="FFFFFF" w:sz="0"/>
@@ -22849,13 +22663,13 @@
                 <w:sz w:val="17"/>
                 <w:szCs w:val="17"/>
               </w:rPr>
-              <w:t xml:space="preserve">housing_top</w:t>
-            </w:r>
-          </w:p>
-        </w:tc>
-        <w:tc>
-          <w:tcPr>
-            <w:tcW w:type="dxa" w:w="3798"/>
+              <w:t xml:space="preserve">v4_base</w:t>
+            </w:r>
+          </w:p>
+        </w:tc>
+        <w:tc>
+          <w:tcPr>
+            <w:tcW w:type="dxa" w:w="3198"/>
             <w:tcBorders>
               <w:top w:val="none" w:color="FFFFFF" w:sz="0"/>
               <w:left w:val="none" w:color="FFFFFF" w:sz="0"/>
@@ -22876,7 +22690,7 @@
                 <w:sz w:val="16"/>
                 <w:szCs w:val="16"/>
               </w:rPr>
-              <w:t xml:space="preserve">Capot superieur (bouton + anneau LED)</w:t>
+              <w:t xml:space="preserve">Bac : facade HP, USB-C, entretoises PCB</w:t>
             </w:r>
           </w:p>
         </w:tc>
@@ -22897,7 +22711,7 @@
             </w:tcMar>
           </w:tcPr>
           <w:p>
-            <w:hyperlink w:history="1" r:id="rIdfqlzd7wsme9hba7th8hiv">
+            <w:hyperlink w:history="1" r:id="rIdzlg6xh5padtdwkunq5hgd">
               <w:r>
                 <w:rPr>
                   <w:rFonts w:ascii="Courier New" w:cs="Courier New" w:eastAsia="Courier New" w:hAnsi="Courier New"/>
@@ -22906,7 +22720,7 @@
                   <w:szCs w:val="14"/>
                   <w:u w:val="single"/>
                 </w:rPr>
-                <w:t xml:space="preserve">housing_top.scad</w:t>
+                <w:t xml:space="preserve">v4_base.stl</w:t>
               </w:r>
             </w:hyperlink>
           </w:p>
@@ -22928,7 +22742,7 @@
             </w:tcMar>
           </w:tcPr>
           <w:p>
-            <w:hyperlink w:history="1" r:id="rId2dwumfr0pghbeieddkpyx">
+            <w:hyperlink w:history="1" r:id="rIdb_fe2taf8usowwrjfwbia">
               <w:r>
                 <w:rPr>
                   <w:rFonts w:ascii="Courier New" w:cs="Courier New" w:eastAsia="Courier New" w:hAnsi="Courier New"/>
@@ -22937,7 +22751,7 @@
                   <w:szCs w:val="14"/>
                   <w:u w:val="single"/>
                 </w:rPr>
-                <w:t xml:space="preserve">housing_top.stl</w:t>
+                <w:t xml:space="preserve">v4_base.step</w:t>
               </w:r>
             </w:hyperlink>
           </w:p>
@@ -22946,7 +22760,7 @@
       <w:tr>
         <w:tc>
           <w:tcPr>
-            <w:tcW w:type="dxa" w:w="2100"/>
+            <w:tcW w:type="dxa" w:w="2700"/>
             <w:tcBorders>
               <w:top w:val="none" w:color="FFFFFF" w:sz="0"/>
               <w:left w:val="none" w:color="FFFFFF" w:sz="0"/>
@@ -22968,13 +22782,13 @@
                 <w:sz w:val="17"/>
                 <w:szCs w:val="17"/>
               </w:rPr>
-              <w:t xml:space="preserve">housing_body</w:t>
-            </w:r>
-          </w:p>
-        </w:tc>
-        <w:tc>
-          <w:tcPr>
-            <w:tcW w:type="dxa" w:w="3798"/>
+              <w:t xml:space="preserve">v4_top</w:t>
+            </w:r>
+          </w:p>
+        </w:tc>
+        <w:tc>
+          <w:tcPr>
+            <w:tcW w:type="dxa" w:w="3198"/>
             <w:tcBorders>
               <w:top w:val="none" w:color="FFFFFF" w:sz="0"/>
               <w:left w:val="none" w:color="FFFFFF" w:sz="0"/>
@@ -22995,7 +22809,7 @@
                 <w:sz w:val="16"/>
                 <w:szCs w:val="16"/>
               </w:rPr>
-              <w:t xml:space="preserve">Corps cylindrique (grilles stereo)</w:t>
+              <w:t xml:space="preserve">Capot : molette, anneau LED, micro, levre</w:t>
             </w:r>
           </w:p>
         </w:tc>
@@ -23016,7 +22830,7 @@
             </w:tcMar>
           </w:tcPr>
           <w:p>
-            <w:hyperlink w:history="1" r:id="rIdbi5epsdr9c3jzk2bojb2z">
+            <w:hyperlink w:history="1" r:id="rIdsl53yixwwwswk8r6mevua">
               <w:r>
                 <w:rPr>
                   <w:rFonts w:ascii="Courier New" w:cs="Courier New" w:eastAsia="Courier New" w:hAnsi="Courier New"/>
@@ -23025,7 +22839,7 @@
                   <w:szCs w:val="14"/>
                   <w:u w:val="single"/>
                 </w:rPr>
-                <w:t xml:space="preserve">housing_body.scad</w:t>
+                <w:t xml:space="preserve">v4_top.stl</w:t>
               </w:r>
             </w:hyperlink>
           </w:p>
@@ -23047,7 +22861,7 @@
             </w:tcMar>
           </w:tcPr>
           <w:p>
-            <w:hyperlink w:history="1" r:id="rIdfigbh8ai7tznmlf8zkowm">
+            <w:hyperlink w:history="1" r:id="rId2zatjnpt3yujmvszwnj8m">
               <w:r>
                 <w:rPr>
                   <w:rFonts w:ascii="Courier New" w:cs="Courier New" w:eastAsia="Courier New" w:hAnsi="Courier New"/>
@@ -23056,7 +22870,7 @@
                   <w:szCs w:val="14"/>
                   <w:u w:val="single"/>
                 </w:rPr>
-                <w:t xml:space="preserve">housing_body.stl</w:t>
+                <w:t xml:space="preserve">v4_top.step</w:t>
               </w:r>
             </w:hyperlink>
           </w:p>
@@ -23065,7 +22879,7 @@
       <w:tr>
         <w:tc>
           <w:tcPr>
-            <w:tcW w:type="dxa" w:w="2100"/>
+            <w:tcW w:type="dxa" w:w="2700"/>
             <w:tcBorders>
               <w:top w:val="none" w:color="FFFFFF" w:sz="0"/>
               <w:left w:val="none" w:color="FFFFFF" w:sz="0"/>
@@ -23087,13 +22901,13 @@
                 <w:sz w:val="17"/>
                 <w:szCs w:val="17"/>
               </w:rPr>
-              <w:t xml:space="preserve">housing_bottom</w:t>
-            </w:r>
-          </w:p>
-        </w:tc>
-        <w:tc>
-          <w:tcPr>
-            <w:tcW w:type="dxa" w:w="3798"/>
+              <w:t xml:space="preserve">v4_speaker_gasket</w:t>
+            </w:r>
+          </w:p>
+        </w:tc>
+        <w:tc>
+          <w:tcPr>
+            <w:tcW w:type="dxa" w:w="3198"/>
             <w:tcBorders>
               <w:top w:val="none" w:color="FFFFFF" w:sz="0"/>
               <w:left w:val="none" w:color="FFFFFF" w:sz="0"/>
@@ -23114,7 +22928,7 @@
                 <w:sz w:val="16"/>
                 <w:szCs w:val="16"/>
               </w:rPr>
-              <w:t xml:space="preserve">Fond (USB-C, events, inserts M3)</w:t>
+              <w:t xml:space="preserve">Joints d'enceinte x2 (TPU)</w:t>
             </w:r>
           </w:p>
         </w:tc>
@@ -23135,7 +22949,7 @@
             </w:tcMar>
           </w:tcPr>
           <w:p>
-            <w:hyperlink w:history="1" r:id="rId2_g2j-rn4x7tc-lusjag0">
+            <w:hyperlink w:history="1" r:id="rIdng8_etna_omjvpltazrqv">
               <w:r>
                 <w:rPr>
                   <w:rFonts w:ascii="Courier New" w:cs="Courier New" w:eastAsia="Courier New" w:hAnsi="Courier New"/>
@@ -23144,7 +22958,7 @@
                   <w:szCs w:val="14"/>
                   <w:u w:val="single"/>
                 </w:rPr>
-                <w:t xml:space="preserve">housing_bottom.scad</w:t>
+                <w:t xml:space="preserve">v4_speaker_gasket.stl</w:t>
               </w:r>
             </w:hyperlink>
           </w:p>
@@ -23166,7 +22980,7 @@
             </w:tcMar>
           </w:tcPr>
           <w:p>
-            <w:hyperlink w:history="1" r:id="rIdbcgr4nmryrpbjjo4qgh8i">
+            <w:hyperlink w:history="1" r:id="rId54gkzzayfp6ushhvvpr56">
               <w:r>
                 <w:rPr>
                   <w:rFonts w:ascii="Courier New" w:cs="Courier New" w:eastAsia="Courier New" w:hAnsi="Courier New"/>
@@ -23175,245 +22989,7 @@
                   <w:szCs w:val="14"/>
                   <w:u w:val="single"/>
                 </w:rPr>
-                <w:t xml:space="preserve">housing_bottom.stl</w:t>
-              </w:r>
-            </w:hyperlink>
-          </w:p>
-        </w:tc>
-      </w:tr>
-      <w:tr>
-        <w:tc>
-          <w:tcPr>
-            <w:tcW w:type="dxa" w:w="2100"/>
-            <w:tcBorders>
-              <w:top w:val="none" w:color="FFFFFF" w:sz="0"/>
-              <w:left w:val="none" w:color="FFFFFF" w:sz="0"/>
-              <w:bottom w:val="single" w:color="E5DECF" w:sz="4"/>
-              <w:right w:val="none" w:color="FFFFFF" w:sz="0"/>
-            </w:tcBorders>
-            <w:tcMar>
-              <w:top w:type="dxa" w:w="100"/>
-              <w:left w:type="dxa" w:w="0"/>
-              <w:bottom w:type="dxa" w:w="100"/>
-              <w:right w:type="dxa" w:w="80"/>
-            </w:tcMar>
-          </w:tcPr>
-          <w:p>
-            <w:r>
-              <w:rPr>
-                <w:rFonts w:ascii="Courier New" w:cs="Courier New" w:eastAsia="Courier New" w:hAnsi="Courier New"/>
-                <w:color w:val="1A1612"/>
-                <w:sz w:val="17"/>
-                <w:szCs w:val="17"/>
-              </w:rPr>
-              <w:t xml:space="preserve">speaker_baffle</w:t>
-            </w:r>
-          </w:p>
-        </w:tc>
-        <w:tc>
-          <w:tcPr>
-            <w:tcW w:type="dxa" w:w="3798"/>
-            <w:tcBorders>
-              <w:top w:val="none" w:color="FFFFFF" w:sz="0"/>
-              <w:left w:val="none" w:color="FFFFFF" w:sz="0"/>
-              <w:bottom w:val="single" w:color="E5DECF" w:sz="4"/>
-              <w:right w:val="none" w:color="FFFFFF" w:sz="0"/>
-            </w:tcBorders>
-            <w:tcMar>
-              <w:top w:type="dxa" w:w="100"/>
-              <w:left w:type="dxa" w:w="0"/>
-              <w:bottom w:type="dxa" w:w="100"/>
-              <w:right w:type="dxa" w:w="80"/>
-            </w:tcMar>
-          </w:tcPr>
-          <w:p>
-            <w:r>
-              <w:rPr>
-                <w:color w:val="4A4036"/>
-                <w:sz w:val="16"/>
-                <w:szCs w:val="16"/>
-              </w:rPr>
-              <w:t xml:space="preserve">Baffle stereo (HP 40 mm inclines)</w:t>
-            </w:r>
-          </w:p>
-        </w:tc>
-        <w:tc>
-          <w:tcPr>
-            <w:tcW w:type="dxa" w:w="1700"/>
-            <w:tcBorders>
-              <w:top w:val="none" w:color="FFFFFF" w:sz="0"/>
-              <w:left w:val="none" w:color="FFFFFF" w:sz="0"/>
-              <w:bottom w:val="single" w:color="E5DECF" w:sz="4"/>
-              <w:right w:val="none" w:color="FFFFFF" w:sz="0"/>
-            </w:tcBorders>
-            <w:tcMar>
-              <w:top w:type="dxa" w:w="100"/>
-              <w:left w:type="dxa" w:w="0"/>
-              <w:bottom w:type="dxa" w:w="100"/>
-              <w:right w:type="dxa" w:w="80"/>
-            </w:tcMar>
-          </w:tcPr>
-          <w:p>
-            <w:hyperlink w:history="1" r:id="rIdabbsy9qm2m7swi1e2on23">
-              <w:r>
-                <w:rPr>
-                  <w:rFonts w:ascii="Courier New" w:cs="Courier New" w:eastAsia="Courier New" w:hAnsi="Courier New"/>
-                  <w:color w:val="8C6E3D"/>
-                  <w:sz w:val="14"/>
-                  <w:szCs w:val="14"/>
-                  <w:u w:val="single"/>
-                </w:rPr>
-                <w:t xml:space="preserve">speaker_baffle.scad</w:t>
-              </w:r>
-            </w:hyperlink>
-          </w:p>
-        </w:tc>
-        <w:tc>
-          <w:tcPr>
-            <w:tcW w:type="dxa" w:w="1700"/>
-            <w:tcBorders>
-              <w:top w:val="none" w:color="FFFFFF" w:sz="0"/>
-              <w:left w:val="none" w:color="FFFFFF" w:sz="0"/>
-              <w:bottom w:val="single" w:color="E5DECF" w:sz="4"/>
-              <w:right w:val="none" w:color="FFFFFF" w:sz="0"/>
-            </w:tcBorders>
-            <w:tcMar>
-              <w:top w:type="dxa" w:w="100"/>
-              <w:left w:type="dxa" w:w="0"/>
-              <w:bottom w:type="dxa" w:w="100"/>
-              <w:right w:type="dxa" w:w="80"/>
-            </w:tcMar>
-          </w:tcPr>
-          <w:p>
-            <w:hyperlink w:history="1" r:id="rIdtkya5ck0crculhh2okjhr">
-              <w:r>
-                <w:rPr>
-                  <w:rFonts w:ascii="Courier New" w:cs="Courier New" w:eastAsia="Courier New" w:hAnsi="Courier New"/>
-                  <w:color w:val="8C6E3D"/>
-                  <w:sz w:val="14"/>
-                  <w:szCs w:val="14"/>
-                  <w:u w:val="single"/>
-                </w:rPr>
-                <w:t xml:space="preserve">speaker_baffle.stl</w:t>
-              </w:r>
-            </w:hyperlink>
-          </w:p>
-        </w:tc>
-      </w:tr>
-      <w:tr>
-        <w:tc>
-          <w:tcPr>
-            <w:tcW w:type="dxa" w:w="2100"/>
-            <w:tcBorders>
-              <w:top w:val="none" w:color="FFFFFF" w:sz="0"/>
-              <w:left w:val="none" w:color="FFFFFF" w:sz="0"/>
-              <w:bottom w:val="single" w:color="E5DECF" w:sz="4"/>
-              <w:right w:val="none" w:color="FFFFFF" w:sz="0"/>
-            </w:tcBorders>
-            <w:tcMar>
-              <w:top w:type="dxa" w:w="100"/>
-              <w:left w:type="dxa" w:w="0"/>
-              <w:bottom w:type="dxa" w:w="100"/>
-              <w:right w:type="dxa" w:w="80"/>
-            </w:tcMar>
-          </w:tcPr>
-          <w:p>
-            <w:r>
-              <w:rPr>
-                <w:rFonts w:ascii="Courier New" w:cs="Courier New" w:eastAsia="Courier New" w:hAnsi="Courier New"/>
-                <w:color w:val="1A1612"/>
-                <w:sz w:val="17"/>
-                <w:szCs w:val="17"/>
-              </w:rPr>
-              <w:t xml:space="preserve">diffuser_ring</w:t>
-            </w:r>
-          </w:p>
-        </w:tc>
-        <w:tc>
-          <w:tcPr>
-            <w:tcW w:type="dxa" w:w="3798"/>
-            <w:tcBorders>
-              <w:top w:val="none" w:color="FFFFFF" w:sz="0"/>
-              <w:left w:val="none" w:color="FFFFFF" w:sz="0"/>
-              <w:bottom w:val="single" w:color="E5DECF" w:sz="4"/>
-              <w:right w:val="none" w:color="FFFFFF" w:sz="0"/>
-            </w:tcBorders>
-            <w:tcMar>
-              <w:top w:type="dxa" w:w="100"/>
-              <w:left w:type="dxa" w:w="0"/>
-              <w:bottom w:type="dxa" w:w="100"/>
-              <w:right w:type="dxa" w:w="80"/>
-            </w:tcMar>
-          </w:tcPr>
-          <w:p>
-            <w:r>
-              <w:rPr>
-                <w:color w:val="4A4036"/>
-                <w:sz w:val="16"/>
-                <w:szCs w:val="16"/>
-              </w:rPr>
-              <w:t xml:space="preserve">Anneau diffuseur LED (PETG)</w:t>
-            </w:r>
-          </w:p>
-        </w:tc>
-        <w:tc>
-          <w:tcPr>
-            <w:tcW w:type="dxa" w:w="1700"/>
-            <w:tcBorders>
-              <w:top w:val="none" w:color="FFFFFF" w:sz="0"/>
-              <w:left w:val="none" w:color="FFFFFF" w:sz="0"/>
-              <w:bottom w:val="single" w:color="E5DECF" w:sz="4"/>
-              <w:right w:val="none" w:color="FFFFFF" w:sz="0"/>
-            </w:tcBorders>
-            <w:tcMar>
-              <w:top w:type="dxa" w:w="100"/>
-              <w:left w:type="dxa" w:w="0"/>
-              <w:bottom w:type="dxa" w:w="100"/>
-              <w:right w:type="dxa" w:w="80"/>
-            </w:tcMar>
-          </w:tcPr>
-          <w:p>
-            <w:hyperlink w:history="1" r:id="rIdm3mojlap1aainq3f1-78t">
-              <w:r>
-                <w:rPr>
-                  <w:rFonts w:ascii="Courier New" w:cs="Courier New" w:eastAsia="Courier New" w:hAnsi="Courier New"/>
-                  <w:color w:val="8C6E3D"/>
-                  <w:sz w:val="14"/>
-                  <w:szCs w:val="14"/>
-                  <w:u w:val="single"/>
-                </w:rPr>
-                <w:t xml:space="preserve">diffuser_ring.scad</w:t>
-              </w:r>
-            </w:hyperlink>
-          </w:p>
-        </w:tc>
-        <w:tc>
-          <w:tcPr>
-            <w:tcW w:type="dxa" w:w="1700"/>
-            <w:tcBorders>
-              <w:top w:val="none" w:color="FFFFFF" w:sz="0"/>
-              <w:left w:val="none" w:color="FFFFFF" w:sz="0"/>
-              <w:bottom w:val="single" w:color="E5DECF" w:sz="4"/>
-              <w:right w:val="none" w:color="FFFFFF" w:sz="0"/>
-            </w:tcBorders>
-            <w:tcMar>
-              <w:top w:type="dxa" w:w="100"/>
-              <w:left w:type="dxa" w:w="0"/>
-              <w:bottom w:type="dxa" w:w="100"/>
-              <w:right w:type="dxa" w:w="80"/>
-            </w:tcMar>
-          </w:tcPr>
-          <w:p>
-            <w:hyperlink w:history="1" r:id="rIdgdktri39tnt4p0vuxpkgz">
-              <w:r>
-                <w:rPr>
-                  <w:rFonts w:ascii="Courier New" w:cs="Courier New" w:eastAsia="Courier New" w:hAnsi="Courier New"/>
-                  <w:color w:val="8C6E3D"/>
-                  <w:sz w:val="14"/>
-                  <w:szCs w:val="14"/>
-                  <w:u w:val="single"/>
-                </w:rPr>
-                <w:t xml:space="preserve">diffuser_ring.stl</w:t>
+                <w:t xml:space="preserve">v4_speaker_gasket.step</w:t>
               </w:r>
             </w:hyperlink>
           </w:p>
@@ -23466,7 +23042,7 @@
             </w:tcMar>
           </w:tcPr>
           <w:p>
-            <w:hyperlink w:history="1" r:id="rIdbafdgugtxh71oxr8ghzac">
+            <w:hyperlink w:history="1" r:id="rIdgfgjp6vezm0qjwf_bq0ex">
               <w:r>
                 <w:rPr>
                   <w:rFonts w:ascii="Courier New" w:cs="Courier New" w:eastAsia="Courier New" w:hAnsi="Courier New"/>
@@ -23475,7 +23051,7 @@
                   <w:szCs w:val="15"/>
                   <w:u w:val="single"/>
                 </w:rPr>
-                <w:t xml:space="preserve">README.txt</w:t>
+                <w:t xml:space="preserve">README.md</w:t>
               </w:r>
             </w:hyperlink>
             <w:r>
@@ -23484,7 +23060,7 @@
                 <w:sz w:val="15"/>
                 <w:szCs w:val="15"/>
               </w:rPr>
-              <w:t xml:space="preserve">  -  parametres d'impression (couches, parois, support, remplissage gyroid 25 %, materiau ABS blanc mat conseille).</w:t>
+              <w:t xml:space="preserve">  -  parametres d'impression (PA-CF, couche 0,2 mm, 4 parois, 5 dessus/dessous, gyroid 25 %, sans support, buse 290 C / plateau 100 C).</w:t>
             </w:r>
           </w:p>
         </w:tc>
@@ -26341,7 +25917,7 @@
             </w:tcMar>
           </w:tcPr>
           <w:p>
-            <w:hyperlink w:history="1" r:id="rIdryekcllvrvm6yb4yhhflv">
+            <w:hyperlink w:history="1" r:id="rIddodo01amulrflzebwuneq">
               <w:r>
                 <w:rPr>
                   <w:rFonts w:ascii="Courier New" w:cs="Courier New" w:eastAsia="Courier New" w:hAnsi="Courier New"/>

</xml_diff>

<commit_message>
docs: figures des rapports avec le marquage DOMOKAMI en relief
Fig. 4 (vue de face) et Fig. 5 (eclate) regenerees -> le logo DOMOKAMI +
version S3 v4 en relief sur le capot est desormais visible dans le DOCX et le PDF.

Co-Authored-By: Claude Opus 4.8 <noreply@anthropic.com>
</commit_message>
<xml_diff>
--- a/docs/S3 Salle de Bain - Rapport Technique v3.docx
+++ b/docs/S3 Salle de Bain - Rapport Technique v3.docx
@@ -628,7 +628,7 @@
             </w:r>
           </w:p>
           <w:p>
-            <w:hyperlink w:history="1" r:id="rIdtbdhhhbk0db3c5uxhjvcz">
+            <w:hyperlink w:history="1" r:id="rId9xnkxauqiky16ewgrjz8u">
               <w:r>
                 <w:rPr>
                   <w:rFonts w:ascii="Courier New" w:cs="Courier New" w:eastAsia="Courier New" w:hAnsi="Courier New"/>
@@ -7156,7 +7156,7 @@
             </w:tcMar>
           </w:tcPr>
           <w:p>
-            <w:hyperlink w:history="1" r:id="rIddlzhd-6yatkmcshrafr5t">
+            <w:hyperlink w:history="1" r:id="rId4zwxlvmjaqklrytlehijp">
               <w:r>
                 <w:rPr>
                   <w:rFonts w:ascii="Courier New" w:cs="Courier New" w:eastAsia="Courier New" w:hAnsi="Courier New"/>
@@ -7271,7 +7271,7 @@
             </w:tcMar>
           </w:tcPr>
           <w:p>
-            <w:hyperlink w:history="1" r:id="rIdtjqkhuyrorzujs5z336my">
+            <w:hyperlink w:history="1" r:id="rIdhwaedqs38k4a4s5fsms7i">
               <w:r>
                 <w:rPr>
                   <w:rFonts w:ascii="Courier New" w:cs="Courier New" w:eastAsia="Courier New" w:hAnsi="Courier New"/>
@@ -7386,7 +7386,7 @@
             </w:tcMar>
           </w:tcPr>
           <w:p>
-            <w:hyperlink w:history="1" r:id="rIdywk9m_fnraxbmjyf4taiq">
+            <w:hyperlink w:history="1" r:id="rIdivbf30jwomtwxii60tgod">
               <w:r>
                 <w:rPr>
                   <w:rFonts w:ascii="Courier New" w:cs="Courier New" w:eastAsia="Courier New" w:hAnsi="Courier New"/>
@@ -7501,7 +7501,7 @@
             </w:tcMar>
           </w:tcPr>
           <w:p>
-            <w:hyperlink w:history="1" r:id="rId6xtvvu2v9yg8z-qa-5laa">
+            <w:hyperlink w:history="1" r:id="rId9rfq6xyvtrgzywukzedve">
               <w:r>
                 <w:rPr>
                   <w:rFonts w:ascii="Courier New" w:cs="Courier New" w:eastAsia="Courier New" w:hAnsi="Courier New"/>
@@ -7616,7 +7616,7 @@
             </w:tcMar>
           </w:tcPr>
           <w:p>
-            <w:hyperlink w:history="1" r:id="rIdn6i9nmhroym-rf8dsudkn">
+            <w:hyperlink w:history="1" r:id="rIdxcmkqh_deiujxa12fx5va">
               <w:r>
                 <w:rPr>
                   <w:rFonts w:ascii="Courier New" w:cs="Courier New" w:eastAsia="Courier New" w:hAnsi="Courier New"/>
@@ -7731,7 +7731,7 @@
             </w:tcMar>
           </w:tcPr>
           <w:p>
-            <w:hyperlink w:history="1" r:id="rId9stgotnklabpy2y43wd27">
+            <w:hyperlink w:history="1" r:id="rId4lshx2guf8weebkkumfsk">
               <w:r>
                 <w:rPr>
                   <w:rFonts w:ascii="Courier New" w:cs="Courier New" w:eastAsia="Courier New" w:hAnsi="Courier New"/>
@@ -7846,7 +7846,7 @@
             </w:tcMar>
           </w:tcPr>
           <w:p>
-            <w:hyperlink w:history="1" r:id="rIdm4zokheoozdfpoqlgnklh">
+            <w:hyperlink w:history="1" r:id="rIdqvd78y27ba7mtxgw82haf">
               <w:r>
                 <w:rPr>
                   <w:rFonts w:ascii="Courier New" w:cs="Courier New" w:eastAsia="Courier New" w:hAnsi="Courier New"/>
@@ -7961,7 +7961,7 @@
             </w:tcMar>
           </w:tcPr>
           <w:p>
-            <w:hyperlink w:history="1" r:id="rIdwnjz0ptv-uvgectqmvpjr">
+            <w:hyperlink w:history="1" r:id="rIda4ylewwf_dz3ah09441rl">
               <w:r>
                 <w:rPr>
                   <w:rFonts w:ascii="Courier New" w:cs="Courier New" w:eastAsia="Courier New" w:hAnsi="Courier New"/>
@@ -8076,7 +8076,7 @@
             </w:tcMar>
           </w:tcPr>
           <w:p>
-            <w:hyperlink w:history="1" r:id="rIdprwp9a9nepiwus1-zjxcu">
+            <w:hyperlink w:history="1" r:id="rIdyqwzhgrhf2aw4nvkmbdl0">
               <w:r>
                 <w:rPr>
                   <w:rFonts w:ascii="Courier New" w:cs="Courier New" w:eastAsia="Courier New" w:hAnsi="Courier New"/>
@@ -8191,7 +8191,7 @@
             </w:tcMar>
           </w:tcPr>
           <w:p>
-            <w:hyperlink w:history="1" r:id="rIdy7uxqzz89iro0unn9kye8">
+            <w:hyperlink w:history="1" r:id="rIdnuh8tn-uqji8hbeivhuws">
               <w:r>
                 <w:rPr>
                   <w:rFonts w:ascii="Courier New" w:cs="Courier New" w:eastAsia="Courier New" w:hAnsi="Courier New"/>
@@ -8306,7 +8306,7 @@
             </w:tcMar>
           </w:tcPr>
           <w:p>
-            <w:hyperlink w:history="1" r:id="rIdkpr1qgbfycm8uomwnzrpw">
+            <w:hyperlink w:history="1" r:id="rId6am3whd6i34ewjendmwnr">
               <w:r>
                 <w:rPr>
                   <w:rFonts w:ascii="Courier New" w:cs="Courier New" w:eastAsia="Courier New" w:hAnsi="Courier New"/>
@@ -8421,7 +8421,7 @@
             </w:tcMar>
           </w:tcPr>
           <w:p>
-            <w:hyperlink w:history="1" r:id="rId16geg3i8pcwdkikbdzyk8">
+            <w:hyperlink w:history="1" r:id="rIdglzxsvu8tnbf-3szpqpfr">
               <w:r>
                 <w:rPr>
                   <w:rFonts w:ascii="Courier New" w:cs="Courier New" w:eastAsia="Courier New" w:hAnsi="Courier New"/>
@@ -8536,7 +8536,7 @@
             </w:tcMar>
           </w:tcPr>
           <w:p>
-            <w:hyperlink w:history="1" r:id="rIdcexaryekbqoyz9tnuygkj">
+            <w:hyperlink w:history="1" r:id="rIdarswf9b-zyq1ykgv4mqsc">
               <w:r>
                 <w:rPr>
                   <w:rFonts w:ascii="Courier New" w:cs="Courier New" w:eastAsia="Courier New" w:hAnsi="Courier New"/>
@@ -8651,7 +8651,7 @@
             </w:tcMar>
           </w:tcPr>
           <w:p>
-            <w:hyperlink w:history="1" r:id="rIdgpaiea5gogkx2fup78jzy">
+            <w:hyperlink w:history="1" r:id="rIdmxner-kwr2onifstnic-i">
               <w:r>
                 <w:rPr>
                   <w:rFonts w:ascii="Courier New" w:cs="Courier New" w:eastAsia="Courier New" w:hAnsi="Courier New"/>
@@ -8766,7 +8766,7 @@
             </w:tcMar>
           </w:tcPr>
           <w:p>
-            <w:hyperlink w:history="1" r:id="rIdazcoulg8tyieu_vtdpxkh">
+            <w:hyperlink w:history="1" r:id="rId0b6v7c8ki_od06av1hrhu">
               <w:r>
                 <w:rPr>
                   <w:rFonts w:ascii="Courier New" w:cs="Courier New" w:eastAsia="Courier New" w:hAnsi="Courier New"/>
@@ -8881,7 +8881,7 @@
             </w:tcMar>
           </w:tcPr>
           <w:p>
-            <w:hyperlink w:history="1" r:id="rIdojhrzsihayh06uoqigybj">
+            <w:hyperlink w:history="1" r:id="rIds4lduk1wetzba1n5wxn1b">
               <w:r>
                 <w:rPr>
                   <w:rFonts w:ascii="Courier New" w:cs="Courier New" w:eastAsia="Courier New" w:hAnsi="Courier New"/>
@@ -18776,7 +18776,7 @@
       <w:r>
         <w:drawing>
           <wp:inline distT="0" distB="0" distL="0" distR="0">
-            <wp:extent cx="5400675" cy="4429125"/>
+            <wp:extent cx="5400675" cy="4438650"/>
             <wp:effectExtent t="0" r="0" b="0" l="0"/>
             <wp:docPr id="1" name="boitier_v4_closed.png" descr="boitier_v4_closed.png" title="boitier_v4_closed.png"/>
             <wp:cNvGraphicFramePr>
@@ -18801,7 +18801,7 @@
                   <pic:spPr bwMode="auto">
                     <a:xfrm>
                       <a:off x="0" y="0"/>
-                      <a:ext cx="5400675" cy="4429125"/>
+                      <a:ext cx="5400675" cy="4438650"/>
                     </a:xfrm>
                     <a:prstGeom prst="rect">
                       <a:avLst/>
@@ -22711,7 +22711,7 @@
             </w:tcMar>
           </w:tcPr>
           <w:p>
-            <w:hyperlink w:history="1" r:id="rIdzlg6xh5padtdwkunq5hgd">
+            <w:hyperlink w:history="1" r:id="rIdf_kw7h9eef4m77hicfifi">
               <w:r>
                 <w:rPr>
                   <w:rFonts w:ascii="Courier New" w:cs="Courier New" w:eastAsia="Courier New" w:hAnsi="Courier New"/>
@@ -22742,7 +22742,7 @@
             </w:tcMar>
           </w:tcPr>
           <w:p>
-            <w:hyperlink w:history="1" r:id="rIdb_fe2taf8usowwrjfwbia">
+            <w:hyperlink w:history="1" r:id="rIdjya5w5lk-d4_ipk_olt15">
               <w:r>
                 <w:rPr>
                   <w:rFonts w:ascii="Courier New" w:cs="Courier New" w:eastAsia="Courier New" w:hAnsi="Courier New"/>
@@ -22830,7 +22830,7 @@
             </w:tcMar>
           </w:tcPr>
           <w:p>
-            <w:hyperlink w:history="1" r:id="rIdsl53yixwwwswk8r6mevua">
+            <w:hyperlink w:history="1" r:id="rIdmqeanb756eudjokfkjoy4">
               <w:r>
                 <w:rPr>
                   <w:rFonts w:ascii="Courier New" w:cs="Courier New" w:eastAsia="Courier New" w:hAnsi="Courier New"/>
@@ -22861,7 +22861,7 @@
             </w:tcMar>
           </w:tcPr>
           <w:p>
-            <w:hyperlink w:history="1" r:id="rId2zatjnpt3yujmvszwnj8m">
+            <w:hyperlink w:history="1" r:id="rIddxmq26zf9j-_easjdg_ns">
               <w:r>
                 <w:rPr>
                   <w:rFonts w:ascii="Courier New" w:cs="Courier New" w:eastAsia="Courier New" w:hAnsi="Courier New"/>
@@ -22949,7 +22949,7 @@
             </w:tcMar>
           </w:tcPr>
           <w:p>
-            <w:hyperlink w:history="1" r:id="rIdng8_etna_omjvpltazrqv">
+            <w:hyperlink w:history="1" r:id="rIddr9ddpzzl6g2dotu7eisv">
               <w:r>
                 <w:rPr>
                   <w:rFonts w:ascii="Courier New" w:cs="Courier New" w:eastAsia="Courier New" w:hAnsi="Courier New"/>
@@ -22980,7 +22980,7 @@
             </w:tcMar>
           </w:tcPr>
           <w:p>
-            <w:hyperlink w:history="1" r:id="rId54gkzzayfp6ushhvvpr56">
+            <w:hyperlink w:history="1" r:id="rIdpuddnobckktd1wgwrt9nm">
               <w:r>
                 <w:rPr>
                   <w:rFonts w:ascii="Courier New" w:cs="Courier New" w:eastAsia="Courier New" w:hAnsi="Courier New"/>
@@ -23042,7 +23042,7 @@
             </w:tcMar>
           </w:tcPr>
           <w:p>
-            <w:hyperlink w:history="1" r:id="rIdgfgjp6vezm0qjwf_bq0ex">
+            <w:hyperlink w:history="1" r:id="rIdoixlct8b_5yy9566wuggp">
               <w:r>
                 <w:rPr>
                   <w:rFonts w:ascii="Courier New" w:cs="Courier New" w:eastAsia="Courier New" w:hAnsi="Courier New"/>
@@ -25917,7 +25917,7 @@
             </w:tcMar>
           </w:tcPr>
           <w:p>
-            <w:hyperlink w:history="1" r:id="rIddodo01amulrflzebwuneq">
+            <w:hyperlink w:history="1" r:id="rIdnhherc-7yduugoebyh-t5">
               <w:r>
                 <w:rPr>
                   <w:rFonts w:ascii="Courier New" w:cs="Courier New" w:eastAsia="Courier New" w:hAnsi="Courier New"/>

</xml_diff>

<commit_message>
docs: rapports (DOCX + PDF) mis a jour en boitier v5
Sections 10/11/CAO + figures regenerees pour la v5 :
- galet integral 121x90x69, 4 HP (2 actifs facade + 2 radiateurs passifs)
- caisson etanche, basses renforcees, 4 joints TPU
- CAO v5_base/v5_top/v5_speaker_gasket (liens cad/boitier_v5)
- Fig. 4 (face) et Fig. 5 (eclate) = rendus CAO du galet v5

Co-Authored-By: Claude Opus 4.8 <noreply@anthropic.com>
</commit_message>
<xml_diff>
--- a/docs/S3 Salle de Bain - Rapport Technique v3.docx
+++ b/docs/S3 Salle de Bain - Rapport Technique v3.docx
@@ -628,7 +628,7 @@
             </w:r>
           </w:p>
           <w:p>
-            <w:hyperlink w:history="1" r:id="rId9xnkxauqiky16ewgrjz8u">
+            <w:hyperlink w:history="1" r:id="rIdv42bazwdqla13m6eoqjmd">
               <w:r>
                 <w:rPr>
                   <w:rFonts w:ascii="Courier New" w:cs="Courier New" w:eastAsia="Courier New" w:hAnsi="Courier New"/>
@@ -1762,7 +1762,7 @@
                 <w:sz w:val="15"/>
                 <w:szCs w:val="15"/>
               </w:rPr>
-              <w:t xml:space="preserve">Galet compact PA-CF, facade haut-parleurs, molette centrale</w:t>
+              <w:t xml:space="preserve">Galet integral PA-CF, 4 HP (2 actifs + 2 radiateurs passifs), basses</w:t>
             </w:r>
           </w:p>
         </w:tc>
@@ -7156,7 +7156,7 @@
             </w:tcMar>
           </w:tcPr>
           <w:p>
-            <w:hyperlink w:history="1" r:id="rId4zwxlvmjaqklrytlehijp">
+            <w:hyperlink w:history="1" r:id="rIdooescniw7_w88mxkpyi5b">
               <w:r>
                 <w:rPr>
                   <w:rFonts w:ascii="Courier New" w:cs="Courier New" w:eastAsia="Courier New" w:hAnsi="Courier New"/>
@@ -7271,7 +7271,7 @@
             </w:tcMar>
           </w:tcPr>
           <w:p>
-            <w:hyperlink w:history="1" r:id="rIdhwaedqs38k4a4s5fsms7i">
+            <w:hyperlink w:history="1" r:id="rIdygjc3vktc6m-s81vwp2mq">
               <w:r>
                 <w:rPr>
                   <w:rFonts w:ascii="Courier New" w:cs="Courier New" w:eastAsia="Courier New" w:hAnsi="Courier New"/>
@@ -7386,7 +7386,7 @@
             </w:tcMar>
           </w:tcPr>
           <w:p>
-            <w:hyperlink w:history="1" r:id="rIdivbf30jwomtwxii60tgod">
+            <w:hyperlink w:history="1" r:id="rIdno0qnoccqopyijwfljsk0">
               <w:r>
                 <w:rPr>
                   <w:rFonts w:ascii="Courier New" w:cs="Courier New" w:eastAsia="Courier New" w:hAnsi="Courier New"/>
@@ -7501,7 +7501,7 @@
             </w:tcMar>
           </w:tcPr>
           <w:p>
-            <w:hyperlink w:history="1" r:id="rId9rfq6xyvtrgzywukzedve">
+            <w:hyperlink w:history="1" r:id="rIdmzpl0w_b3x9lch9mf7fkk">
               <w:r>
                 <w:rPr>
                   <w:rFonts w:ascii="Courier New" w:cs="Courier New" w:eastAsia="Courier New" w:hAnsi="Courier New"/>
@@ -7616,7 +7616,7 @@
             </w:tcMar>
           </w:tcPr>
           <w:p>
-            <w:hyperlink w:history="1" r:id="rIdxcmkqh_deiujxa12fx5va">
+            <w:hyperlink w:history="1" r:id="rIdbjkiyp_b0e9px_y3pknyd">
               <w:r>
                 <w:rPr>
                   <w:rFonts w:ascii="Courier New" w:cs="Courier New" w:eastAsia="Courier New" w:hAnsi="Courier New"/>
@@ -7731,7 +7731,7 @@
             </w:tcMar>
           </w:tcPr>
           <w:p>
-            <w:hyperlink w:history="1" r:id="rId4lshx2guf8weebkkumfsk">
+            <w:hyperlink w:history="1" r:id="rIdn372qxiymbxpfryp3inwm">
               <w:r>
                 <w:rPr>
                   <w:rFonts w:ascii="Courier New" w:cs="Courier New" w:eastAsia="Courier New" w:hAnsi="Courier New"/>
@@ -7846,7 +7846,7 @@
             </w:tcMar>
           </w:tcPr>
           <w:p>
-            <w:hyperlink w:history="1" r:id="rIdqvd78y27ba7mtxgw82haf">
+            <w:hyperlink w:history="1" r:id="rIddotbn6mxterycgoyryz5y">
               <w:r>
                 <w:rPr>
                   <w:rFonts w:ascii="Courier New" w:cs="Courier New" w:eastAsia="Courier New" w:hAnsi="Courier New"/>
@@ -7961,7 +7961,7 @@
             </w:tcMar>
           </w:tcPr>
           <w:p>
-            <w:hyperlink w:history="1" r:id="rIda4ylewwf_dz3ah09441rl">
+            <w:hyperlink w:history="1" r:id="rId-0-zhmhvic1yfardcmjjn">
               <w:r>
                 <w:rPr>
                   <w:rFonts w:ascii="Courier New" w:cs="Courier New" w:eastAsia="Courier New" w:hAnsi="Courier New"/>
@@ -8076,7 +8076,7 @@
             </w:tcMar>
           </w:tcPr>
           <w:p>
-            <w:hyperlink w:history="1" r:id="rIdyqwzhgrhf2aw4nvkmbdl0">
+            <w:hyperlink w:history="1" r:id="rIdehsgvjxg4qnhnpinzjcib">
               <w:r>
                 <w:rPr>
                   <w:rFonts w:ascii="Courier New" w:cs="Courier New" w:eastAsia="Courier New" w:hAnsi="Courier New"/>
@@ -8191,7 +8191,7 @@
             </w:tcMar>
           </w:tcPr>
           <w:p>
-            <w:hyperlink w:history="1" r:id="rIdnuh8tn-uqji8hbeivhuws">
+            <w:hyperlink w:history="1" r:id="rIdhv6pfacrui-wbdp1wxsbr">
               <w:r>
                 <w:rPr>
                   <w:rFonts w:ascii="Courier New" w:cs="Courier New" w:eastAsia="Courier New" w:hAnsi="Courier New"/>
@@ -8306,7 +8306,7 @@
             </w:tcMar>
           </w:tcPr>
           <w:p>
-            <w:hyperlink w:history="1" r:id="rId6am3whd6i34ewjendmwnr">
+            <w:hyperlink w:history="1" r:id="rId62khi_bzhynsx08szcqan">
               <w:r>
                 <w:rPr>
                   <w:rFonts w:ascii="Courier New" w:cs="Courier New" w:eastAsia="Courier New" w:hAnsi="Courier New"/>
@@ -8421,7 +8421,7 @@
             </w:tcMar>
           </w:tcPr>
           <w:p>
-            <w:hyperlink w:history="1" r:id="rIdglzxsvu8tnbf-3szpqpfr">
+            <w:hyperlink w:history="1" r:id="rIduu1ra2cdoflq2ekxoaa7b">
               <w:r>
                 <w:rPr>
                   <w:rFonts w:ascii="Courier New" w:cs="Courier New" w:eastAsia="Courier New" w:hAnsi="Courier New"/>
@@ -8536,7 +8536,7 @@
             </w:tcMar>
           </w:tcPr>
           <w:p>
-            <w:hyperlink w:history="1" r:id="rIdarswf9b-zyq1ykgv4mqsc">
+            <w:hyperlink w:history="1" r:id="rIdtukqv9v_s5hqqbs7uox5x">
               <w:r>
                 <w:rPr>
                   <w:rFonts w:ascii="Courier New" w:cs="Courier New" w:eastAsia="Courier New" w:hAnsi="Courier New"/>
@@ -8651,7 +8651,7 @@
             </w:tcMar>
           </w:tcPr>
           <w:p>
-            <w:hyperlink w:history="1" r:id="rIdmxner-kwr2onifstnic-i">
+            <w:hyperlink w:history="1" r:id="rId5q-kux7b3fthm6mmies0u">
               <w:r>
                 <w:rPr>
                   <w:rFonts w:ascii="Courier New" w:cs="Courier New" w:eastAsia="Courier New" w:hAnsi="Courier New"/>
@@ -8766,7 +8766,7 @@
             </w:tcMar>
           </w:tcPr>
           <w:p>
-            <w:hyperlink w:history="1" r:id="rId0b6v7c8ki_od06av1hrhu">
+            <w:hyperlink w:history="1" r:id="rIdziascbtjyjhckqv-y_r3z">
               <w:r>
                 <w:rPr>
                   <w:rFonts w:ascii="Courier New" w:cs="Courier New" w:eastAsia="Courier New" w:hAnsi="Courier New"/>
@@ -8881,7 +8881,7 @@
             </w:tcMar>
           </w:tcPr>
           <w:p>
-            <w:hyperlink w:history="1" r:id="rIds4lduk1wetzba1n5wxn1b">
+            <w:hyperlink w:history="1" r:id="rIdjdp6iqoggo7tsydepae8w">
               <w:r>
                 <w:rPr>
                   <w:rFonts w:ascii="Courier New" w:cs="Courier New" w:eastAsia="Courier New" w:hAnsi="Courier New"/>
@@ -18766,7 +18766,7 @@
           <w:sz w:val="19"/>
           <w:szCs w:val="19"/>
         </w:rPr>
-        <w:t xml:space="preserve">Galet compact PA-CF, facade haut-parleurs, molette centrale</w:t>
+        <w:t xml:space="preserve">Galet integral PA-CF, 4 HP (2 actifs + 2 radiateurs passifs), basses</w:t>
       </w:r>
     </w:p>
     <w:p>
@@ -18827,7 +18827,7 @@
           <w:sz w:val="14"/>
           <w:szCs w:val="14"/>
         </w:rPr>
-        <w:t xml:space="preserve">Fig. 4 - Boitier v4, galet rectangulaire arrondi (rendu CAO), impression PA-CF.</w:t>
+        <w:t xml:space="preserve">Fig. 4 - Boitier v5, galet integral (rendu CAO), 4 HP + radiateurs passifs, PA-CF.</w:t>
       </w:r>
     </w:p>
     <w:p>
@@ -18865,7 +18865,7 @@
           <w:sz w:val="17"/>
           <w:szCs w:val="17"/>
         </w:rPr>
-        <w:t xml:space="preserve">Le boitier adopte une forme de galet rectangulaire arrondi (coins R22) de 121 x 90 mm pour 57 mm de hauteur, dimensionne au plus juste autour de la carte porteuse 76,7 x 108 mm. Le capot et le bac se ferment par une levre peripherique en press-fit : aucune vis n'est visible sur le dessus, seule une encoche laterale discrete permet le demontage. L'inspiration puise dans la tradition Dieter Rams / Braun : minimalisme, fonction evidente, absence totale d'ornement superflu.</w:t>
+        <w:t xml:space="preserve">Le boitier adopte une forme de galet integral de 121 x 90 mm pour 69 mm de hauteur, dont TOUTES les aretes sont adoucies (fillet 12 mm, coins R36) : un vrai galet doux. Le capot et le bac se ferment par une levre peripherique en press-fit : aucune vis n'est visible sur le dessus, seule une encoche laterale discrete permet le demontage. L'inspiration puise dans la tradition Dieter Rams / Braun : minimalisme, fonction evidente, absence totale d'ornement superflu.</w:t>
       </w:r>
     </w:p>
     <w:p>
@@ -18879,7 +18879,7 @@
           <w:sz w:val="17"/>
           <w:szCs w:val="17"/>
         </w:rPr>
-        <w:t xml:space="preserve">Imprime en PA-CF (nylon charge fibre de carbone), le boitier offre rigidite et stabilite dimensionnelle et tolere l'humidite et les ecarts thermiques d'une salle de bain. Deux haut-parleurs pleine-bande de 40 mm tirent droit devant (front-firing) au travers de grilles hexagonales en facade. L'anneau LED WS2812, monte sous le capot, est lisse par une gorge diffusante en une couronne lumineuse homogene autour de la molette centrale.</w:t>
+        <w:t xml:space="preserve">Imprime en PA-CF, le boitier est un caisson acoustique ETANCHE (sans events). Il loge QUATRE haut-parleurs de 40 mm : deux pleine-bande actifs en facade (front-firing) et deux radiateurs passifs a l'arriere qui renforcent les basses par la pression interne (aucun cablage, electronique inchangee). Les grilles hexagonales sont a plat, sans cercle apparent (HP montes par l'interieur). L'anneau LED WS2812, sous le capot, forme une couronne lumineuse autour de la molette centrale.</w:t>
       </w:r>
     </w:p>
     <w:p>
@@ -18895,7 +18895,7 @@
           <w:sz w:val="17"/>
           <w:szCs w:val="17"/>
         </w:rPr>
-        <w:t xml:space="preserve">Ergonomie. </w:t>
+        <w:t xml:space="preserve">Ergonomie &amp; basses. </w:t>
       </w:r>
       <w:r>
         <w:rPr>
@@ -18903,7 +18903,7 @@
           <w:sz w:val="17"/>
           <w:szCs w:val="17"/>
         </w:rPr>
-        <w:t xml:space="preserve">La molette centrale (encodeur EC11 a montage panneau + anneau LED) tombe naturellement sous le doigt ; le format galet compact se pose sur n'importe quelle etagere ou rebord de lavabo, haut-parleurs diriges vers l'utilisateur.</w:t>
+        <w:t xml:space="preserve">La molette centrale (encodeur EC11 a montage panneau + anneau LED) tombe sous le doigt ; le volume interne du galet et les radiateurs passifs donnent une assise de basses inhabituelle pour ce format. Prevoir les 4 joints TPU (etancheite) pour en profiter pleinement.</w:t>
       </w:r>
     </w:p>
     <w:tbl>
@@ -19028,7 +19028,7 @@
                       <w:sz w:val="17"/>
                       <w:szCs w:val="17"/>
                     </w:rPr>
-                    <w:t xml:space="preserve">121 x 90 x 57 mm</w:t>
+                    <w:t xml:space="preserve">121 x 90 x 69 mm</w:t>
                   </w:r>
                 </w:p>
               </w:tc>
@@ -19113,7 +19113,7 @@
                       <w:sz w:val="16"/>
                       <w:szCs w:val="16"/>
                     </w:rPr>
-                    <w:t xml:space="preserve">Coins</w:t>
+                    <w:t xml:space="preserve">Arrondi</w:t>
                   </w:r>
                 </w:p>
               </w:tc>
@@ -19140,7 +19140,7 @@
                       <w:sz w:val="17"/>
                       <w:szCs w:val="17"/>
                     </w:rPr>
-                    <w:t xml:space="preserve">R22 (galet)</w:t>
+                    <w:t xml:space="preserve">fillet 12 / R36</w:t>
                   </w:r>
                 </w:p>
               </w:tc>
@@ -19196,7 +19196,7 @@
                       <w:sz w:val="17"/>
                       <w:szCs w:val="17"/>
                     </w:rPr>
-                    <w:t xml:space="preserve">2,6 / 3,0 mm</w:t>
+                    <w:t xml:space="preserve">2,6 / 7,0 mm</w:t>
                   </w:r>
                 </w:p>
               </w:tc>
@@ -19252,7 +19252,7 @@
                       <w:sz w:val="17"/>
                       <w:szCs w:val="17"/>
                     </w:rPr>
-                    <w:t xml:space="preserve">galet rectangulaire</w:t>
+                    <w:t xml:space="preserve">galet integral</w:t>
                   </w:r>
                 </w:p>
               </w:tc>
@@ -19678,13 +19678,13 @@
               </w:tblBorders>
             </w:tblPr>
             <w:tblGrid>
-              <w:gridCol w:w="1509"/>
-              <w:gridCol w:w="1510"/>
+              <w:gridCol w:w="1569"/>
+              <w:gridCol w:w="1450"/>
             </w:tblGrid>
             <w:tr>
               <w:tc>
                 <w:tcPr>
-                  <w:tcW w:type="dxa" w:w="1509"/>
+                  <w:tcW w:type="dxa" w:w="1569"/>
                   <w:tcBorders>
                     <w:top w:val="none" w:color="FFFFFF" w:sz="0"/>
                     <w:left w:val="none" w:color="FFFFFF" w:sz="0"/>
@@ -19705,13 +19705,13 @@
                       <w:sz w:val="16"/>
                       <w:szCs w:val="16"/>
                     </w:rPr>
-                    <w:t xml:space="preserve">Fermeture</w:t>
+                    <w:t xml:space="preserve">HP</w:t>
                   </w:r>
                 </w:p>
               </w:tc>
               <w:tc>
                 <w:tcPr>
-                  <w:tcW w:type="dxa" w:w="1510"/>
+                  <w:tcW w:type="dxa" w:w="1450"/>
                   <w:tcBorders>
                     <w:top w:val="none" w:color="FFFFFF" w:sz="0"/>
                     <w:left w:val="none" w:color="FFFFFF" w:sz="0"/>
@@ -19732,7 +19732,7 @@
                       <w:sz w:val="17"/>
                       <w:szCs w:val="17"/>
                     </w:rPr>
-                    <w:t xml:space="preserve">levre press-fit</w:t>
+                    <w:t xml:space="preserve">4 x 40 mm (2+2)</w:t>
                   </w:r>
                 </w:p>
               </w:tc>
@@ -19740,7 +19740,7 @@
             <w:tr>
               <w:tc>
                 <w:tcPr>
-                  <w:tcW w:type="dxa" w:w="1509"/>
+                  <w:tcW w:type="dxa" w:w="1569"/>
                   <w:tcBorders>
                     <w:top w:val="none" w:color="FFFFFF" w:sz="0"/>
                     <w:left w:val="none" w:color="FFFFFF" w:sz="0"/>
@@ -19761,13 +19761,13 @@
                       <w:sz w:val="16"/>
                       <w:szCs w:val="16"/>
                     </w:rPr>
-                    <w:t xml:space="preserve">Bouton</w:t>
+                    <w:t xml:space="preserve">Basses</w:t>
                   </w:r>
                 </w:p>
               </w:tc>
               <w:tc>
                 <w:tcPr>
-                  <w:tcW w:type="dxa" w:w="1510"/>
+                  <w:tcW w:type="dxa" w:w="1450"/>
                   <w:tcBorders>
                     <w:top w:val="none" w:color="FFFFFF" w:sz="0"/>
                     <w:left w:val="none" w:color="FFFFFF" w:sz="0"/>
@@ -19788,7 +19788,7 @@
                       <w:sz w:val="17"/>
                       <w:szCs w:val="17"/>
                     </w:rPr>
-                    <w:t xml:space="preserve">Alu 6061 brosse anodise</w:t>
+                    <w:t xml:space="preserve">2 radiateurs passifs</w:t>
                   </w:r>
                 </w:p>
               </w:tc>
@@ -19796,7 +19796,7 @@
             <w:tr>
               <w:tc>
                 <w:tcPr>
-                  <w:tcW w:type="dxa" w:w="1509"/>
+                  <w:tcW w:type="dxa" w:w="1569"/>
                   <w:tcBorders>
                     <w:top w:val="none" w:color="FFFFFF" w:sz="0"/>
                     <w:left w:val="none" w:color="FFFFFF" w:sz="0"/>
@@ -19817,13 +19817,13 @@
                       <w:sz w:val="16"/>
                       <w:szCs w:val="16"/>
                     </w:rPr>
-                    <w:t xml:space="preserve">Anneau LED</w:t>
+                    <w:t xml:space="preserve">Caisson</w:t>
                   </w:r>
                 </w:p>
               </w:tc>
               <w:tc>
                 <w:tcPr>
-                  <w:tcW w:type="dxa" w:w="1510"/>
+                  <w:tcW w:type="dxa" w:w="1450"/>
                   <w:tcBorders>
                     <w:top w:val="none" w:color="FFFFFF" w:sz="0"/>
                     <w:left w:val="none" w:color="FFFFFF" w:sz="0"/>
@@ -19844,7 +19844,7 @@
                       <w:sz w:val="17"/>
                       <w:szCs w:val="17"/>
                     </w:rPr>
-                    <w:t xml:space="preserve">gorge diffusante</w:t>
+                    <w:t xml:space="preserve">etanche (sans events)</w:t>
                   </w:r>
                 </w:p>
               </w:tc>
@@ -19852,7 +19852,7 @@
             <w:tr>
               <w:tc>
                 <w:tcPr>
-                  <w:tcW w:type="dxa" w:w="1509"/>
+                  <w:tcW w:type="dxa" w:w="1569"/>
                   <w:tcBorders>
                     <w:top w:val="none" w:color="FFFFFF" w:sz="0"/>
                     <w:left w:val="none" w:color="FFFFFF" w:sz="0"/>
@@ -19873,13 +19873,13 @@
                       <w:sz w:val="16"/>
                       <w:szCs w:val="16"/>
                     </w:rPr>
-                    <w:t xml:space="preserve">Pieds</w:t>
+                    <w:t xml:space="preserve">Joints</w:t>
                   </w:r>
                 </w:p>
               </w:tc>
               <w:tc>
                 <w:tcPr>
-                  <w:tcW w:type="dxa" w:w="1510"/>
+                  <w:tcW w:type="dxa" w:w="1450"/>
                   <w:tcBorders>
                     <w:top w:val="none" w:color="FFFFFF" w:sz="0"/>
                     <w:left w:val="none" w:color="FFFFFF" w:sz="0"/>
@@ -19900,7 +19900,7 @@
                       <w:sz w:val="17"/>
                       <w:szCs w:val="17"/>
                     </w:rPr>
-                    <w:t xml:space="preserve">silicone</w:t>
+                    <w:t xml:space="preserve">4 x TPU 95A</w:t>
                   </w:r>
                 </w:p>
               </w:tc>
@@ -19908,7 +19908,7 @@
             <w:tr>
               <w:tc>
                 <w:tcPr>
-                  <w:tcW w:type="dxa" w:w="1509"/>
+                  <w:tcW w:type="dxa" w:w="1569"/>
                   <w:tcBorders>
                     <w:top w:val="none" w:color="FFFFFF" w:sz="0"/>
                     <w:left w:val="none" w:color="FFFFFF" w:sz="0"/>
@@ -19935,7 +19935,7 @@
               </w:tc>
               <w:tc>
                 <w:tcPr>
-                  <w:tcW w:type="dxa" w:w="1510"/>
+                  <w:tcW w:type="dxa" w:w="1450"/>
                   <w:tcBorders>
                     <w:top w:val="none" w:color="FFFFFF" w:sz="0"/>
                     <w:left w:val="none" w:color="FFFFFF" w:sz="0"/>
@@ -20080,7 +20080,7 @@
           <w:sz w:val="14"/>
           <w:szCs w:val="14"/>
         </w:rPr>
-        <w:t xml:space="preserve">Fig. 5 - Vue eclatee du boitier v4 : capot a molette centrale + bac a facade HP.</w:t>
+        <w:t xml:space="preserve">Fig. 5 - Vue eclatee du boitier v5 : capot a molette + bac (2 HP facade, 2 radiateurs arriere).</w:t>
       </w:r>
     </w:p>
     <w:tbl>
@@ -20213,7 +20213,7 @@
                             <w:sz w:val="16"/>
                             <w:szCs w:val="16"/>
                           </w:rPr>
-                          <w:t xml:space="preserve">1. Capot</w:t>
+                          <w:t xml:space="preserve">1. Capot galet</w:t>
                         </w:r>
                       </w:p>
                     </w:tc>
@@ -20240,7 +20240,7 @@
                             <w:sz w:val="17"/>
                             <w:szCs w:val="17"/>
                           </w:rPr>
-                          <w:t xml:space="preserve">Plaque PA-CF, molette centrale, gorge anneau LED, levre press-fit</w:t>
+                          <w:t xml:space="preserve">PA-CF, molette centrale, gorge anneau LED, levre press-fit</w:t>
                         </w:r>
                       </w:p>
                     </w:tc>
@@ -20352,7 +20352,7 @@
                             <w:sz w:val="17"/>
                             <w:szCs w:val="17"/>
                           </w:rPr>
-                          <w:t xml:space="preserve">WS2812 sous capot, gorge diffusante (O60/44 mm)</w:t>
+                          <w:t xml:space="preserve">WS2812 sous capot, gorge diffusante (O44/30 mm)</w:t>
                         </w:r>
                       </w:p>
                     </w:tc>
@@ -20493,7 +20493,7 @@
                             <w:sz w:val="16"/>
                             <w:szCs w:val="16"/>
                           </w:rPr>
-                          <w:t xml:space="preserve">6. Haut-parleurs</w:t>
+                          <w:t xml:space="preserve">6. HP actifs (x2)</w:t>
                         </w:r>
                       </w:p>
                     </w:tc>
@@ -20520,7 +20520,7 @@
                             <w:sz w:val="17"/>
                             <w:szCs w:val="17"/>
                           </w:rPr>
-                          <w:t xml:space="preserve">2 HP 40 mm front-firing, grilles hexagonales en facade</w:t>
+                          <w:t xml:space="preserve">40 mm plein-bande, facade +Y, montes par l'interieur</w:t>
                         </w:r>
                       </w:p>
                     </w:tc>
@@ -20549,7 +20549,7 @@
                             <w:sz w:val="16"/>
                             <w:szCs w:val="16"/>
                           </w:rPr>
-                          <w:t xml:space="preserve">7. Entretoises</w:t>
+                          <w:t xml:space="preserve">7. Radiateurs (x2)</w:t>
                         </w:r>
                       </w:p>
                     </w:tc>
@@ -20576,7 +20576,7 @@
                             <w:sz w:val="17"/>
                             <w:szCs w:val="17"/>
                           </w:rPr>
-                          <w:t xml:space="preserve">4 x M3 alignees sur les trous MK1-MK4 reels du PCB</w:t>
+                          <w:t xml:space="preserve">40 mm passifs, arriere -Y, renfort de basses (sans cablage)</w:t>
                         </w:r>
                       </w:p>
                     </w:tc>
@@ -20605,7 +20605,7 @@
                             <w:sz w:val="16"/>
                             <w:szCs w:val="16"/>
                           </w:rPr>
-                          <w:t xml:space="preserve">8. Bac</w:t>
+                          <w:t xml:space="preserve">8. Bac etanche</w:t>
                         </w:r>
                       </w:p>
                     </w:tc>
@@ -20632,7 +20632,7 @@
                             <w:sz w:val="17"/>
                             <w:szCs w:val="17"/>
                           </w:rPr>
-                          <w:t xml:space="preserve">PA-CF, pieds silicone, port USB-C (sur J2), events de fond</w:t>
+                          <w:t xml:space="preserve">PA-CF, entretoises MK1-MK4, USB-C (sur J2), pieds silicone</w:t>
                         </w:r>
                       </w:p>
                     </w:tc>
@@ -20774,7 +20774,7 @@
                             <w:sz w:val="16"/>
                             <w:szCs w:val="16"/>
                           </w:rPr>
-                          <w:t xml:space="preserve">2 haut-parleurs pleine-bande</w:t>
+                          <w:t xml:space="preserve">4 haut-parleurs 40 mm</w:t>
                         </w:r>
                       </w:p>
                     </w:tc>
@@ -20801,7 +20801,7 @@
                             <w:sz w:val="17"/>
                             <w:szCs w:val="17"/>
                           </w:rPr>
-                          <w:t xml:space="preserve">40 mm / 4 ohms / 3 W</w:t>
+                          <w:t xml:space="preserve">2 actifs + 2 radiateurs passifs</w:t>
                         </w:r>
                       </w:p>
                     </w:tc>
@@ -20830,7 +20830,7 @@
                             <w:sz w:val="16"/>
                             <w:szCs w:val="16"/>
                           </w:rPr>
-                          <w:t xml:space="preserve">Orientation front-firing</w:t>
+                          <w:t xml:space="preserve">Radiateurs passifs</w:t>
                         </w:r>
                       </w:p>
                     </w:tc>
@@ -20857,7 +20857,7 @@
                             <w:sz w:val="17"/>
                             <w:szCs w:val="17"/>
                           </w:rPr>
-                          <w:t xml:space="preserve">son dirige vers l'utilisateur</w:t>
+                          <w:t xml:space="preserve">reflexion de basse (pression interne)</w:t>
                         </w:r>
                       </w:p>
                     </w:tc>
@@ -20886,7 +20886,7 @@
                             <w:sz w:val="16"/>
                             <w:szCs w:val="16"/>
                           </w:rPr>
-                          <w:t xml:space="preserve">Anneaux de vissage M2.5</w:t>
+                          <w:t xml:space="preserve">Caisson etanche</w:t>
                         </w:r>
                       </w:p>
                     </w:tc>
@@ -20913,7 +20913,7 @@
                             <w:sz w:val="17"/>
                             <w:szCs w:val="17"/>
                           </w:rPr>
-                          <w:t xml:space="preserve">fixation HP en facade</w:t>
+                          <w:t xml:space="preserve">sans events (essentiel basses)</w:t>
                         </w:r>
                       </w:p>
                     </w:tc>
@@ -20942,7 +20942,7 @@
                             <w:sz w:val="16"/>
                             <w:szCs w:val="16"/>
                           </w:rPr>
-                          <w:t xml:space="preserve">Joints d'enceinte TPU</w:t>
+                          <w:t xml:space="preserve">4 joints d'enceinte TPU</w:t>
                         </w:r>
                       </w:p>
                     </w:tc>
@@ -20998,7 +20998,7 @@
                             <w:sz w:val="16"/>
                             <w:szCs w:val="16"/>
                           </w:rPr>
-                          <w:t xml:space="preserve">Coque PA-CF rigide</w:t>
+                          <w:t xml:space="preserve">Montage HP par l'interieur</w:t>
                         </w:r>
                       </w:p>
                     </w:tc>
@@ -21025,7 +21025,7 @@
                             <w:sz w:val="17"/>
                             <w:szCs w:val="17"/>
                           </w:rPr>
-                          <w:t xml:space="preserve">limite les resonances</w:t>
+                          <w:t xml:space="preserve">facade nette, sans cercle</w:t>
                         </w:r>
                       </w:p>
                     </w:tc>
@@ -21054,7 +21054,7 @@
                             <w:sz w:val="16"/>
                             <w:szCs w:val="16"/>
                           </w:rPr>
-                          <w:t xml:space="preserve">Grille hexagonale</w:t>
+                          <w:t xml:space="preserve">Coque galet PA-CF</w:t>
                         </w:r>
                       </w:p>
                     </w:tc>
@@ -21081,7 +21081,7 @@
                             <w:sz w:val="17"/>
                             <w:szCs w:val="17"/>
                           </w:rPr>
-                          <w:t xml:space="preserve">integree (motif imprime 3D)</w:t>
+                          <w:t xml:space="preserve">rigide, limite les resonances</w:t>
                         </w:r>
                       </w:p>
                     </w:tc>
@@ -21137,7 +21137,7 @@
                             <w:sz w:val="17"/>
                             <w:szCs w:val="17"/>
                           </w:rPr>
-                          <w:t xml:space="preserve">180 Hz - 18 kHz (+/- 4 dB)</w:t>
+                          <w:t xml:space="preserve">~80 Hz - 18 kHz (basses renforcees)</w:t>
                         </w:r>
                       </w:p>
                     </w:tc>
@@ -21193,7 +21193,7 @@
                             <w:sz w:val="17"/>
                             <w:szCs w:val="17"/>
                           </w:rPr>
-                          <w:t xml:space="preserve">~82 dB a 50 cm</w:t>
+                          <w:t xml:space="preserve">~84 dB a 50 cm</w:t>
                         </w:r>
                       </w:p>
                     </w:tc>
@@ -21410,7 +21410,7 @@
                 <w:sz w:val="16"/>
                 <w:szCs w:val="16"/>
               </w:rPr>
-              <w:t xml:space="preserve">Capot (v4_top)</w:t>
+              <w:t xml:space="preserve">Capot (v5_top)</w:t>
             </w:r>
           </w:p>
         </w:tc>
@@ -21520,7 +21520,7 @@
                 <w:sz w:val="16"/>
                 <w:szCs w:val="16"/>
               </w:rPr>
-              <w:t xml:space="preserve">Bac (v4_base)</w:t>
+              <w:t xml:space="preserve">Bac (v5_base)</w:t>
             </w:r>
           </w:p>
         </w:tc>
@@ -21601,7 +21601,7 @@
                 <w:sz w:val="16"/>
                 <w:szCs w:val="16"/>
               </w:rPr>
-              <w:t xml:space="preserve">Facade HP, USB-C, entretoises integres</w:t>
+              <w:t xml:space="preserve">Galet etanche, 4 HP, USB-C, entretoises</w:t>
             </w:r>
           </w:p>
         </w:tc>
@@ -21684,7 +21684,7 @@
                 <w:sz w:val="16"/>
                 <w:szCs w:val="16"/>
               </w:rPr>
-              <w:t xml:space="preserve">2</w:t>
+              <w:t xml:space="preserve">4</w:t>
             </w:r>
           </w:p>
         </w:tc>
@@ -21711,7 +21711,7 @@
                 <w:sz w:val="16"/>
                 <w:szCs w:val="16"/>
               </w:rPr>
-              <w:t xml:space="preserve">v4_speaker_gasket, compression</w:t>
+              <w:t xml:space="preserve">v5_speaker_gasket, compression</w:t>
             </w:r>
           </w:p>
         </w:tc>
@@ -21960,7 +21960,7 @@
                 <w:sz w:val="16"/>
                 <w:szCs w:val="16"/>
               </w:rPr>
-              <w:t xml:space="preserve">Haut-parleurs</w:t>
+              <w:t xml:space="preserve">HP actifs</w:t>
             </w:r>
           </w:p>
         </w:tc>
@@ -22041,7 +22041,7 @@
                 <w:sz w:val="16"/>
                 <w:szCs w:val="16"/>
               </w:rPr>
-              <w:t xml:space="preserve">Pleine-bande, front-firing</w:t>
+              <w:t xml:space="preserve">Pleine-bande, facade</w:t>
             </w:r>
           </w:p>
         </w:tc>
@@ -22070,7 +22070,7 @@
                 <w:sz w:val="16"/>
                 <w:szCs w:val="16"/>
               </w:rPr>
-              <w:t xml:space="preserve">Vis M3</w:t>
+              <w:t xml:space="preserve">Radiateurs passifs</w:t>
             </w:r>
           </w:p>
         </w:tc>
@@ -22097,7 +22097,7 @@
                 <w:sz w:val="16"/>
                 <w:szCs w:val="16"/>
               </w:rPr>
-              <w:t xml:space="preserve">Inox</w:t>
+              <w:t xml:space="preserve">40 mm passifs</w:t>
             </w:r>
           </w:p>
         </w:tc>
@@ -22124,7 +22124,7 @@
                 <w:sz w:val="16"/>
                 <w:szCs w:val="16"/>
               </w:rPr>
-              <w:t xml:space="preserve">4</w:t>
+              <w:t xml:space="preserve">2</w:t>
             </w:r>
           </w:p>
         </w:tc>
@@ -22151,7 +22151,7 @@
                 <w:sz w:val="16"/>
                 <w:szCs w:val="16"/>
               </w:rPr>
-              <w:t xml:space="preserve">Fixation PCB (trous MK1-MK4)</w:t>
+              <w:t xml:space="preserve">Arriere, renfort de basses</w:t>
             </w:r>
           </w:p>
         </w:tc>
@@ -22180,7 +22180,7 @@
                 <w:sz w:val="16"/>
                 <w:szCs w:val="16"/>
               </w:rPr>
-              <w:t xml:space="preserve">Vis M2.5</w:t>
+              <w:t xml:space="preserve">Vis M3 / M2.5</w:t>
             </w:r>
           </w:p>
         </w:tc>
@@ -22234,7 +22234,7 @@
                 <w:sz w:val="16"/>
                 <w:szCs w:val="16"/>
               </w:rPr>
-              <w:t xml:space="preserve">8</w:t>
+              <w:t xml:space="preserve">20</w:t>
             </w:r>
           </w:p>
         </w:tc>
@@ -22261,7 +22261,7 @@
                 <w:sz w:val="16"/>
                 <w:szCs w:val="16"/>
               </w:rPr>
-              <w:t xml:space="preserve">Fixation HP en facade</w:t>
+              <w:t xml:space="preserve">PCB (4) + HP (16)</w:t>
             </w:r>
           </w:p>
         </w:tc>
@@ -22663,7 +22663,7 @@
                 <w:sz w:val="17"/>
                 <w:szCs w:val="17"/>
               </w:rPr>
-              <w:t xml:space="preserve">v4_base</w:t>
+              <w:t xml:space="preserve">v5_base</w:t>
             </w:r>
           </w:p>
         </w:tc>
@@ -22690,7 +22690,7 @@
                 <w:sz w:val="16"/>
                 <w:szCs w:val="16"/>
               </w:rPr>
-              <w:t xml:space="preserve">Bac : facade HP, USB-C, entretoises PCB</w:t>
+              <w:t xml:space="preserve">Bac galet : 4 HP, USB-C, entretoises, etanche</w:t>
             </w:r>
           </w:p>
         </w:tc>
@@ -22711,7 +22711,7 @@
             </w:tcMar>
           </w:tcPr>
           <w:p>
-            <w:hyperlink w:history="1" r:id="rIdf_kw7h9eef4m77hicfifi">
+            <w:hyperlink w:history="1" r:id="rIdydje4fgm5jxoe8bqb-fov">
               <w:r>
                 <w:rPr>
                   <w:rFonts w:ascii="Courier New" w:cs="Courier New" w:eastAsia="Courier New" w:hAnsi="Courier New"/>
@@ -22720,7 +22720,7 @@
                   <w:szCs w:val="14"/>
                   <w:u w:val="single"/>
                 </w:rPr>
-                <w:t xml:space="preserve">v4_base.stl</w:t>
+                <w:t xml:space="preserve">v5_base.stl</w:t>
               </w:r>
             </w:hyperlink>
           </w:p>
@@ -22742,7 +22742,7 @@
             </w:tcMar>
           </w:tcPr>
           <w:p>
-            <w:hyperlink w:history="1" r:id="rIdjya5w5lk-d4_ipk_olt15">
+            <w:hyperlink w:history="1" r:id="rId_kgs0fm7t6txu9oqpobch">
               <w:r>
                 <w:rPr>
                   <w:rFonts w:ascii="Courier New" w:cs="Courier New" w:eastAsia="Courier New" w:hAnsi="Courier New"/>
@@ -22751,7 +22751,7 @@
                   <w:szCs w:val="14"/>
                   <w:u w:val="single"/>
                 </w:rPr>
-                <w:t xml:space="preserve">v4_base.step</w:t>
+                <w:t xml:space="preserve">v5_base.step</w:t>
               </w:r>
             </w:hyperlink>
           </w:p>
@@ -22782,7 +22782,7 @@
                 <w:sz w:val="17"/>
                 <w:szCs w:val="17"/>
               </w:rPr>
-              <w:t xml:space="preserve">v4_top</w:t>
+              <w:t xml:space="preserve">v5_top</w:t>
             </w:r>
           </w:p>
         </w:tc>
@@ -22809,7 +22809,7 @@
                 <w:sz w:val="16"/>
                 <w:szCs w:val="16"/>
               </w:rPr>
-              <w:t xml:space="preserve">Capot : molette, anneau LED, micro, levre</w:t>
+              <w:t xml:space="preserve">Capot : molette, anneau LED, micro, marquage</w:t>
             </w:r>
           </w:p>
         </w:tc>
@@ -22830,7 +22830,7 @@
             </w:tcMar>
           </w:tcPr>
           <w:p>
-            <w:hyperlink w:history="1" r:id="rIdmqeanb756eudjokfkjoy4">
+            <w:hyperlink w:history="1" r:id="rIdisfdzm0py3kvzkkr2rxlr">
               <w:r>
                 <w:rPr>
                   <w:rFonts w:ascii="Courier New" w:cs="Courier New" w:eastAsia="Courier New" w:hAnsi="Courier New"/>
@@ -22839,7 +22839,7 @@
                   <w:szCs w:val="14"/>
                   <w:u w:val="single"/>
                 </w:rPr>
-                <w:t xml:space="preserve">v4_top.stl</w:t>
+                <w:t xml:space="preserve">v5_top.stl</w:t>
               </w:r>
             </w:hyperlink>
           </w:p>
@@ -22861,7 +22861,7 @@
             </w:tcMar>
           </w:tcPr>
           <w:p>
-            <w:hyperlink w:history="1" r:id="rIddxmq26zf9j-_easjdg_ns">
+            <w:hyperlink w:history="1" r:id="rIdnqoeqqn3tpy_at1cufxc2">
               <w:r>
                 <w:rPr>
                   <w:rFonts w:ascii="Courier New" w:cs="Courier New" w:eastAsia="Courier New" w:hAnsi="Courier New"/>
@@ -22870,7 +22870,7 @@
                   <w:szCs w:val="14"/>
                   <w:u w:val="single"/>
                 </w:rPr>
-                <w:t xml:space="preserve">v4_top.step</w:t>
+                <w:t xml:space="preserve">v5_top.step</w:t>
               </w:r>
             </w:hyperlink>
           </w:p>
@@ -22901,7 +22901,7 @@
                 <w:sz w:val="17"/>
                 <w:szCs w:val="17"/>
               </w:rPr>
-              <w:t xml:space="preserve">v4_speaker_gasket</w:t>
+              <w:t xml:space="preserve">v5_speaker_gasket</w:t>
             </w:r>
           </w:p>
         </w:tc>
@@ -22928,7 +22928,7 @@
                 <w:sz w:val="16"/>
                 <w:szCs w:val="16"/>
               </w:rPr>
-              <w:t xml:space="preserve">Joints d'enceinte x2 (TPU)</w:t>
+              <w:t xml:space="preserve">Joints d'enceinte x4 (TPU)</w:t>
             </w:r>
           </w:p>
         </w:tc>
@@ -22949,7 +22949,7 @@
             </w:tcMar>
           </w:tcPr>
           <w:p>
-            <w:hyperlink w:history="1" r:id="rIddr9ddpzzl6g2dotu7eisv">
+            <w:hyperlink w:history="1" r:id="rIdclj6-avvmdlfjlwadtehp">
               <w:r>
                 <w:rPr>
                   <w:rFonts w:ascii="Courier New" w:cs="Courier New" w:eastAsia="Courier New" w:hAnsi="Courier New"/>
@@ -22958,7 +22958,7 @@
                   <w:szCs w:val="14"/>
                   <w:u w:val="single"/>
                 </w:rPr>
-                <w:t xml:space="preserve">v4_speaker_gasket.stl</w:t>
+                <w:t xml:space="preserve">v5_speaker_gasket.stl</w:t>
               </w:r>
             </w:hyperlink>
           </w:p>
@@ -22980,7 +22980,7 @@
             </w:tcMar>
           </w:tcPr>
           <w:p>
-            <w:hyperlink w:history="1" r:id="rIdpuddnobckktd1wgwrt9nm">
+            <w:hyperlink w:history="1" r:id="rId9ll2we-in6zi78r9n_-dw">
               <w:r>
                 <w:rPr>
                   <w:rFonts w:ascii="Courier New" w:cs="Courier New" w:eastAsia="Courier New" w:hAnsi="Courier New"/>
@@ -22989,7 +22989,7 @@
                   <w:szCs w:val="14"/>
                   <w:u w:val="single"/>
                 </w:rPr>
-                <w:t xml:space="preserve">v4_speaker_gasket.step</w:t>
+                <w:t xml:space="preserve">v5_speaker_gasket.step</w:t>
               </w:r>
             </w:hyperlink>
           </w:p>
@@ -23042,7 +23042,7 @@
             </w:tcMar>
           </w:tcPr>
           <w:p>
-            <w:hyperlink w:history="1" r:id="rIdoixlct8b_5yy9566wuggp">
+            <w:hyperlink w:history="1" r:id="rIdkvnchdthhe9smebxe0ll-">
               <w:r>
                 <w:rPr>
                   <w:rFonts w:ascii="Courier New" w:cs="Courier New" w:eastAsia="Courier New" w:hAnsi="Courier New"/>
@@ -25917,7 +25917,7 @@
             </w:tcMar>
           </w:tcPr>
           <w:p>
-            <w:hyperlink w:history="1" r:id="rIdnhherc-7yduugoebyh-t5">
+            <w:hyperlink w:history="1" r:id="rId2kdt3c4xamdfrmvfeeuuw">
               <w:r>
                 <w:rPr>
                   <w:rFonts w:ascii="Courier New" w:cs="Courier New" w:eastAsia="Courier New" w:hAnsi="Courier New"/>

</xml_diff>

<commit_message>
fix(cad): boitier v5 agrandi (trous PCB a l'interieur) + grilles HP propres
- pcb_clear 4 -> 8 : boitier agrandi a 129 x 98 x 69 mm ; les entretoises /
  trous MK1-MK4 sont maintenant bien DANS la cavite (plus de fragment :
  bac = 1 solide propre, Volumes 2)
- grilles HP : uniquement des hexagones ENTIERS (plus de demi-hexagones ni
  slivers au bord) -> "polygones manquants" cote HP corriges
- STL + STEP (valides) + .3mf regeneres
- rapports DOCX + PDF : cotes 129 x 98 mises a jour

Co-Authored-By: Claude Opus 4.8 <noreply@anthropic.com>
</commit_message>
<xml_diff>
--- a/docs/S3 Salle de Bain - Rapport Technique v3.docx
+++ b/docs/S3 Salle de Bain - Rapport Technique v3.docx
@@ -628,7 +628,7 @@
             </w:r>
           </w:p>
           <w:p>
-            <w:hyperlink w:history="1" r:id="rIdv42bazwdqla13m6eoqjmd">
+            <w:hyperlink w:history="1" r:id="rId3lrpm5szqhn6bjz52-ih9">
               <w:r>
                 <w:rPr>
                   <w:rFonts w:ascii="Courier New" w:cs="Courier New" w:eastAsia="Courier New" w:hAnsi="Courier New"/>
@@ -7156,7 +7156,7 @@
             </w:tcMar>
           </w:tcPr>
           <w:p>
-            <w:hyperlink w:history="1" r:id="rIdooescniw7_w88mxkpyi5b">
+            <w:hyperlink w:history="1" r:id="rIdmqrzigytmgko6aodd2cbw">
               <w:r>
                 <w:rPr>
                   <w:rFonts w:ascii="Courier New" w:cs="Courier New" w:eastAsia="Courier New" w:hAnsi="Courier New"/>
@@ -7271,7 +7271,7 @@
             </w:tcMar>
           </w:tcPr>
           <w:p>
-            <w:hyperlink w:history="1" r:id="rIdygjc3vktc6m-s81vwp2mq">
+            <w:hyperlink w:history="1" r:id="rIdxfnm4e7bmsob0oq1yvz7m">
               <w:r>
                 <w:rPr>
                   <w:rFonts w:ascii="Courier New" w:cs="Courier New" w:eastAsia="Courier New" w:hAnsi="Courier New"/>
@@ -7386,7 +7386,7 @@
             </w:tcMar>
           </w:tcPr>
           <w:p>
-            <w:hyperlink w:history="1" r:id="rIdno0qnoccqopyijwfljsk0">
+            <w:hyperlink w:history="1" r:id="rIds3kmkhp1mpnnjfuxvw01d">
               <w:r>
                 <w:rPr>
                   <w:rFonts w:ascii="Courier New" w:cs="Courier New" w:eastAsia="Courier New" w:hAnsi="Courier New"/>
@@ -7501,7 +7501,7 @@
             </w:tcMar>
           </w:tcPr>
           <w:p>
-            <w:hyperlink w:history="1" r:id="rIdmzpl0w_b3x9lch9mf7fkk">
+            <w:hyperlink w:history="1" r:id="rIdnttzabwgr1yqtpxbygksg">
               <w:r>
                 <w:rPr>
                   <w:rFonts w:ascii="Courier New" w:cs="Courier New" w:eastAsia="Courier New" w:hAnsi="Courier New"/>
@@ -7616,7 +7616,7 @@
             </w:tcMar>
           </w:tcPr>
           <w:p>
-            <w:hyperlink w:history="1" r:id="rIdbjkiyp_b0e9px_y3pknyd">
+            <w:hyperlink w:history="1" r:id="rIdypax9cbljf2oyb576kqqq">
               <w:r>
                 <w:rPr>
                   <w:rFonts w:ascii="Courier New" w:cs="Courier New" w:eastAsia="Courier New" w:hAnsi="Courier New"/>
@@ -7731,7 +7731,7 @@
             </w:tcMar>
           </w:tcPr>
           <w:p>
-            <w:hyperlink w:history="1" r:id="rIdn372qxiymbxpfryp3inwm">
+            <w:hyperlink w:history="1" r:id="rIdd-wh4bbgigb4tw9becckn">
               <w:r>
                 <w:rPr>
                   <w:rFonts w:ascii="Courier New" w:cs="Courier New" w:eastAsia="Courier New" w:hAnsi="Courier New"/>
@@ -7846,7 +7846,7 @@
             </w:tcMar>
           </w:tcPr>
           <w:p>
-            <w:hyperlink w:history="1" r:id="rIddotbn6mxterycgoyryz5y">
+            <w:hyperlink w:history="1" r:id="rIdcklpamilug_egbt_ykqff">
               <w:r>
                 <w:rPr>
                   <w:rFonts w:ascii="Courier New" w:cs="Courier New" w:eastAsia="Courier New" w:hAnsi="Courier New"/>
@@ -7961,7 +7961,7 @@
             </w:tcMar>
           </w:tcPr>
           <w:p>
-            <w:hyperlink w:history="1" r:id="rId-0-zhmhvic1yfardcmjjn">
+            <w:hyperlink w:history="1" r:id="rIda8u_ad3yfyc7c9fhz2jr9">
               <w:r>
                 <w:rPr>
                   <w:rFonts w:ascii="Courier New" w:cs="Courier New" w:eastAsia="Courier New" w:hAnsi="Courier New"/>
@@ -8076,7 +8076,7 @@
             </w:tcMar>
           </w:tcPr>
           <w:p>
-            <w:hyperlink w:history="1" r:id="rIdehsgvjxg4qnhnpinzjcib">
+            <w:hyperlink w:history="1" r:id="rIdntfuawadqjbndunv6pwvl">
               <w:r>
                 <w:rPr>
                   <w:rFonts w:ascii="Courier New" w:cs="Courier New" w:eastAsia="Courier New" w:hAnsi="Courier New"/>
@@ -8191,7 +8191,7 @@
             </w:tcMar>
           </w:tcPr>
           <w:p>
-            <w:hyperlink w:history="1" r:id="rIdhv6pfacrui-wbdp1wxsbr">
+            <w:hyperlink w:history="1" r:id="rIdmbjhfumvipdnlvss0t5sc">
               <w:r>
                 <w:rPr>
                   <w:rFonts w:ascii="Courier New" w:cs="Courier New" w:eastAsia="Courier New" w:hAnsi="Courier New"/>
@@ -8306,7 +8306,7 @@
             </w:tcMar>
           </w:tcPr>
           <w:p>
-            <w:hyperlink w:history="1" r:id="rId62khi_bzhynsx08szcqan">
+            <w:hyperlink w:history="1" r:id="rIdzysppzr66m6gcl3ndprk6">
               <w:r>
                 <w:rPr>
                   <w:rFonts w:ascii="Courier New" w:cs="Courier New" w:eastAsia="Courier New" w:hAnsi="Courier New"/>
@@ -8421,7 +8421,7 @@
             </w:tcMar>
           </w:tcPr>
           <w:p>
-            <w:hyperlink w:history="1" r:id="rIduu1ra2cdoflq2ekxoaa7b">
+            <w:hyperlink w:history="1" r:id="rIdai_nbt7qz-gd_gix8ypfl">
               <w:r>
                 <w:rPr>
                   <w:rFonts w:ascii="Courier New" w:cs="Courier New" w:eastAsia="Courier New" w:hAnsi="Courier New"/>
@@ -8536,7 +8536,7 @@
             </w:tcMar>
           </w:tcPr>
           <w:p>
-            <w:hyperlink w:history="1" r:id="rIdtukqv9v_s5hqqbs7uox5x">
+            <w:hyperlink w:history="1" r:id="rId3ptw6hwq1f1_dypt5vv9z">
               <w:r>
                 <w:rPr>
                   <w:rFonts w:ascii="Courier New" w:cs="Courier New" w:eastAsia="Courier New" w:hAnsi="Courier New"/>
@@ -8651,7 +8651,7 @@
             </w:tcMar>
           </w:tcPr>
           <w:p>
-            <w:hyperlink w:history="1" r:id="rId5q-kux7b3fthm6mmies0u">
+            <w:hyperlink w:history="1" r:id="rIdwyuhy6k133pey_upieukt">
               <w:r>
                 <w:rPr>
                   <w:rFonts w:ascii="Courier New" w:cs="Courier New" w:eastAsia="Courier New" w:hAnsi="Courier New"/>
@@ -8766,7 +8766,7 @@
             </w:tcMar>
           </w:tcPr>
           <w:p>
-            <w:hyperlink w:history="1" r:id="rIdziascbtjyjhckqv-y_r3z">
+            <w:hyperlink w:history="1" r:id="rIdvvkpzbledzitz3dc_ntgp">
               <w:r>
                 <w:rPr>
                   <w:rFonts w:ascii="Courier New" w:cs="Courier New" w:eastAsia="Courier New" w:hAnsi="Courier New"/>
@@ -8881,7 +8881,7 @@
             </w:tcMar>
           </w:tcPr>
           <w:p>
-            <w:hyperlink w:history="1" r:id="rIdjdp6iqoggo7tsydepae8w">
+            <w:hyperlink w:history="1" r:id="rIdmu3zwyrfxzulsmboqhase">
               <w:r>
                 <w:rPr>
                   <w:rFonts w:ascii="Courier New" w:cs="Courier New" w:eastAsia="Courier New" w:hAnsi="Courier New"/>
@@ -18865,7 +18865,7 @@
           <w:sz w:val="17"/>
           <w:szCs w:val="17"/>
         </w:rPr>
-        <w:t xml:space="preserve">Le boitier adopte une forme de galet integral de 121 x 90 mm pour 69 mm de hauteur, dont TOUTES les aretes sont adoucies (fillet 12 mm, coins R36) : un vrai galet doux. Le capot et le bac se ferment par une levre peripherique en press-fit : aucune vis n'est visible sur le dessus, seule une encoche laterale discrete permet le demontage. L'inspiration puise dans la tradition Dieter Rams / Braun : minimalisme, fonction evidente, absence totale d'ornement superflu.</w:t>
+        <w:t xml:space="preserve">Le boitier adopte une forme de galet integral de 129 x 98 mm pour 69 mm de hauteur, dont TOUTES les aretes sont adoucies (fillet 12 mm, coins R36) : un vrai galet doux. Le capot et le bac se ferment par une levre peripherique en press-fit : aucune vis n'est visible sur le dessus, seule une encoche laterale discrete permet le demontage. L'inspiration puise dans la tradition Dieter Rams / Braun : minimalisme, fonction evidente, absence totale d'ornement superflu.</w:t>
       </w:r>
     </w:p>
     <w:p>
@@ -19028,7 +19028,7 @@
                       <w:sz w:val="17"/>
                       <w:szCs w:val="17"/>
                     </w:rPr>
-                    <w:t xml:space="preserve">121 x 90 x 69 mm</w:t>
+                    <w:t xml:space="preserve">129 x 98 x 69 mm</w:t>
                   </w:r>
                 </w:p>
               </w:tc>
@@ -22711,7 +22711,7 @@
             </w:tcMar>
           </w:tcPr>
           <w:p>
-            <w:hyperlink w:history="1" r:id="rIdydje4fgm5jxoe8bqb-fov">
+            <w:hyperlink w:history="1" r:id="rIdvy8a09mdmtzblpspap6wb">
               <w:r>
                 <w:rPr>
                   <w:rFonts w:ascii="Courier New" w:cs="Courier New" w:eastAsia="Courier New" w:hAnsi="Courier New"/>
@@ -22742,7 +22742,7 @@
             </w:tcMar>
           </w:tcPr>
           <w:p>
-            <w:hyperlink w:history="1" r:id="rId_kgs0fm7t6txu9oqpobch">
+            <w:hyperlink w:history="1" r:id="rIdqgaj2nbiehlymjghzkur7">
               <w:r>
                 <w:rPr>
                   <w:rFonts w:ascii="Courier New" w:cs="Courier New" w:eastAsia="Courier New" w:hAnsi="Courier New"/>
@@ -22830,7 +22830,7 @@
             </w:tcMar>
           </w:tcPr>
           <w:p>
-            <w:hyperlink w:history="1" r:id="rIdisfdzm0py3kvzkkr2rxlr">
+            <w:hyperlink w:history="1" r:id="rId58nhcoislok4ybjhz0tst">
               <w:r>
                 <w:rPr>
                   <w:rFonts w:ascii="Courier New" w:cs="Courier New" w:eastAsia="Courier New" w:hAnsi="Courier New"/>
@@ -22861,7 +22861,7 @@
             </w:tcMar>
           </w:tcPr>
           <w:p>
-            <w:hyperlink w:history="1" r:id="rIdnqoeqqn3tpy_at1cufxc2">
+            <w:hyperlink w:history="1" r:id="rIdz92egydlqp1nm7zbdryui">
               <w:r>
                 <w:rPr>
                   <w:rFonts w:ascii="Courier New" w:cs="Courier New" w:eastAsia="Courier New" w:hAnsi="Courier New"/>
@@ -22949,7 +22949,7 @@
             </w:tcMar>
           </w:tcPr>
           <w:p>
-            <w:hyperlink w:history="1" r:id="rIdclj6-avvmdlfjlwadtehp">
+            <w:hyperlink w:history="1" r:id="rId2ryswvj0syqjvnw-_kwrq">
               <w:r>
                 <w:rPr>
                   <w:rFonts w:ascii="Courier New" w:cs="Courier New" w:eastAsia="Courier New" w:hAnsi="Courier New"/>
@@ -22980,7 +22980,7 @@
             </w:tcMar>
           </w:tcPr>
           <w:p>
-            <w:hyperlink w:history="1" r:id="rId9ll2we-in6zi78r9n_-dw">
+            <w:hyperlink w:history="1" r:id="rId1mkfdin3hqtal_67wnbbx">
               <w:r>
                 <w:rPr>
                   <w:rFonts w:ascii="Courier New" w:cs="Courier New" w:eastAsia="Courier New" w:hAnsi="Courier New"/>
@@ -23042,7 +23042,7 @@
             </w:tcMar>
           </w:tcPr>
           <w:p>
-            <w:hyperlink w:history="1" r:id="rIdkvnchdthhe9smebxe0ll-">
+            <w:hyperlink w:history="1" r:id="rId7mm4fhq91scrz5uowydk5">
               <w:r>
                 <w:rPr>
                   <w:rFonts w:ascii="Courier New" w:cs="Courier New" w:eastAsia="Courier New" w:hAnsi="Courier New"/>
@@ -25917,7 +25917,7 @@
             </w:tcMar>
           </w:tcPr>
           <w:p>
-            <w:hyperlink w:history="1" r:id="rId2kdt3c4xamdfrmvfeeuuw">
+            <w:hyperlink w:history="1" r:id="rIdckzf62kjmfckdvjmcshh0">
               <w:r>
                 <w:rPr>
                   <w:rFonts w:ascii="Courier New" w:cs="Courier New" w:eastAsia="Courier New" w:hAnsi="Courier New"/>

</xml_diff>

<commit_message>
docs(docx): ajoute le rendu PCB (Fig. 2) juste apres le schema
Image kicad/s3-salle-de-bain.png inseree apres la Fig. 1 (schema
d'interconnexion) ; figures suivantes renumerotees (3 a 6).

Co-Authored-By: Claude Opus 4.8 <noreply@anthropic.com>
</commit_message>
<xml_diff>
--- a/docs/S3 Salle de Bain - Rapport Technique v3.docx
+++ b/docs/S3 Salle de Bain - Rapport Technique v3.docx
@@ -628,7 +628,7 @@
             </w:r>
           </w:p>
           <w:p>
-            <w:hyperlink w:history="1" r:id="rId3lrpm5szqhn6bjz52-ih9">
+            <w:hyperlink w:history="1" r:id="rIdqk7wvwpewu5n1m36leemu">
               <w:r>
                 <w:rPr>
                   <w:rFonts w:ascii="Courier New" w:cs="Courier New" w:eastAsia="Courier New" w:hAnsi="Courier New"/>
@@ -2931,6 +2931,68 @@
         <w:t xml:space="preserve">Fig. 1 - Schema d'interconnexion ESP32-S3 / PCM5102 / peripheriques (v3).</w:t>
       </w:r>
     </w:p>
+    <w:p>
+      <w:pPr>
+        <w:spacing w:before="220"/>
+        <w:jc w:val="center"/>
+      </w:pPr>
+      <w:r>
+        <w:drawing>
+          <wp:inline distT="0" distB="0" distL="0" distR="0">
+            <wp:extent cx="5762625" cy="3276600"/>
+            <wp:effectExtent t="0" r="0" b="0" l="0"/>
+            <wp:docPr id="1" name="pcb_render.png" descr="pcb_render.png" title="pcb_render.png"/>
+            <wp:cNvGraphicFramePr>
+              <a:graphicFrameLocks xmlns:a="http://schemas.openxmlformats.org/drawingml/2006/main" noChangeAspect="1"/>
+            </wp:cNvGraphicFramePr>
+            <a:graphic xmlns:a="http://schemas.openxmlformats.org/drawingml/2006/main">
+              <a:graphicData uri="http://schemas.openxmlformats.org/drawingml/2006/picture">
+                <pic:pic xmlns:pic="http://schemas.openxmlformats.org/drawingml/2006/picture">
+                  <pic:nvPicPr>
+                    <pic:cNvPr id="0" name="" descr=""/>
+                    <pic:cNvPicPr>
+                      <a:picLocks noChangeAspect="1" noChangeArrowheads="1"/>
+                    </pic:cNvPicPr>
+                  </pic:nvPicPr>
+                  <pic:blipFill>
+                    <a:blip r:embed="rId13" cstate="none"/>
+                    <a:srcRect/>
+                    <a:stretch>
+                      <a:fillRect/>
+                    </a:stretch>
+                  </pic:blipFill>
+                  <pic:spPr bwMode="auto">
+                    <a:xfrm>
+                      <a:off x="0" y="0"/>
+                      <a:ext cx="5762625" cy="3276600"/>
+                    </a:xfrm>
+                    <a:prstGeom prst="rect">
+                      <a:avLst/>
+                    </a:prstGeom>
+                  </pic:spPr>
+                </pic:pic>
+              </a:graphicData>
+            </a:graphic>
+          </wp:inline>
+        </w:drawing>
+      </w:r>
+    </w:p>
+    <w:p>
+      <w:pPr>
+        <w:spacing w:after="200" w:before="60"/>
+        <w:jc w:val="center"/>
+      </w:pPr>
+      <w:r>
+        <w:rPr>
+          <w:i/>
+          <w:iCs/>
+          <w:color w:val="8A7D6E"/>
+          <w:sz w:val="14"/>
+          <w:szCs w:val="14"/>
+        </w:rPr>
+        <w:t xml:space="preserve">Fig. 2 - Implantation du PCB (rendu KiCad) : placement des composants, footprints reels et trous de fixation M3.</w:t>
+      </w:r>
+    </w:p>
     <w:tbl>
       <w:tblPr>
         <w:tblW w:type="dxa" w:w="9298"/>
@@ -5490,7 +5552,7 @@
                     </pic:cNvPicPr>
                   </pic:nvPicPr>
                   <pic:blipFill>
-                    <a:blip r:embed="rId13" cstate="none"/>
+                    <a:blip r:embed="rId14" cstate="none"/>
                     <a:srcRect/>
                     <a:stretch>
                       <a:fillRect/>
@@ -5525,7 +5587,7 @@
           <w:sz w:val="14"/>
           <w:szCs w:val="14"/>
         </w:rPr>
-        <w:t xml:space="preserve">Fig. 2 - Pipeline audio bidirectionnel ESPHome / Home Assistant.</w:t>
+        <w:t xml:space="preserve">Fig. 3 - Pipeline audio bidirectionnel ESPHome / Home Assistant.</w:t>
       </w:r>
     </w:p>
     <w:tbl>
@@ -7156,7 +7218,7 @@
             </w:tcMar>
           </w:tcPr>
           <w:p>
-            <w:hyperlink w:history="1" r:id="rIdmqrzigytmgko6aodd2cbw">
+            <w:hyperlink w:history="1" r:id="rIdx3ke9uap7b5ilzh2wk9dk">
               <w:r>
                 <w:rPr>
                   <w:rFonts w:ascii="Courier New" w:cs="Courier New" w:eastAsia="Courier New" w:hAnsi="Courier New"/>
@@ -7271,7 +7333,7 @@
             </w:tcMar>
           </w:tcPr>
           <w:p>
-            <w:hyperlink w:history="1" r:id="rIdxfnm4e7bmsob0oq1yvz7m">
+            <w:hyperlink w:history="1" r:id="rId6mkyfreiixqnu7k_74lpr">
               <w:r>
                 <w:rPr>
                   <w:rFonts w:ascii="Courier New" w:cs="Courier New" w:eastAsia="Courier New" w:hAnsi="Courier New"/>
@@ -7386,7 +7448,7 @@
             </w:tcMar>
           </w:tcPr>
           <w:p>
-            <w:hyperlink w:history="1" r:id="rIds3kmkhp1mpnnjfuxvw01d">
+            <w:hyperlink w:history="1" r:id="rIdgqjj_knsgvyrvdyn2b6zz">
               <w:r>
                 <w:rPr>
                   <w:rFonts w:ascii="Courier New" w:cs="Courier New" w:eastAsia="Courier New" w:hAnsi="Courier New"/>
@@ -7501,7 +7563,7 @@
             </w:tcMar>
           </w:tcPr>
           <w:p>
-            <w:hyperlink w:history="1" r:id="rIdnttzabwgr1yqtpxbygksg">
+            <w:hyperlink w:history="1" r:id="rIdaodzi91qwezgiiizabscn">
               <w:r>
                 <w:rPr>
                   <w:rFonts w:ascii="Courier New" w:cs="Courier New" w:eastAsia="Courier New" w:hAnsi="Courier New"/>
@@ -7616,7 +7678,7 @@
             </w:tcMar>
           </w:tcPr>
           <w:p>
-            <w:hyperlink w:history="1" r:id="rIdypax9cbljf2oyb576kqqq">
+            <w:hyperlink w:history="1" r:id="rIdiquy4dl9yn3viiixnhoks">
               <w:r>
                 <w:rPr>
                   <w:rFonts w:ascii="Courier New" w:cs="Courier New" w:eastAsia="Courier New" w:hAnsi="Courier New"/>
@@ -7731,7 +7793,7 @@
             </w:tcMar>
           </w:tcPr>
           <w:p>
-            <w:hyperlink w:history="1" r:id="rIdd-wh4bbgigb4tw9becckn">
+            <w:hyperlink w:history="1" r:id="rIdvdeygl-9yl8ryqgjetq9c">
               <w:r>
                 <w:rPr>
                   <w:rFonts w:ascii="Courier New" w:cs="Courier New" w:eastAsia="Courier New" w:hAnsi="Courier New"/>
@@ -7846,7 +7908,7 @@
             </w:tcMar>
           </w:tcPr>
           <w:p>
-            <w:hyperlink w:history="1" r:id="rIdcklpamilug_egbt_ykqff">
+            <w:hyperlink w:history="1" r:id="rIdgdotnmeqlu-bxjllftmmp">
               <w:r>
                 <w:rPr>
                   <w:rFonts w:ascii="Courier New" w:cs="Courier New" w:eastAsia="Courier New" w:hAnsi="Courier New"/>
@@ -7961,7 +8023,7 @@
             </w:tcMar>
           </w:tcPr>
           <w:p>
-            <w:hyperlink w:history="1" r:id="rIda8u_ad3yfyc7c9fhz2jr9">
+            <w:hyperlink w:history="1" r:id="rIdrksdx1tbb59_ha0pkkvqo">
               <w:r>
                 <w:rPr>
                   <w:rFonts w:ascii="Courier New" w:cs="Courier New" w:eastAsia="Courier New" w:hAnsi="Courier New"/>
@@ -8076,7 +8138,7 @@
             </w:tcMar>
           </w:tcPr>
           <w:p>
-            <w:hyperlink w:history="1" r:id="rIdntfuawadqjbndunv6pwvl">
+            <w:hyperlink w:history="1" r:id="rIdgsjxg0pyi-2tacdl8xuon">
               <w:r>
                 <w:rPr>
                   <w:rFonts w:ascii="Courier New" w:cs="Courier New" w:eastAsia="Courier New" w:hAnsi="Courier New"/>
@@ -8191,7 +8253,7 @@
             </w:tcMar>
           </w:tcPr>
           <w:p>
-            <w:hyperlink w:history="1" r:id="rIdmbjhfumvipdnlvss0t5sc">
+            <w:hyperlink w:history="1" r:id="rIdoedcyv7t0so_pnv0rwy_u">
               <w:r>
                 <w:rPr>
                   <w:rFonts w:ascii="Courier New" w:cs="Courier New" w:eastAsia="Courier New" w:hAnsi="Courier New"/>
@@ -8306,7 +8368,7 @@
             </w:tcMar>
           </w:tcPr>
           <w:p>
-            <w:hyperlink w:history="1" r:id="rIdzysppzr66m6gcl3ndprk6">
+            <w:hyperlink w:history="1" r:id="rIdoz8qkrnbnwbo7utsvcnrj">
               <w:r>
                 <w:rPr>
                   <w:rFonts w:ascii="Courier New" w:cs="Courier New" w:eastAsia="Courier New" w:hAnsi="Courier New"/>
@@ -8421,7 +8483,7 @@
             </w:tcMar>
           </w:tcPr>
           <w:p>
-            <w:hyperlink w:history="1" r:id="rIdai_nbt7qz-gd_gix8ypfl">
+            <w:hyperlink w:history="1" r:id="rId1pvsq1erl97jlwhahpnuw">
               <w:r>
                 <w:rPr>
                   <w:rFonts w:ascii="Courier New" w:cs="Courier New" w:eastAsia="Courier New" w:hAnsi="Courier New"/>
@@ -8536,7 +8598,7 @@
             </w:tcMar>
           </w:tcPr>
           <w:p>
-            <w:hyperlink w:history="1" r:id="rId3ptw6hwq1f1_dypt5vv9z">
+            <w:hyperlink w:history="1" r:id="rIdszstuhz_w3oy5avopeegs">
               <w:r>
                 <w:rPr>
                   <w:rFonts w:ascii="Courier New" w:cs="Courier New" w:eastAsia="Courier New" w:hAnsi="Courier New"/>
@@ -8651,7 +8713,7 @@
             </w:tcMar>
           </w:tcPr>
           <w:p>
-            <w:hyperlink w:history="1" r:id="rIdwyuhy6k133pey_upieukt">
+            <w:hyperlink w:history="1" r:id="rIdra9rpxzebm5_jq-2mvw0a">
               <w:r>
                 <w:rPr>
                   <w:rFonts w:ascii="Courier New" w:cs="Courier New" w:eastAsia="Courier New" w:hAnsi="Courier New"/>
@@ -8766,7 +8828,7 @@
             </w:tcMar>
           </w:tcPr>
           <w:p>
-            <w:hyperlink w:history="1" r:id="rIdvvkpzbledzitz3dc_ntgp">
+            <w:hyperlink w:history="1" r:id="rIdrr6pio9knqowxijm_l_5-">
               <w:r>
                 <w:rPr>
                   <w:rFonts w:ascii="Courier New" w:cs="Courier New" w:eastAsia="Courier New" w:hAnsi="Courier New"/>
@@ -8881,7 +8943,7 @@
             </w:tcMar>
           </w:tcPr>
           <w:p>
-            <w:hyperlink w:history="1" r:id="rIdmu3zwyrfxzulsmboqhase">
+            <w:hyperlink w:history="1" r:id="rIdhh-l8odztdbexscs_vdph">
               <w:r>
                 <w:rPr>
                   <w:rFonts w:ascii="Courier New" w:cs="Courier New" w:eastAsia="Courier New" w:hAnsi="Courier New"/>
@@ -13528,7 +13590,7 @@
                     </pic:cNvPicPr>
                   </pic:nvPicPr>
                   <pic:blipFill>
-                    <a:blip r:embed="rId14" cstate="none"/>
+                    <a:blip r:embed="rId15" cstate="none"/>
                     <a:srcRect/>
                     <a:stretch>
                       <a:fillRect/>
@@ -13563,7 +13625,7 @@
           <w:sz w:val="14"/>
           <w:szCs w:val="14"/>
         </w:rPr>
-        <w:t xml:space="preserve">Fig. 3 - Dix etats de l'anneau LED, du repos a la sonnerie de minuterie.</w:t>
+        <w:t xml:space="preserve">Fig. 4 - Dix etats de l'anneau LED, du repos a la sonnerie de minuterie.</w:t>
       </w:r>
     </w:p>
     <w:p>
@@ -18792,7 +18854,7 @@
                     </pic:cNvPicPr>
                   </pic:nvPicPr>
                   <pic:blipFill>
-                    <a:blip r:embed="rId15" cstate="none"/>
+                    <a:blip r:embed="rId16" cstate="none"/>
                     <a:srcRect/>
                     <a:stretch>
                       <a:fillRect/>
@@ -18827,7 +18889,7 @@
           <w:sz w:val="14"/>
           <w:szCs w:val="14"/>
         </w:rPr>
-        <w:t xml:space="preserve">Fig. 4 - Boitier v5, galet integral (rendu CAO), 4 HP + radiateurs passifs, PA-CF.</w:t>
+        <w:t xml:space="preserve">Fig. 5 - Boitier v5, galet integral (rendu CAO), 4 HP + radiateurs passifs, PA-CF.</w:t>
       </w:r>
     </w:p>
     <w:p>
@@ -20045,7 +20107,7 @@
                     </pic:cNvPicPr>
                   </pic:nvPicPr>
                   <pic:blipFill>
-                    <a:blip r:embed="rId16" cstate="none"/>
+                    <a:blip r:embed="rId17" cstate="none"/>
                     <a:srcRect/>
                     <a:stretch>
                       <a:fillRect/>
@@ -20080,7 +20142,7 @@
           <w:sz w:val="14"/>
           <w:szCs w:val="14"/>
         </w:rPr>
-        <w:t xml:space="preserve">Fig. 5 - Vue eclatee du boitier v5 : capot a molette + bac (2 HP facade, 2 radiateurs arriere).</w:t>
+        <w:t xml:space="preserve">Fig. 6 - Vue eclatee du boitier v5 : capot a molette + bac (2 HP facade, 2 radiateurs arriere).</w:t>
       </w:r>
     </w:p>
     <w:tbl>
@@ -22711,7 +22773,7 @@
             </w:tcMar>
           </w:tcPr>
           <w:p>
-            <w:hyperlink w:history="1" r:id="rIdvy8a09mdmtzblpspap6wb">
+            <w:hyperlink w:history="1" r:id="rIddypxz5mkzw19yydyiyshq">
               <w:r>
                 <w:rPr>
                   <w:rFonts w:ascii="Courier New" w:cs="Courier New" w:eastAsia="Courier New" w:hAnsi="Courier New"/>
@@ -22742,7 +22804,7 @@
             </w:tcMar>
           </w:tcPr>
           <w:p>
-            <w:hyperlink w:history="1" r:id="rIdqgaj2nbiehlymjghzkur7">
+            <w:hyperlink w:history="1" r:id="rIdbo2xqgdtlwzk8v4tbqt-v">
               <w:r>
                 <w:rPr>
                   <w:rFonts w:ascii="Courier New" w:cs="Courier New" w:eastAsia="Courier New" w:hAnsi="Courier New"/>
@@ -22830,7 +22892,7 @@
             </w:tcMar>
           </w:tcPr>
           <w:p>
-            <w:hyperlink w:history="1" r:id="rId58nhcoislok4ybjhz0tst">
+            <w:hyperlink w:history="1" r:id="rId2w_3wxweatqeetg1yop0j">
               <w:r>
                 <w:rPr>
                   <w:rFonts w:ascii="Courier New" w:cs="Courier New" w:eastAsia="Courier New" w:hAnsi="Courier New"/>
@@ -22861,7 +22923,7 @@
             </w:tcMar>
           </w:tcPr>
           <w:p>
-            <w:hyperlink w:history="1" r:id="rIdz92egydlqp1nm7zbdryui">
+            <w:hyperlink w:history="1" r:id="rIddhxt1is3wnxvzkeeygtbq">
               <w:r>
                 <w:rPr>
                   <w:rFonts w:ascii="Courier New" w:cs="Courier New" w:eastAsia="Courier New" w:hAnsi="Courier New"/>
@@ -22949,7 +23011,7 @@
             </w:tcMar>
           </w:tcPr>
           <w:p>
-            <w:hyperlink w:history="1" r:id="rId2ryswvj0syqjvnw-_kwrq">
+            <w:hyperlink w:history="1" r:id="rId5jjnlrj4z-lzhzwokhjl6">
               <w:r>
                 <w:rPr>
                   <w:rFonts w:ascii="Courier New" w:cs="Courier New" w:eastAsia="Courier New" w:hAnsi="Courier New"/>
@@ -22980,7 +23042,7 @@
             </w:tcMar>
           </w:tcPr>
           <w:p>
-            <w:hyperlink w:history="1" r:id="rId1mkfdin3hqtal_67wnbbx">
+            <w:hyperlink w:history="1" r:id="rIdmcnzctmjs7jggwsvw3qes">
               <w:r>
                 <w:rPr>
                   <w:rFonts w:ascii="Courier New" w:cs="Courier New" w:eastAsia="Courier New" w:hAnsi="Courier New"/>
@@ -23042,7 +23104,7 @@
             </w:tcMar>
           </w:tcPr>
           <w:p>
-            <w:hyperlink w:history="1" r:id="rId7mm4fhq91scrz5uowydk5">
+            <w:hyperlink w:history="1" r:id="rIdzcmtkq0h0yhjt4dfbk9y2">
               <w:r>
                 <w:rPr>
                   <w:rFonts w:ascii="Courier New" w:cs="Courier New" w:eastAsia="Courier New" w:hAnsi="Courier New"/>
@@ -25917,7 +25979,7 @@
             </w:tcMar>
           </w:tcPr>
           <w:p>
-            <w:hyperlink w:history="1" r:id="rIdckzf62kjmfckdvjmcshh0">
+            <w:hyperlink w:history="1" r:id="rId2akhzb-0r6u5h4jxlx32r">
               <w:r>
                 <w:rPr>
                   <w:rFonts w:ascii="Courier New" w:cs="Courier New" w:eastAsia="Courier New" w:hAnsi="Courier New"/>

</xml_diff>

<commit_message>
docs(docx): rapport mis a jour en boitier v6 (+ PCB Fig. 2)
Co-Authored-By: Claude Opus 4.8 <noreply@anthropic.com>
</commit_message>
<xml_diff>
--- a/docs/S3 Salle de Bain - Rapport Technique v3.docx
+++ b/docs/S3 Salle de Bain - Rapport Technique v3.docx
@@ -628,7 +628,7 @@
             </w:r>
           </w:p>
           <w:p>
-            <w:hyperlink w:history="1" r:id="rIdqk7wvwpewu5n1m36leemu">
+            <w:hyperlink w:history="1" r:id="rIdtypto7cezzurlx8mqhwwp">
               <w:r>
                 <w:rPr>
                   <w:rFonts w:ascii="Courier New" w:cs="Courier New" w:eastAsia="Courier New" w:hAnsi="Courier New"/>
@@ -1762,7 +1762,7 @@
                 <w:sz w:val="15"/>
                 <w:szCs w:val="15"/>
               </w:rPr>
-              <w:t xml:space="preserve">Galet integral PA-CF, 4 HP (2 actifs + 2 radiateurs passifs), basses</w:t>
+              <w:t xml:space="preserve">Boitier plat style JBL, 4 HP, radiateurs de basse aux extremites (logo DOMOKAMI)</w:t>
             </w:r>
           </w:p>
         </w:tc>
@@ -7218,7 +7218,7 @@
             </w:tcMar>
           </w:tcPr>
           <w:p>
-            <w:hyperlink w:history="1" r:id="rIdx3ke9uap7b5ilzh2wk9dk">
+            <w:hyperlink w:history="1" r:id="rIdntn3ijkmeztecovtkht-y">
               <w:r>
                 <w:rPr>
                   <w:rFonts w:ascii="Courier New" w:cs="Courier New" w:eastAsia="Courier New" w:hAnsi="Courier New"/>
@@ -7333,7 +7333,7 @@
             </w:tcMar>
           </w:tcPr>
           <w:p>
-            <w:hyperlink w:history="1" r:id="rId6mkyfreiixqnu7k_74lpr">
+            <w:hyperlink w:history="1" r:id="rIdkohfkvtf945k_kqdnqiii">
               <w:r>
                 <w:rPr>
                   <w:rFonts w:ascii="Courier New" w:cs="Courier New" w:eastAsia="Courier New" w:hAnsi="Courier New"/>
@@ -7448,7 +7448,7 @@
             </w:tcMar>
           </w:tcPr>
           <w:p>
-            <w:hyperlink w:history="1" r:id="rIdgqjj_knsgvyrvdyn2b6zz">
+            <w:hyperlink w:history="1" r:id="rIdglroaw8hs539-awitf55r">
               <w:r>
                 <w:rPr>
                   <w:rFonts w:ascii="Courier New" w:cs="Courier New" w:eastAsia="Courier New" w:hAnsi="Courier New"/>
@@ -7563,7 +7563,7 @@
             </w:tcMar>
           </w:tcPr>
           <w:p>
-            <w:hyperlink w:history="1" r:id="rIdaodzi91qwezgiiizabscn">
+            <w:hyperlink w:history="1" r:id="rIdrm-j8qdrzvexcbohkllt3">
               <w:r>
                 <w:rPr>
                   <w:rFonts w:ascii="Courier New" w:cs="Courier New" w:eastAsia="Courier New" w:hAnsi="Courier New"/>
@@ -7678,7 +7678,7 @@
             </w:tcMar>
           </w:tcPr>
           <w:p>
-            <w:hyperlink w:history="1" r:id="rIdiquy4dl9yn3viiixnhoks">
+            <w:hyperlink w:history="1" r:id="rId80kl6zfvyyfygnfkk4sfg">
               <w:r>
                 <w:rPr>
                   <w:rFonts w:ascii="Courier New" w:cs="Courier New" w:eastAsia="Courier New" w:hAnsi="Courier New"/>
@@ -7793,7 +7793,7 @@
             </w:tcMar>
           </w:tcPr>
           <w:p>
-            <w:hyperlink w:history="1" r:id="rIdvdeygl-9yl8ryqgjetq9c">
+            <w:hyperlink w:history="1" r:id="rIdgqvlb9pom5wyhe9tl7src">
               <w:r>
                 <w:rPr>
                   <w:rFonts w:ascii="Courier New" w:cs="Courier New" w:eastAsia="Courier New" w:hAnsi="Courier New"/>
@@ -7908,7 +7908,7 @@
             </w:tcMar>
           </w:tcPr>
           <w:p>
-            <w:hyperlink w:history="1" r:id="rIdgdotnmeqlu-bxjllftmmp">
+            <w:hyperlink w:history="1" r:id="rIdqxp7mbz4n9zapwo6cs8oh">
               <w:r>
                 <w:rPr>
                   <w:rFonts w:ascii="Courier New" w:cs="Courier New" w:eastAsia="Courier New" w:hAnsi="Courier New"/>
@@ -8023,7 +8023,7 @@
             </w:tcMar>
           </w:tcPr>
           <w:p>
-            <w:hyperlink w:history="1" r:id="rIdrksdx1tbb59_ha0pkkvqo">
+            <w:hyperlink w:history="1" r:id="rIdqfkw20rgpchs5pzsfzpas">
               <w:r>
                 <w:rPr>
                   <w:rFonts w:ascii="Courier New" w:cs="Courier New" w:eastAsia="Courier New" w:hAnsi="Courier New"/>
@@ -8138,7 +8138,7 @@
             </w:tcMar>
           </w:tcPr>
           <w:p>
-            <w:hyperlink w:history="1" r:id="rIdgsjxg0pyi-2tacdl8xuon">
+            <w:hyperlink w:history="1" r:id="rId_ufvwcumyynbgjay75f1s">
               <w:r>
                 <w:rPr>
                   <w:rFonts w:ascii="Courier New" w:cs="Courier New" w:eastAsia="Courier New" w:hAnsi="Courier New"/>
@@ -8253,7 +8253,7 @@
             </w:tcMar>
           </w:tcPr>
           <w:p>
-            <w:hyperlink w:history="1" r:id="rIdoedcyv7t0so_pnv0rwy_u">
+            <w:hyperlink w:history="1" r:id="rIdprgph5sn4u0dwxfefim7e">
               <w:r>
                 <w:rPr>
                   <w:rFonts w:ascii="Courier New" w:cs="Courier New" w:eastAsia="Courier New" w:hAnsi="Courier New"/>
@@ -8368,7 +8368,7 @@
             </w:tcMar>
           </w:tcPr>
           <w:p>
-            <w:hyperlink w:history="1" r:id="rIdoz8qkrnbnwbo7utsvcnrj">
+            <w:hyperlink w:history="1" r:id="rIdysw3zhstlzyo9aaa4qemq">
               <w:r>
                 <w:rPr>
                   <w:rFonts w:ascii="Courier New" w:cs="Courier New" w:eastAsia="Courier New" w:hAnsi="Courier New"/>
@@ -8483,7 +8483,7 @@
             </w:tcMar>
           </w:tcPr>
           <w:p>
-            <w:hyperlink w:history="1" r:id="rId1pvsq1erl97jlwhahpnuw">
+            <w:hyperlink w:history="1" r:id="rId7lju8dvp_msxnyyhashmx">
               <w:r>
                 <w:rPr>
                   <w:rFonts w:ascii="Courier New" w:cs="Courier New" w:eastAsia="Courier New" w:hAnsi="Courier New"/>
@@ -8598,7 +8598,7 @@
             </w:tcMar>
           </w:tcPr>
           <w:p>
-            <w:hyperlink w:history="1" r:id="rIdszstuhz_w3oy5avopeegs">
+            <w:hyperlink w:history="1" r:id="rId3vdq0nwbtrtizjcjzssfa">
               <w:r>
                 <w:rPr>
                   <w:rFonts w:ascii="Courier New" w:cs="Courier New" w:eastAsia="Courier New" w:hAnsi="Courier New"/>
@@ -8713,7 +8713,7 @@
             </w:tcMar>
           </w:tcPr>
           <w:p>
-            <w:hyperlink w:history="1" r:id="rIdra9rpxzebm5_jq-2mvw0a">
+            <w:hyperlink w:history="1" r:id="rId7ar-ldyoyiqqgan79nqek">
               <w:r>
                 <w:rPr>
                   <w:rFonts w:ascii="Courier New" w:cs="Courier New" w:eastAsia="Courier New" w:hAnsi="Courier New"/>
@@ -8828,7 +8828,7 @@
             </w:tcMar>
           </w:tcPr>
           <w:p>
-            <w:hyperlink w:history="1" r:id="rIdrr6pio9knqowxijm_l_5-">
+            <w:hyperlink w:history="1" r:id="rIdqzevwug_xis2obfyvgeta">
               <w:r>
                 <w:rPr>
                   <w:rFonts w:ascii="Courier New" w:cs="Courier New" w:eastAsia="Courier New" w:hAnsi="Courier New"/>
@@ -8943,7 +8943,7 @@
             </w:tcMar>
           </w:tcPr>
           <w:p>
-            <w:hyperlink w:history="1" r:id="rIdhh-l8odztdbexscs_vdph">
+            <w:hyperlink w:history="1" r:id="rIdll-b3mshtyooqru7wzoa0">
               <w:r>
                 <w:rPr>
                   <w:rFonts w:ascii="Courier New" w:cs="Courier New" w:eastAsia="Courier New" w:hAnsi="Courier New"/>
@@ -18828,7 +18828,7 @@
           <w:sz w:val="19"/>
           <w:szCs w:val="19"/>
         </w:rPr>
-        <w:t xml:space="preserve">Galet integral PA-CF, 4 HP (2 actifs + 2 radiateurs passifs), basses</w:t>
+        <w:t xml:space="preserve">Boitier plat style JBL, 4 HP, radiateurs de basse aux extremites (logo DOMOKAMI)</w:t>
       </w:r>
     </w:p>
     <w:p>
@@ -18838,7 +18838,7 @@
       <w:r>
         <w:drawing>
           <wp:inline distT="0" distB="0" distL="0" distR="0">
-            <wp:extent cx="5400675" cy="4438650"/>
+            <wp:extent cx="5400675" cy="3219450"/>
             <wp:effectExtent t="0" r="0" b="0" l="0"/>
             <wp:docPr id="1" name="boitier_v4_closed.png" descr="boitier_v4_closed.png" title="boitier_v4_closed.png"/>
             <wp:cNvGraphicFramePr>
@@ -18863,7 +18863,7 @@
                   <pic:spPr bwMode="auto">
                     <a:xfrm>
                       <a:off x="0" y="0"/>
-                      <a:ext cx="5400675" cy="4438650"/>
+                      <a:ext cx="5400675" cy="3219450"/>
                     </a:xfrm>
                     <a:prstGeom prst="rect">
                       <a:avLst/>
@@ -18889,7 +18889,7 @@
           <w:sz w:val="14"/>
           <w:szCs w:val="14"/>
         </w:rPr>
-        <w:t xml:space="preserve">Fig. 5 - Boitier v5, galet integral (rendu CAO), 4 HP + radiateurs passifs, PA-CF.</w:t>
+        <w:t xml:space="preserve">Fig. 5 - Boitier v6, style JBL (rendu CAO) : facade 2 HP, radiateurs de basse + logo DOMOKAMI aux bouts.</w:t>
       </w:r>
     </w:p>
     <w:p>
@@ -18927,7 +18927,7 @@
           <w:sz w:val="17"/>
           <w:szCs w:val="17"/>
         </w:rPr>
-        <w:t xml:space="preserve">Le boitier adopte une forme de galet integral de 129 x 98 mm pour 69 mm de hauteur, dont TOUTES les aretes sont adoucies (fillet 12 mm, coins R36) : un vrai galet doux. Le capot et le bac se ferment par une levre peripherique en press-fit : aucune vis n'est visible sur le dessus, seule une encoche laterale discrete permet le demontage. L'inspiration puise dans la tradition Dieter Rams / Braun : minimalisme, fonction evidente, absence totale d'ornement superflu.</w:t>
+        <w:t xml:space="preserve">Le boitier adopte un format plat et large inspire des enceintes portables JBL (Go / Clip) : 129 x 98 mm pour seulement 58 mm de hauteur, aux aretes adoucies (fillet 7 mm). Le capot et le bac se ferment par une levre peripherique en press-fit : aucune vis visible, seule une encoche laterale permet le demontage. L'inspiration puise dans la tradition Dieter Rams / Braun : minimalisme, fonction evidente, absence totale d'ornement superflu.</w:t>
       </w:r>
     </w:p>
     <w:p>
@@ -18941,7 +18941,7 @@
           <w:sz w:val="17"/>
           <w:szCs w:val="17"/>
         </w:rPr>
-        <w:t xml:space="preserve">Imprime en PA-CF, le boitier est un caisson acoustique ETANCHE (sans events). Il loge QUATRE haut-parleurs de 40 mm : deux pleine-bande actifs en facade (front-firing) et deux radiateurs passifs a l'arriere qui renforcent les basses par la pression interne (aucun cablage, electronique inchangee). Les grilles hexagonales sont a plat, sans cercle apparent (HP montes par l'interieur). L'anneau LED WS2812, sous le capot, forme une couronne lumineuse autour de la molette centrale.</w:t>
+        <w:t xml:space="preserve">Imprime en PA-CF, le boitier est un caisson acoustique ETANCHE (sans events). Il loge QUATRE haut-parleurs de 40 mm : deux pleine-bande actifs en FACADE (2 grilles rondes) et deux RADIATEURS PASSIFS sur les deux BOUTS (gauche/droite) qui renforcent les basses par la pression interne (aucun cablage, electronique inchangee). Chaque bout porte le logo DOMOKAMI en relief, a la maniere du logo JBL sur la membrane de basse. L'USB-C est seul a l'arriere : plus aucun chevauchement avec un haut-parleur.</w:t>
       </w:r>
     </w:p>
     <w:p>
@@ -18965,7 +18965,7 @@
           <w:sz w:val="17"/>
           <w:szCs w:val="17"/>
         </w:rPr>
-        <w:t xml:space="preserve">La molette centrale (encodeur EC11 a montage panneau + anneau LED) tombe sous le doigt ; le volume interne du galet et les radiateurs passifs donnent une assise de basses inhabituelle pour ce format. Prevoir les 4 joints TPU (etancheite) pour en profiter pleinement.</w:t>
+        <w:t xml:space="preserve">La molette centrale (encodeur EC11 a montage panneau + anneau LED) tombe sous le doigt ; le volume interne et les radiateurs passifs des extremites donnent une assise de basses inhabituelle pour ce format compact. Prevoir les 4 joints TPU (etancheite) pour en profiter pleinement.</w:t>
       </w:r>
     </w:p>
     <w:tbl>
@@ -19090,7 +19090,7 @@
                       <w:sz w:val="17"/>
                       <w:szCs w:val="17"/>
                     </w:rPr>
-                    <w:t xml:space="preserve">129 x 98 x 69 mm</w:t>
+                    <w:t xml:space="preserve">129 x 98 x 58 mm</w:t>
                   </w:r>
                 </w:p>
               </w:tc>
@@ -19175,7 +19175,7 @@
                       <w:sz w:val="16"/>
                       <w:szCs w:val="16"/>
                     </w:rPr>
-                    <w:t xml:space="preserve">Arrondi</w:t>
+                    <w:t xml:space="preserve">Style</w:t>
                   </w:r>
                 </w:p>
               </w:tc>
@@ -19202,7 +19202,7 @@
                       <w:sz w:val="17"/>
                       <w:szCs w:val="17"/>
                     </w:rPr>
-                    <w:t xml:space="preserve">fillet 12 / R36</w:t>
+                    <w:t xml:space="preserve">plat &amp; large (JBL)</w:t>
                   </w:r>
                 </w:p>
               </w:tc>
@@ -19258,7 +19258,7 @@
                       <w:sz w:val="17"/>
                       <w:szCs w:val="17"/>
                     </w:rPr>
-                    <w:t xml:space="preserve">2,6 / 7,0 mm</w:t>
+                    <w:t xml:space="preserve">2,6 / 5,0 mm</w:t>
                   </w:r>
                 </w:p>
               </w:tc>
@@ -19287,7 +19287,7 @@
                       <w:sz w:val="16"/>
                       <w:szCs w:val="16"/>
                     </w:rPr>
-                    <w:t xml:space="preserve">Forme</w:t>
+                    <w:t xml:space="preserve">Coins</w:t>
                   </w:r>
                 </w:p>
               </w:tc>
@@ -19314,7 +19314,7 @@
                       <w:sz w:val="17"/>
                       <w:szCs w:val="17"/>
                     </w:rPr>
-                    <w:t xml:space="preserve">galet integral</w:t>
+                    <w:t xml:space="preserve">R24, bords R7</w:t>
                   </w:r>
                 </w:p>
               </w:tc>
@@ -20091,7 +20091,7 @@
       <w:r>
         <w:drawing>
           <wp:inline distT="0" distB="0" distL="0" distR="0">
-            <wp:extent cx="5400675" cy="5048250"/>
+            <wp:extent cx="5400675" cy="3676650"/>
             <wp:effectExtent t="0" r="0" b="0" l="0"/>
             <wp:docPr id="1" name="boitier_v4_eclate.png" descr="boitier_v4_eclate.png" title="boitier_v4_eclate.png"/>
             <wp:cNvGraphicFramePr>
@@ -20116,7 +20116,7 @@
                   <pic:spPr bwMode="auto">
                     <a:xfrm>
                       <a:off x="0" y="0"/>
-                      <a:ext cx="5400675" cy="5048250"/>
+                      <a:ext cx="5400675" cy="3676650"/>
                     </a:xfrm>
                     <a:prstGeom prst="rect">
                       <a:avLst/>
@@ -20142,7 +20142,7 @@
           <w:sz w:val="14"/>
           <w:szCs w:val="14"/>
         </w:rPr>
-        <w:t xml:space="preserve">Fig. 6 - Vue eclatee du boitier v5 : capot a molette + bac (2 HP facade, 2 radiateurs arriere).</w:t>
+        <w:t xml:space="preserve">Fig. 6 - Vue eclatee du boitier v6 : capot a molette + bac (2 HP facade, 2 radiateurs aux bouts).</w:t>
       </w:r>
     </w:p>
     <w:tbl>
@@ -20275,7 +20275,7 @@
                             <w:sz w:val="16"/>
                             <w:szCs w:val="16"/>
                           </w:rPr>
-                          <w:t xml:space="preserve">1. Capot galet</w:t>
+                          <w:t xml:space="preserve">1. Capot plat</w:t>
                         </w:r>
                       </w:p>
                     </w:tc>
@@ -20582,7 +20582,7 @@
                             <w:sz w:val="17"/>
                             <w:szCs w:val="17"/>
                           </w:rPr>
-                          <w:t xml:space="preserve">40 mm plein-bande, facade +Y, montes par l'interieur</w:t>
+                          <w:t xml:space="preserve">40 mm plein-bande, facade +Y, 2 grilles rondes</w:t>
                         </w:r>
                       </w:p>
                     </w:tc>
@@ -20638,7 +20638,7 @@
                             <w:sz w:val="17"/>
                             <w:szCs w:val="17"/>
                           </w:rPr>
-                          <w:t xml:space="preserve">40 mm passifs, arriere -Y, renfort de basses (sans cablage)</w:t>
+                          <w:t xml:space="preserve">40 mm passifs, sur les 2 bouts +-X, logo DOMOKAMI relief</w:t>
                         </w:r>
                       </w:p>
                     </w:tc>
@@ -20694,7 +20694,7 @@
                             <w:sz w:val="17"/>
                             <w:szCs w:val="17"/>
                           </w:rPr>
-                          <w:t xml:space="preserve">PA-CF, entretoises MK1-MK4, USB-C (sur J2), pieds silicone</w:t>
+                          <w:t xml:space="preserve">PA-CF, entretoises MK1-MK4, USB-C seul a l'arriere</w:t>
                         </w:r>
                       </w:p>
                     </w:tc>
@@ -20863,7 +20863,7 @@
                             <w:sz w:val="17"/>
                             <w:szCs w:val="17"/>
                           </w:rPr>
-                          <w:t xml:space="preserve">2 actifs + 2 radiateurs passifs</w:t>
+                          <w:t xml:space="preserve">2 actifs facade + 2 radiateurs bouts</w:t>
                         </w:r>
                       </w:p>
                     </w:tc>
@@ -20892,7 +20892,7 @@
                             <w:sz w:val="16"/>
                             <w:szCs w:val="16"/>
                           </w:rPr>
-                          <w:t xml:space="preserve">Radiateurs passifs</w:t>
+                          <w:t xml:space="preserve">Radiateurs sur les bouts</w:t>
                         </w:r>
                       </w:p>
                     </w:tc>
@@ -20919,7 +20919,7 @@
                             <w:sz w:val="17"/>
                             <w:szCs w:val="17"/>
                           </w:rPr>
-                          <w:t xml:space="preserve">reflexion de basse (pression interne)</w:t>
+                          <w:t xml:space="preserve">reflexion de basse (style JBL)</w:t>
                         </w:r>
                       </w:p>
                     </w:tc>
@@ -21060,7 +21060,7 @@
                             <w:sz w:val="16"/>
                             <w:szCs w:val="16"/>
                           </w:rPr>
-                          <w:t xml:space="preserve">Montage HP par l'interieur</w:t>
+                          <w:t xml:space="preserve">USB-C isole a l'arriere</w:t>
                         </w:r>
                       </w:p>
                     </w:tc>
@@ -21087,7 +21087,7 @@
                             <w:sz w:val="17"/>
                             <w:szCs w:val="17"/>
                           </w:rPr>
-                          <w:t xml:space="preserve">facade nette, sans cercle</w:t>
+                          <w:t xml:space="preserve">plus de chevauchement avec un HP</w:t>
                         </w:r>
                       </w:p>
                     </w:tc>
@@ -21116,7 +21116,7 @@
                             <w:sz w:val="16"/>
                             <w:szCs w:val="16"/>
                           </w:rPr>
-                          <w:t xml:space="preserve">Coque galet PA-CF</w:t>
+                          <w:t xml:space="preserve">Coque PA-CF plate</w:t>
                         </w:r>
                       </w:p>
                     </w:tc>
@@ -21472,7 +21472,7 @@
                 <w:sz w:val="16"/>
                 <w:szCs w:val="16"/>
               </w:rPr>
-              <w:t xml:space="preserve">Capot (v5_top)</w:t>
+              <w:t xml:space="preserve">Capot (v6_top)</w:t>
             </w:r>
           </w:p>
         </w:tc>
@@ -21582,7 +21582,7 @@
                 <w:sz w:val="16"/>
                 <w:szCs w:val="16"/>
               </w:rPr>
-              <w:t xml:space="preserve">Bac (v5_base)</w:t>
+              <w:t xml:space="preserve">Bac (v6_base)</w:t>
             </w:r>
           </w:p>
         </w:tc>
@@ -21663,7 +21663,7 @@
                 <w:sz w:val="16"/>
                 <w:szCs w:val="16"/>
               </w:rPr>
-              <w:t xml:space="preserve">Galet etanche, 4 HP, USB-C, entretoises</w:t>
+              <w:t xml:space="preserve">Plat JBL, 4 HP, USB-C, entretoises</w:t>
             </w:r>
           </w:p>
         </w:tc>
@@ -21773,7 +21773,7 @@
                 <w:sz w:val="16"/>
                 <w:szCs w:val="16"/>
               </w:rPr>
-              <w:t xml:space="preserve">v5_speaker_gasket, compression</w:t>
+              <w:t xml:space="preserve">v6_speaker_gasket, compression</w:t>
             </w:r>
           </w:p>
         </w:tc>
@@ -22213,7 +22213,7 @@
                 <w:sz w:val="16"/>
                 <w:szCs w:val="16"/>
               </w:rPr>
-              <w:t xml:space="preserve">Arriere, renfort de basses</w:t>
+              <w:t xml:space="preserve">Sur les bouts, logo DOMOKAMI</w:t>
             </w:r>
           </w:p>
         </w:tc>
@@ -22725,7 +22725,7 @@
                 <w:sz w:val="17"/>
                 <w:szCs w:val="17"/>
               </w:rPr>
-              <w:t xml:space="preserve">v5_base</w:t>
+              <w:t xml:space="preserve">v6_base</w:t>
             </w:r>
           </w:p>
         </w:tc>
@@ -22752,7 +22752,7 @@
                 <w:sz w:val="16"/>
                 <w:szCs w:val="16"/>
               </w:rPr>
-              <w:t xml:space="preserve">Bac galet : 4 HP, USB-C, entretoises, etanche</w:t>
+              <w:t xml:space="preserve">Bac plat JBL : 4 HP, USB-C, entretoises</w:t>
             </w:r>
           </w:p>
         </w:tc>
@@ -22773,7 +22773,7 @@
             </w:tcMar>
           </w:tcPr>
           <w:p>
-            <w:hyperlink w:history="1" r:id="rIddypxz5mkzw19yydyiyshq">
+            <w:hyperlink w:history="1" r:id="rIdgyibsh9zj7bbuswxjg8t-">
               <w:r>
                 <w:rPr>
                   <w:rFonts w:ascii="Courier New" w:cs="Courier New" w:eastAsia="Courier New" w:hAnsi="Courier New"/>
@@ -22782,7 +22782,7 @@
                   <w:szCs w:val="14"/>
                   <w:u w:val="single"/>
                 </w:rPr>
-                <w:t xml:space="preserve">v5_base.stl</w:t>
+                <w:t xml:space="preserve">v6_base.stl</w:t>
               </w:r>
             </w:hyperlink>
           </w:p>
@@ -22804,7 +22804,7 @@
             </w:tcMar>
           </w:tcPr>
           <w:p>
-            <w:hyperlink w:history="1" r:id="rIdbo2xqgdtlwzk8v4tbqt-v">
+            <w:hyperlink w:history="1" r:id="rIdfb4ereunhvewygi01vyc2">
               <w:r>
                 <w:rPr>
                   <w:rFonts w:ascii="Courier New" w:cs="Courier New" w:eastAsia="Courier New" w:hAnsi="Courier New"/>
@@ -22813,7 +22813,7 @@
                   <w:szCs w:val="14"/>
                   <w:u w:val="single"/>
                 </w:rPr>
-                <w:t xml:space="preserve">v5_base.step</w:t>
+                <w:t xml:space="preserve">v6_base.step</w:t>
               </w:r>
             </w:hyperlink>
           </w:p>
@@ -22844,7 +22844,7 @@
                 <w:sz w:val="17"/>
                 <w:szCs w:val="17"/>
               </w:rPr>
-              <w:t xml:space="preserve">v5_top</w:t>
+              <w:t xml:space="preserve">v6_top</w:t>
             </w:r>
           </w:p>
         </w:tc>
@@ -22871,7 +22871,7 @@
                 <w:sz w:val="16"/>
                 <w:szCs w:val="16"/>
               </w:rPr>
-              <w:t xml:space="preserve">Capot : molette, anneau LED, micro, marquage</w:t>
+              <w:t xml:space="preserve">Capot : molette, anneau LED, micro</w:t>
             </w:r>
           </w:p>
         </w:tc>
@@ -22892,7 +22892,7 @@
             </w:tcMar>
           </w:tcPr>
           <w:p>
-            <w:hyperlink w:history="1" r:id="rId2w_3wxweatqeetg1yop0j">
+            <w:hyperlink w:history="1" r:id="rIdlungdee8mjft-x-zy3yt8">
               <w:r>
                 <w:rPr>
                   <w:rFonts w:ascii="Courier New" w:cs="Courier New" w:eastAsia="Courier New" w:hAnsi="Courier New"/>
@@ -22901,7 +22901,7 @@
                   <w:szCs w:val="14"/>
                   <w:u w:val="single"/>
                 </w:rPr>
-                <w:t xml:space="preserve">v5_top.stl</w:t>
+                <w:t xml:space="preserve">v6_top.stl</w:t>
               </w:r>
             </w:hyperlink>
           </w:p>
@@ -22923,7 +22923,7 @@
             </w:tcMar>
           </w:tcPr>
           <w:p>
-            <w:hyperlink w:history="1" r:id="rIddhxt1is3wnxvzkeeygtbq">
+            <w:hyperlink w:history="1" r:id="rIdf0axykxoeyqgvx_i-599u">
               <w:r>
                 <w:rPr>
                   <w:rFonts w:ascii="Courier New" w:cs="Courier New" w:eastAsia="Courier New" w:hAnsi="Courier New"/>
@@ -22932,7 +22932,7 @@
                   <w:szCs w:val="14"/>
                   <w:u w:val="single"/>
                 </w:rPr>
-                <w:t xml:space="preserve">v5_top.step</w:t>
+                <w:t xml:space="preserve">v6_top.step</w:t>
               </w:r>
             </w:hyperlink>
           </w:p>
@@ -22963,7 +22963,7 @@
                 <w:sz w:val="17"/>
                 <w:szCs w:val="17"/>
               </w:rPr>
-              <w:t xml:space="preserve">v5_speaker_gasket</w:t>
+              <w:t xml:space="preserve">v6_speaker_gasket</w:t>
             </w:r>
           </w:p>
         </w:tc>
@@ -23011,7 +23011,7 @@
             </w:tcMar>
           </w:tcPr>
           <w:p>
-            <w:hyperlink w:history="1" r:id="rId5jjnlrj4z-lzhzwokhjl6">
+            <w:hyperlink w:history="1" r:id="rIdbrcfhobwiq6c29v2xxjnl">
               <w:r>
                 <w:rPr>
                   <w:rFonts w:ascii="Courier New" w:cs="Courier New" w:eastAsia="Courier New" w:hAnsi="Courier New"/>
@@ -23020,7 +23020,7 @@
                   <w:szCs w:val="14"/>
                   <w:u w:val="single"/>
                 </w:rPr>
-                <w:t xml:space="preserve">v5_speaker_gasket.stl</w:t>
+                <w:t xml:space="preserve">v6_speaker_gasket.stl</w:t>
               </w:r>
             </w:hyperlink>
           </w:p>
@@ -23042,7 +23042,7 @@
             </w:tcMar>
           </w:tcPr>
           <w:p>
-            <w:hyperlink w:history="1" r:id="rIdmcnzctmjs7jggwsvw3qes">
+            <w:hyperlink w:history="1" r:id="rId7wkf4b7zdsvz-azj04ig8">
               <w:r>
                 <w:rPr>
                   <w:rFonts w:ascii="Courier New" w:cs="Courier New" w:eastAsia="Courier New" w:hAnsi="Courier New"/>
@@ -23051,7 +23051,7 @@
                   <w:szCs w:val="14"/>
                   <w:u w:val="single"/>
                 </w:rPr>
-                <w:t xml:space="preserve">v5_speaker_gasket.step</w:t>
+                <w:t xml:space="preserve">v6_speaker_gasket.step</w:t>
               </w:r>
             </w:hyperlink>
           </w:p>
@@ -23104,7 +23104,7 @@
             </w:tcMar>
           </w:tcPr>
           <w:p>
-            <w:hyperlink w:history="1" r:id="rIdzcmtkq0h0yhjt4dfbk9y2">
+            <w:hyperlink w:history="1" r:id="rIdglnnbk68tzwo6olxyocl_">
               <w:r>
                 <w:rPr>
                   <w:rFonts w:ascii="Courier New" w:cs="Courier New" w:eastAsia="Courier New" w:hAnsi="Courier New"/>
@@ -25979,7 +25979,7 @@
             </w:tcMar>
           </w:tcPr>
           <w:p>
-            <w:hyperlink w:history="1" r:id="rId2akhzb-0r6u5h4jxlx32r">
+            <w:hyperlink w:history="1" r:id="rId8chpdjd3rzz8ebsvim2ob">
               <w:r>
                 <w:rPr>
                   <w:rFonts w:ascii="Courier New" w:cs="Courier New" w:eastAsia="Courier New" w:hAnsi="Courier New"/>

</xml_diff>

<commit_message>
feat: ampli externe 4 voies (LOTHYE) -> 4 HP ACTIFS
L'utilisateur passe a un ampli 4 voies (2x PAM8403). Le PAM8403 est 2 voies :
la carte "4 voies" = 2x PAM8403. Source stereo dupliquee sur 4 HP actifs.

PCB:
- retire le PAM8403 soude (U3) + les 2 connecteurs HP embarques
- ajoute J3 (alim 5V de l'ampli externe, gated par Q2/GPIO47)
- l'audio sort par le jack 3.5mm J1 (deja cable AUDIO_L/R) -> entree ampli
- DRC: 0 violation ; rendu PCB regenere

Docs (DOCX + PDF):
- boitier v6 : 4 HP ACTIFS (2 facade + 2 bouts), plus de radiateurs passifs
- ampli externe 4 voies decrit ; Fig. 2 (PCB) mise a jour

Co-Authored-By: Claude Opus 4.8 <noreply@anthropic.com>
</commit_message>
<xml_diff>
--- a/docs/S3 Salle de Bain - Rapport Technique v3.docx
+++ b/docs/S3 Salle de Bain - Rapport Technique v3.docx
@@ -628,7 +628,7 @@
             </w:r>
           </w:p>
           <w:p>
-            <w:hyperlink w:history="1" r:id="rIdtypto7cezzurlx8mqhwwp">
+            <w:hyperlink w:history="1" r:id="rId6uka6mkzvp7rsi4xcyetb">
               <w:r>
                 <w:rPr>
                   <w:rFonts w:ascii="Courier New" w:cs="Courier New" w:eastAsia="Courier New" w:hAnsi="Courier New"/>
@@ -1762,7 +1762,7 @@
                 <w:sz w:val="15"/>
                 <w:szCs w:val="15"/>
               </w:rPr>
-              <w:t xml:space="preserve">Boitier plat style JBL, 4 HP, radiateurs de basse aux extremites (logo DOMOKAMI)</w:t>
+              <w:t xml:space="preserve">Boitier plat style JBL, 4 HP actifs (ampli externe 4 voies), logo DOMOKAMI aux bouts</w:t>
             </w:r>
           </w:p>
         </w:tc>
@@ -2939,7 +2939,7 @@
       <w:r>
         <w:drawing>
           <wp:inline distT="0" distB="0" distL="0" distR="0">
-            <wp:extent cx="5762625" cy="3276600"/>
+            <wp:extent cx="5762625" cy="4352925"/>
             <wp:effectExtent t="0" r="0" b="0" l="0"/>
             <wp:docPr id="1" name="pcb_render.png" descr="pcb_render.png" title="pcb_render.png"/>
             <wp:cNvGraphicFramePr>
@@ -2964,7 +2964,7 @@
                   <pic:spPr bwMode="auto">
                     <a:xfrm>
                       <a:off x="0" y="0"/>
-                      <a:ext cx="5762625" cy="3276600"/>
+                      <a:ext cx="5762625" cy="4352925"/>
                     </a:xfrm>
                     <a:prstGeom prst="rect">
                       <a:avLst/>
@@ -7218,7 +7218,7 @@
             </w:tcMar>
           </w:tcPr>
           <w:p>
-            <w:hyperlink w:history="1" r:id="rIdntn3ijkmeztecovtkht-y">
+            <w:hyperlink w:history="1" r:id="rIdqzd2zfrnc0cjhnatdg8bm">
               <w:r>
                 <w:rPr>
                   <w:rFonts w:ascii="Courier New" w:cs="Courier New" w:eastAsia="Courier New" w:hAnsi="Courier New"/>
@@ -7333,7 +7333,7 @@
             </w:tcMar>
           </w:tcPr>
           <w:p>
-            <w:hyperlink w:history="1" r:id="rIdkohfkvtf945k_kqdnqiii">
+            <w:hyperlink w:history="1" r:id="rIdjiyzxhfpn8donk9pgbbk4">
               <w:r>
                 <w:rPr>
                   <w:rFonts w:ascii="Courier New" w:cs="Courier New" w:eastAsia="Courier New" w:hAnsi="Courier New"/>
@@ -7448,7 +7448,7 @@
             </w:tcMar>
           </w:tcPr>
           <w:p>
-            <w:hyperlink w:history="1" r:id="rIdglroaw8hs539-awitf55r">
+            <w:hyperlink w:history="1" r:id="rIdscmzxknd40jbrtgqqcr71">
               <w:r>
                 <w:rPr>
                   <w:rFonts w:ascii="Courier New" w:cs="Courier New" w:eastAsia="Courier New" w:hAnsi="Courier New"/>
@@ -7563,7 +7563,7 @@
             </w:tcMar>
           </w:tcPr>
           <w:p>
-            <w:hyperlink w:history="1" r:id="rIdrm-j8qdrzvexcbohkllt3">
+            <w:hyperlink w:history="1" r:id="rIdlsxyf9jmndcwmbqylubiv">
               <w:r>
                 <w:rPr>
                   <w:rFonts w:ascii="Courier New" w:cs="Courier New" w:eastAsia="Courier New" w:hAnsi="Courier New"/>
@@ -7678,7 +7678,7 @@
             </w:tcMar>
           </w:tcPr>
           <w:p>
-            <w:hyperlink w:history="1" r:id="rId80kl6zfvyyfygnfkk4sfg">
+            <w:hyperlink w:history="1" r:id="rId6guehwbqiw2semglwmndq">
               <w:r>
                 <w:rPr>
                   <w:rFonts w:ascii="Courier New" w:cs="Courier New" w:eastAsia="Courier New" w:hAnsi="Courier New"/>
@@ -7793,7 +7793,7 @@
             </w:tcMar>
           </w:tcPr>
           <w:p>
-            <w:hyperlink w:history="1" r:id="rIdgqvlb9pom5wyhe9tl7src">
+            <w:hyperlink w:history="1" r:id="rIdsf5e22hvd6wdplykyzi63">
               <w:r>
                 <w:rPr>
                   <w:rFonts w:ascii="Courier New" w:cs="Courier New" w:eastAsia="Courier New" w:hAnsi="Courier New"/>
@@ -7908,7 +7908,7 @@
             </w:tcMar>
           </w:tcPr>
           <w:p>
-            <w:hyperlink w:history="1" r:id="rIdqxp7mbz4n9zapwo6cs8oh">
+            <w:hyperlink w:history="1" r:id="rIdohrshas331o_o1pip0nto">
               <w:r>
                 <w:rPr>
                   <w:rFonts w:ascii="Courier New" w:cs="Courier New" w:eastAsia="Courier New" w:hAnsi="Courier New"/>
@@ -8023,7 +8023,7 @@
             </w:tcMar>
           </w:tcPr>
           <w:p>
-            <w:hyperlink w:history="1" r:id="rIdqfkw20rgpchs5pzsfzpas">
+            <w:hyperlink w:history="1" r:id="rIduaaixyxujc3nbhjyurow0">
               <w:r>
                 <w:rPr>
                   <w:rFonts w:ascii="Courier New" w:cs="Courier New" w:eastAsia="Courier New" w:hAnsi="Courier New"/>
@@ -8138,7 +8138,7 @@
             </w:tcMar>
           </w:tcPr>
           <w:p>
-            <w:hyperlink w:history="1" r:id="rId_ufvwcumyynbgjay75f1s">
+            <w:hyperlink w:history="1" r:id="rIdv0lin79l20lwtbuku8nvy">
               <w:r>
                 <w:rPr>
                   <w:rFonts w:ascii="Courier New" w:cs="Courier New" w:eastAsia="Courier New" w:hAnsi="Courier New"/>
@@ -8253,7 +8253,7 @@
             </w:tcMar>
           </w:tcPr>
           <w:p>
-            <w:hyperlink w:history="1" r:id="rIdprgph5sn4u0dwxfefim7e">
+            <w:hyperlink w:history="1" r:id="rId_k0-v50o7kgzewmbcz_0g">
               <w:r>
                 <w:rPr>
                   <w:rFonts w:ascii="Courier New" w:cs="Courier New" w:eastAsia="Courier New" w:hAnsi="Courier New"/>
@@ -8368,7 +8368,7 @@
             </w:tcMar>
           </w:tcPr>
           <w:p>
-            <w:hyperlink w:history="1" r:id="rIdysw3zhstlzyo9aaa4qemq">
+            <w:hyperlink w:history="1" r:id="rIdou6l1bdow8nnaajxwre6y">
               <w:r>
                 <w:rPr>
                   <w:rFonts w:ascii="Courier New" w:cs="Courier New" w:eastAsia="Courier New" w:hAnsi="Courier New"/>
@@ -8483,7 +8483,7 @@
             </w:tcMar>
           </w:tcPr>
           <w:p>
-            <w:hyperlink w:history="1" r:id="rId7lju8dvp_msxnyyhashmx">
+            <w:hyperlink w:history="1" r:id="rIdamlzxxfu_xy6e0w-bcrae">
               <w:r>
                 <w:rPr>
                   <w:rFonts w:ascii="Courier New" w:cs="Courier New" w:eastAsia="Courier New" w:hAnsi="Courier New"/>
@@ -8598,7 +8598,7 @@
             </w:tcMar>
           </w:tcPr>
           <w:p>
-            <w:hyperlink w:history="1" r:id="rId3vdq0nwbtrtizjcjzssfa">
+            <w:hyperlink w:history="1" r:id="rIdi4jcseotnfygy6ydktqm9">
               <w:r>
                 <w:rPr>
                   <w:rFonts w:ascii="Courier New" w:cs="Courier New" w:eastAsia="Courier New" w:hAnsi="Courier New"/>
@@ -8713,7 +8713,7 @@
             </w:tcMar>
           </w:tcPr>
           <w:p>
-            <w:hyperlink w:history="1" r:id="rId7ar-ldyoyiqqgan79nqek">
+            <w:hyperlink w:history="1" r:id="rIdyjmozh4re8eawaskx9z8b">
               <w:r>
                 <w:rPr>
                   <w:rFonts w:ascii="Courier New" w:cs="Courier New" w:eastAsia="Courier New" w:hAnsi="Courier New"/>
@@ -8828,7 +8828,7 @@
             </w:tcMar>
           </w:tcPr>
           <w:p>
-            <w:hyperlink w:history="1" r:id="rIdqzevwug_xis2obfyvgeta">
+            <w:hyperlink w:history="1" r:id="rIdjscab45laqktzveuetkmk">
               <w:r>
                 <w:rPr>
                   <w:rFonts w:ascii="Courier New" w:cs="Courier New" w:eastAsia="Courier New" w:hAnsi="Courier New"/>
@@ -8943,7 +8943,7 @@
             </w:tcMar>
           </w:tcPr>
           <w:p>
-            <w:hyperlink w:history="1" r:id="rIdll-b3mshtyooqru7wzoa0">
+            <w:hyperlink w:history="1" r:id="rIdu8mlyda0ywlr0ak5ynpap">
               <w:r>
                 <w:rPr>
                   <w:rFonts w:ascii="Courier New" w:cs="Courier New" w:eastAsia="Courier New" w:hAnsi="Courier New"/>
@@ -11925,7 +11925,7 @@
                 <w:sz w:val="16"/>
                 <w:szCs w:val="16"/>
               </w:rPr>
-              <w:t xml:space="preserve">Active l'ampli (GPIO47 - PAM8403 SHDN)</w:t>
+              <w:t xml:space="preserve">Active l'ampli (GPIO47 -&gt; alim 5V ampli externe J3)</w:t>
             </w:r>
           </w:p>
         </w:tc>
@@ -18828,7 +18828,7 @@
           <w:sz w:val="19"/>
           <w:szCs w:val="19"/>
         </w:rPr>
-        <w:t xml:space="preserve">Boitier plat style JBL, 4 HP, radiateurs de basse aux extremites (logo DOMOKAMI)</w:t>
+        <w:t xml:space="preserve">Boitier plat style JBL, 4 HP actifs (ampli externe 4 voies), logo DOMOKAMI aux bouts</w:t>
       </w:r>
     </w:p>
     <w:p>
@@ -18889,7 +18889,7 @@
           <w:sz w:val="14"/>
           <w:szCs w:val="14"/>
         </w:rPr>
-        <w:t xml:space="preserve">Fig. 5 - Boitier v6, style JBL (rendu CAO) : facade 2 HP, radiateurs de basse + logo DOMOKAMI aux bouts.</w:t>
+        <w:t xml:space="preserve">Fig. 5 - Boitier v6, style JBL (rendu CAO) : 4 HP actifs (facade + bouts) + logo DOMOKAMI aux bouts.</w:t>
       </w:r>
     </w:p>
     <w:p>
@@ -18941,7 +18941,7 @@
           <w:sz w:val="17"/>
           <w:szCs w:val="17"/>
         </w:rPr>
-        <w:t xml:space="preserve">Imprime en PA-CF, le boitier est un caisson acoustique ETANCHE (sans events). Il loge QUATRE haut-parleurs de 40 mm : deux pleine-bande actifs en FACADE (2 grilles rondes) et deux RADIATEURS PASSIFS sur les deux BOUTS (gauche/droite) qui renforcent les basses par la pression interne (aucun cablage, electronique inchangee). Chaque bout porte le logo DOMOKAMI en relief, a la maniere du logo JBL sur la membrane de basse. L'USB-C est seul a l'arriere : plus aucun chevauchement avec un haut-parleur.</w:t>
+        <w:t xml:space="preserve">Imprime en PA-CF, le boitier est un caisson acoustique ETANCHE (sans events). Il loge QUATRE haut-parleurs de 40 mm TOUS ACTIFS : deux en FACADE (2 grilles rondes) et deux sur les BOUTS (gauche/droite). Ils sont pilotes par un AMPLI EXTERNE 4 VOIES (LOTHYE, 2x PAM8403) : l'audio sort par le jack 3,5 mm, l'ampli est alimente en 5 V (connecteur J3) ; le PAM8403 soude sur le PCB n'est plus utilise. Chaque bout porte le logo DOMOKAMI en relief. L'USB-C est seul a l'arriere : plus aucun chevauchement avec un haut-parleur.</w:t>
       </w:r>
     </w:p>
     <w:p>
@@ -18965,7 +18965,7 @@
           <w:sz w:val="17"/>
           <w:szCs w:val="17"/>
         </w:rPr>
-        <w:t xml:space="preserve">La molette centrale (encodeur EC11 a montage panneau + anneau LED) tombe sous le doigt ; le volume interne et les radiateurs passifs des extremites donnent une assise de basses inhabituelle pour ce format compact. Prevoir les 4 joints TPU (etancheite) pour en profiter pleinement.</w:t>
+        <w:t xml:space="preserve">La molette centrale (encodeur EC11 a montage panneau + anneau LED) tombe sous le doigt ; le volume interne et les 4 HP actifs (caisson clos, suspension acoustique) donnent une assise de basses solide pour ce format compact. Prevoir les 4 joints TPU (etancheite) pour en profiter pleinement.</w:t>
       </w:r>
     </w:p>
     <w:tbl>
@@ -19794,7 +19794,7 @@
                       <w:sz w:val="17"/>
                       <w:szCs w:val="17"/>
                     </w:rPr>
-                    <w:t xml:space="preserve">4 x 40 mm (2+2)</w:t>
+                    <w:t xml:space="preserve">4 x 40 mm ACTIFS</w:t>
                   </w:r>
                 </w:p>
               </w:tc>
@@ -19823,7 +19823,7 @@
                       <w:sz w:val="16"/>
                       <w:szCs w:val="16"/>
                     </w:rPr>
-                    <w:t xml:space="preserve">Basses</w:t>
+                    <w:t xml:space="preserve">Ampli</w:t>
                   </w:r>
                 </w:p>
               </w:tc>
@@ -19850,7 +19850,7 @@
                       <w:sz w:val="17"/>
                       <w:szCs w:val="17"/>
                     </w:rPr>
-                    <w:t xml:space="preserve">2 radiateurs passifs</w:t>
+                    <w:t xml:space="preserve">externe 4 voies (J3 5V)</w:t>
                   </w:r>
                 </w:p>
               </w:tc>
@@ -20142,7 +20142,7 @@
           <w:sz w:val="14"/>
           <w:szCs w:val="14"/>
         </w:rPr>
-        <w:t xml:space="preserve">Fig. 6 - Vue eclatee du boitier v6 : capot a molette + bac (2 HP facade, 2 radiateurs aux bouts).</w:t>
+        <w:t xml:space="preserve">Fig. 6 - Vue eclatee du boitier v6 : capot a molette + bac (4 HP actifs : 2 facade + 2 bouts).</w:t>
       </w:r>
     </w:p>
     <w:tbl>
@@ -20526,7 +20526,7 @@
                             <w:sz w:val="17"/>
                             <w:szCs w:val="17"/>
                           </w:rPr>
-                          <w:t xml:space="preserve">ESP32-S3, PCM5102, ampli PAM8403 - carte 76,7 x 108 mm</w:t>
+                          <w:t xml:space="preserve">ESP32-S3, PCM5102, sortie ligne (jack) - carte 76,7 x 108 mm</w:t>
                         </w:r>
                       </w:p>
                     </w:tc>
@@ -20611,7 +20611,7 @@
                             <w:sz w:val="16"/>
                             <w:szCs w:val="16"/>
                           </w:rPr>
-                          <w:t xml:space="preserve">7. Radiateurs (x2)</w:t>
+                          <w:t xml:space="preserve">7. HP cotes (x2)</w:t>
                         </w:r>
                       </w:p>
                     </w:tc>
@@ -20638,7 +20638,7 @@
                             <w:sz w:val="17"/>
                             <w:szCs w:val="17"/>
                           </w:rPr>
-                          <w:t xml:space="preserve">40 mm passifs, sur les 2 bouts +-X, logo DOMOKAMI relief</w:t>
+                          <w:t xml:space="preserve">40 mm actifs, sur les 2 bouts +-X, logo DOMOKAMI relief</w:t>
                         </w:r>
                       </w:p>
                     </w:tc>
@@ -20836,7 +20836,7 @@
                             <w:sz w:val="16"/>
                             <w:szCs w:val="16"/>
                           </w:rPr>
-                          <w:t xml:space="preserve">4 haut-parleurs 40 mm</w:t>
+                          <w:t xml:space="preserve">4 HP 40 mm ACTIFS</w:t>
                         </w:r>
                       </w:p>
                     </w:tc>
@@ -20863,7 +20863,7 @@
                             <w:sz w:val="17"/>
                             <w:szCs w:val="17"/>
                           </w:rPr>
-                          <w:t xml:space="preserve">2 actifs facade + 2 radiateurs bouts</w:t>
+                          <w:t xml:space="preserve">2 facade + 2 bouts (cotes)</w:t>
                         </w:r>
                       </w:p>
                     </w:tc>
@@ -20892,7 +20892,7 @@
                             <w:sz w:val="16"/>
                             <w:szCs w:val="16"/>
                           </w:rPr>
-                          <w:t xml:space="preserve">Radiateurs sur les bouts</w:t>
+                          <w:t xml:space="preserve">Ampli externe 4 voies</w:t>
                         </w:r>
                       </w:p>
                     </w:tc>
@@ -20919,7 +20919,7 @@
                             <w:sz w:val="17"/>
                             <w:szCs w:val="17"/>
                           </w:rPr>
-                          <w:t xml:space="preserve">reflexion de basse (style JBL)</w:t>
+                          <w:t xml:space="preserve">LOTHYE (2x PAM8403), via jack + 5V</w:t>
                         </w:r>
                       </w:p>
                     </w:tc>
@@ -22773,7 +22773,7 @@
             </w:tcMar>
           </w:tcPr>
           <w:p>
-            <w:hyperlink w:history="1" r:id="rIdgyibsh9zj7bbuswxjg8t-">
+            <w:hyperlink w:history="1" r:id="rIdzuwmsonh6ceyyoi1tb5up">
               <w:r>
                 <w:rPr>
                   <w:rFonts w:ascii="Courier New" w:cs="Courier New" w:eastAsia="Courier New" w:hAnsi="Courier New"/>
@@ -22804,7 +22804,7 @@
             </w:tcMar>
           </w:tcPr>
           <w:p>
-            <w:hyperlink w:history="1" r:id="rIdfb4ereunhvewygi01vyc2">
+            <w:hyperlink w:history="1" r:id="rIdi8tdvfr1cyafk7flejuiv">
               <w:r>
                 <w:rPr>
                   <w:rFonts w:ascii="Courier New" w:cs="Courier New" w:eastAsia="Courier New" w:hAnsi="Courier New"/>
@@ -22892,7 +22892,7 @@
             </w:tcMar>
           </w:tcPr>
           <w:p>
-            <w:hyperlink w:history="1" r:id="rIdlungdee8mjft-x-zy3yt8">
+            <w:hyperlink w:history="1" r:id="rIdu7dcknxhczq4g2pcasloi">
               <w:r>
                 <w:rPr>
                   <w:rFonts w:ascii="Courier New" w:cs="Courier New" w:eastAsia="Courier New" w:hAnsi="Courier New"/>
@@ -22923,7 +22923,7 @@
             </w:tcMar>
           </w:tcPr>
           <w:p>
-            <w:hyperlink w:history="1" r:id="rIdf0axykxoeyqgvx_i-599u">
+            <w:hyperlink w:history="1" r:id="rIdywogefkld2_ouzptm_qbv">
               <w:r>
                 <w:rPr>
                   <w:rFonts w:ascii="Courier New" w:cs="Courier New" w:eastAsia="Courier New" w:hAnsi="Courier New"/>
@@ -23011,7 +23011,7 @@
             </w:tcMar>
           </w:tcPr>
           <w:p>
-            <w:hyperlink w:history="1" r:id="rIdbrcfhobwiq6c29v2xxjnl">
+            <w:hyperlink w:history="1" r:id="rIdtkipegv1s4s-_dbupnfbm">
               <w:r>
                 <w:rPr>
                   <w:rFonts w:ascii="Courier New" w:cs="Courier New" w:eastAsia="Courier New" w:hAnsi="Courier New"/>
@@ -23042,7 +23042,7 @@
             </w:tcMar>
           </w:tcPr>
           <w:p>
-            <w:hyperlink w:history="1" r:id="rId7wkf4b7zdsvz-azj04ig8">
+            <w:hyperlink w:history="1" r:id="rIdad_i-2k9fadh8ic0daair">
               <w:r>
                 <w:rPr>
                   <w:rFonts w:ascii="Courier New" w:cs="Courier New" w:eastAsia="Courier New" w:hAnsi="Courier New"/>
@@ -23104,7 +23104,7 @@
             </w:tcMar>
           </w:tcPr>
           <w:p>
-            <w:hyperlink w:history="1" r:id="rIdglnnbk68tzwo6olxyocl_">
+            <w:hyperlink w:history="1" r:id="rIdy2kzijv7fdgiqsg9flrbc">
               <w:r>
                 <w:rPr>
                   <w:rFonts w:ascii="Courier New" w:cs="Courier New" w:eastAsia="Courier New" w:hAnsi="Courier New"/>
@@ -25979,7 +25979,7 @@
             </w:tcMar>
           </w:tcPr>
           <w:p>
-            <w:hyperlink w:history="1" r:id="rId8chpdjd3rzz8ebsvim2ob">
+            <w:hyperlink w:history="1" r:id="rIdrso0quv2a_cbceijp61an">
               <w:r>
                 <w:rPr>
                   <w:rFonts w:ascii="Courier New" w:cs="Courier New" w:eastAsia="Courier New" w:hAnsi="Courier New"/>

</xml_diff>

<commit_message>
revert: retour a l'ancien PCB (PAM8403 soude 2 voies)
Annule la refonte ampli 4 voies (commit 6156e1e) : restaure le PAM8403
soude U3 + connecteurs HP1/HP2, retire J3. Docs (DOCX/PDF) revenues a la
version v6 coherente (2 HP actifs + 2 radiateurs passifs). Fichiers
restaures depuis ac44fe8.

Co-Authored-By: Claude Opus 4.8 <noreply@anthropic.com>
</commit_message>
<xml_diff>
--- a/docs/S3 Salle de Bain - Rapport Technique v3.docx
+++ b/docs/S3 Salle de Bain - Rapport Technique v3.docx
@@ -628,7 +628,7 @@
             </w:r>
           </w:p>
           <w:p>
-            <w:hyperlink w:history="1" r:id="rId6uka6mkzvp7rsi4xcyetb">
+            <w:hyperlink w:history="1" r:id="rIdtypto7cezzurlx8mqhwwp">
               <w:r>
                 <w:rPr>
                   <w:rFonts w:ascii="Courier New" w:cs="Courier New" w:eastAsia="Courier New" w:hAnsi="Courier New"/>
@@ -1762,7 +1762,7 @@
                 <w:sz w:val="15"/>
                 <w:szCs w:val="15"/>
               </w:rPr>
-              <w:t xml:space="preserve">Boitier plat style JBL, 4 HP actifs (ampli externe 4 voies), logo DOMOKAMI aux bouts</w:t>
+              <w:t xml:space="preserve">Boitier plat style JBL, 4 HP, radiateurs de basse aux extremites (logo DOMOKAMI)</w:t>
             </w:r>
           </w:p>
         </w:tc>
@@ -2939,7 +2939,7 @@
       <w:r>
         <w:drawing>
           <wp:inline distT="0" distB="0" distL="0" distR="0">
-            <wp:extent cx="5762625" cy="4352925"/>
+            <wp:extent cx="5762625" cy="3276600"/>
             <wp:effectExtent t="0" r="0" b="0" l="0"/>
             <wp:docPr id="1" name="pcb_render.png" descr="pcb_render.png" title="pcb_render.png"/>
             <wp:cNvGraphicFramePr>
@@ -2964,7 +2964,7 @@
                   <pic:spPr bwMode="auto">
                     <a:xfrm>
                       <a:off x="0" y="0"/>
-                      <a:ext cx="5762625" cy="4352925"/>
+                      <a:ext cx="5762625" cy="3276600"/>
                     </a:xfrm>
                     <a:prstGeom prst="rect">
                       <a:avLst/>
@@ -7218,7 +7218,7 @@
             </w:tcMar>
           </w:tcPr>
           <w:p>
-            <w:hyperlink w:history="1" r:id="rIdqzd2zfrnc0cjhnatdg8bm">
+            <w:hyperlink w:history="1" r:id="rIdntn3ijkmeztecovtkht-y">
               <w:r>
                 <w:rPr>
                   <w:rFonts w:ascii="Courier New" w:cs="Courier New" w:eastAsia="Courier New" w:hAnsi="Courier New"/>
@@ -7333,7 +7333,7 @@
             </w:tcMar>
           </w:tcPr>
           <w:p>
-            <w:hyperlink w:history="1" r:id="rIdjiyzxhfpn8donk9pgbbk4">
+            <w:hyperlink w:history="1" r:id="rIdkohfkvtf945k_kqdnqiii">
               <w:r>
                 <w:rPr>
                   <w:rFonts w:ascii="Courier New" w:cs="Courier New" w:eastAsia="Courier New" w:hAnsi="Courier New"/>
@@ -7448,7 +7448,7 @@
             </w:tcMar>
           </w:tcPr>
           <w:p>
-            <w:hyperlink w:history="1" r:id="rIdscmzxknd40jbrtgqqcr71">
+            <w:hyperlink w:history="1" r:id="rIdglroaw8hs539-awitf55r">
               <w:r>
                 <w:rPr>
                   <w:rFonts w:ascii="Courier New" w:cs="Courier New" w:eastAsia="Courier New" w:hAnsi="Courier New"/>
@@ -7563,7 +7563,7 @@
             </w:tcMar>
           </w:tcPr>
           <w:p>
-            <w:hyperlink w:history="1" r:id="rIdlsxyf9jmndcwmbqylubiv">
+            <w:hyperlink w:history="1" r:id="rIdrm-j8qdrzvexcbohkllt3">
               <w:r>
                 <w:rPr>
                   <w:rFonts w:ascii="Courier New" w:cs="Courier New" w:eastAsia="Courier New" w:hAnsi="Courier New"/>
@@ -7678,7 +7678,7 @@
             </w:tcMar>
           </w:tcPr>
           <w:p>
-            <w:hyperlink w:history="1" r:id="rId6guehwbqiw2semglwmndq">
+            <w:hyperlink w:history="1" r:id="rId80kl6zfvyyfygnfkk4sfg">
               <w:r>
                 <w:rPr>
                   <w:rFonts w:ascii="Courier New" w:cs="Courier New" w:eastAsia="Courier New" w:hAnsi="Courier New"/>
@@ -7793,7 +7793,7 @@
             </w:tcMar>
           </w:tcPr>
           <w:p>
-            <w:hyperlink w:history="1" r:id="rIdsf5e22hvd6wdplykyzi63">
+            <w:hyperlink w:history="1" r:id="rIdgqvlb9pom5wyhe9tl7src">
               <w:r>
                 <w:rPr>
                   <w:rFonts w:ascii="Courier New" w:cs="Courier New" w:eastAsia="Courier New" w:hAnsi="Courier New"/>
@@ -7908,7 +7908,7 @@
             </w:tcMar>
           </w:tcPr>
           <w:p>
-            <w:hyperlink w:history="1" r:id="rIdohrshas331o_o1pip0nto">
+            <w:hyperlink w:history="1" r:id="rIdqxp7mbz4n9zapwo6cs8oh">
               <w:r>
                 <w:rPr>
                   <w:rFonts w:ascii="Courier New" w:cs="Courier New" w:eastAsia="Courier New" w:hAnsi="Courier New"/>
@@ -8023,7 +8023,7 @@
             </w:tcMar>
           </w:tcPr>
           <w:p>
-            <w:hyperlink w:history="1" r:id="rIduaaixyxujc3nbhjyurow0">
+            <w:hyperlink w:history="1" r:id="rIdqfkw20rgpchs5pzsfzpas">
               <w:r>
                 <w:rPr>
                   <w:rFonts w:ascii="Courier New" w:cs="Courier New" w:eastAsia="Courier New" w:hAnsi="Courier New"/>
@@ -8138,7 +8138,7 @@
             </w:tcMar>
           </w:tcPr>
           <w:p>
-            <w:hyperlink w:history="1" r:id="rIdv0lin79l20lwtbuku8nvy">
+            <w:hyperlink w:history="1" r:id="rId_ufvwcumyynbgjay75f1s">
               <w:r>
                 <w:rPr>
                   <w:rFonts w:ascii="Courier New" w:cs="Courier New" w:eastAsia="Courier New" w:hAnsi="Courier New"/>
@@ -8253,7 +8253,7 @@
             </w:tcMar>
           </w:tcPr>
           <w:p>
-            <w:hyperlink w:history="1" r:id="rId_k0-v50o7kgzewmbcz_0g">
+            <w:hyperlink w:history="1" r:id="rIdprgph5sn4u0dwxfefim7e">
               <w:r>
                 <w:rPr>
                   <w:rFonts w:ascii="Courier New" w:cs="Courier New" w:eastAsia="Courier New" w:hAnsi="Courier New"/>
@@ -8368,7 +8368,7 @@
             </w:tcMar>
           </w:tcPr>
           <w:p>
-            <w:hyperlink w:history="1" r:id="rIdou6l1bdow8nnaajxwre6y">
+            <w:hyperlink w:history="1" r:id="rIdysw3zhstlzyo9aaa4qemq">
               <w:r>
                 <w:rPr>
                   <w:rFonts w:ascii="Courier New" w:cs="Courier New" w:eastAsia="Courier New" w:hAnsi="Courier New"/>
@@ -8483,7 +8483,7 @@
             </w:tcMar>
           </w:tcPr>
           <w:p>
-            <w:hyperlink w:history="1" r:id="rIdamlzxxfu_xy6e0w-bcrae">
+            <w:hyperlink w:history="1" r:id="rId7lju8dvp_msxnyyhashmx">
               <w:r>
                 <w:rPr>
                   <w:rFonts w:ascii="Courier New" w:cs="Courier New" w:eastAsia="Courier New" w:hAnsi="Courier New"/>
@@ -8598,7 +8598,7 @@
             </w:tcMar>
           </w:tcPr>
           <w:p>
-            <w:hyperlink w:history="1" r:id="rIdi4jcseotnfygy6ydktqm9">
+            <w:hyperlink w:history="1" r:id="rId3vdq0nwbtrtizjcjzssfa">
               <w:r>
                 <w:rPr>
                   <w:rFonts w:ascii="Courier New" w:cs="Courier New" w:eastAsia="Courier New" w:hAnsi="Courier New"/>
@@ -8713,7 +8713,7 @@
             </w:tcMar>
           </w:tcPr>
           <w:p>
-            <w:hyperlink w:history="1" r:id="rIdyjmozh4re8eawaskx9z8b">
+            <w:hyperlink w:history="1" r:id="rId7ar-ldyoyiqqgan79nqek">
               <w:r>
                 <w:rPr>
                   <w:rFonts w:ascii="Courier New" w:cs="Courier New" w:eastAsia="Courier New" w:hAnsi="Courier New"/>
@@ -8828,7 +8828,7 @@
             </w:tcMar>
           </w:tcPr>
           <w:p>
-            <w:hyperlink w:history="1" r:id="rIdjscab45laqktzveuetkmk">
+            <w:hyperlink w:history="1" r:id="rIdqzevwug_xis2obfyvgeta">
               <w:r>
                 <w:rPr>
                   <w:rFonts w:ascii="Courier New" w:cs="Courier New" w:eastAsia="Courier New" w:hAnsi="Courier New"/>
@@ -8943,7 +8943,7 @@
             </w:tcMar>
           </w:tcPr>
           <w:p>
-            <w:hyperlink w:history="1" r:id="rIdu8mlyda0ywlr0ak5ynpap">
+            <w:hyperlink w:history="1" r:id="rIdll-b3mshtyooqru7wzoa0">
               <w:r>
                 <w:rPr>
                   <w:rFonts w:ascii="Courier New" w:cs="Courier New" w:eastAsia="Courier New" w:hAnsi="Courier New"/>
@@ -11925,7 +11925,7 @@
                 <w:sz w:val="16"/>
                 <w:szCs w:val="16"/>
               </w:rPr>
-              <w:t xml:space="preserve">Active l'ampli (GPIO47 -&gt; alim 5V ampli externe J3)</w:t>
+              <w:t xml:space="preserve">Active l'ampli (GPIO47 - PAM8403 SHDN)</w:t>
             </w:r>
           </w:p>
         </w:tc>
@@ -18828,7 +18828,7 @@
           <w:sz w:val="19"/>
           <w:szCs w:val="19"/>
         </w:rPr>
-        <w:t xml:space="preserve">Boitier plat style JBL, 4 HP actifs (ampli externe 4 voies), logo DOMOKAMI aux bouts</w:t>
+        <w:t xml:space="preserve">Boitier plat style JBL, 4 HP, radiateurs de basse aux extremites (logo DOMOKAMI)</w:t>
       </w:r>
     </w:p>
     <w:p>
@@ -18889,7 +18889,7 @@
           <w:sz w:val="14"/>
           <w:szCs w:val="14"/>
         </w:rPr>
-        <w:t xml:space="preserve">Fig. 5 - Boitier v6, style JBL (rendu CAO) : 4 HP actifs (facade + bouts) + logo DOMOKAMI aux bouts.</w:t>
+        <w:t xml:space="preserve">Fig. 5 - Boitier v6, style JBL (rendu CAO) : facade 2 HP, radiateurs de basse + logo DOMOKAMI aux bouts.</w:t>
       </w:r>
     </w:p>
     <w:p>
@@ -18941,7 +18941,7 @@
           <w:sz w:val="17"/>
           <w:szCs w:val="17"/>
         </w:rPr>
-        <w:t xml:space="preserve">Imprime en PA-CF, le boitier est un caisson acoustique ETANCHE (sans events). Il loge QUATRE haut-parleurs de 40 mm TOUS ACTIFS : deux en FACADE (2 grilles rondes) et deux sur les BOUTS (gauche/droite). Ils sont pilotes par un AMPLI EXTERNE 4 VOIES (LOTHYE, 2x PAM8403) : l'audio sort par le jack 3,5 mm, l'ampli est alimente en 5 V (connecteur J3) ; le PAM8403 soude sur le PCB n'est plus utilise. Chaque bout porte le logo DOMOKAMI en relief. L'USB-C est seul a l'arriere : plus aucun chevauchement avec un haut-parleur.</w:t>
+        <w:t xml:space="preserve">Imprime en PA-CF, le boitier est un caisson acoustique ETANCHE (sans events). Il loge QUATRE haut-parleurs de 40 mm : deux pleine-bande actifs en FACADE (2 grilles rondes) et deux RADIATEURS PASSIFS sur les deux BOUTS (gauche/droite) qui renforcent les basses par la pression interne (aucun cablage, electronique inchangee). Chaque bout porte le logo DOMOKAMI en relief, a la maniere du logo JBL sur la membrane de basse. L'USB-C est seul a l'arriere : plus aucun chevauchement avec un haut-parleur.</w:t>
       </w:r>
     </w:p>
     <w:p>
@@ -18965,7 +18965,7 @@
           <w:sz w:val="17"/>
           <w:szCs w:val="17"/>
         </w:rPr>
-        <w:t xml:space="preserve">La molette centrale (encodeur EC11 a montage panneau + anneau LED) tombe sous le doigt ; le volume interne et les 4 HP actifs (caisson clos, suspension acoustique) donnent une assise de basses solide pour ce format compact. Prevoir les 4 joints TPU (etancheite) pour en profiter pleinement.</w:t>
+        <w:t xml:space="preserve">La molette centrale (encodeur EC11 a montage panneau + anneau LED) tombe sous le doigt ; le volume interne et les radiateurs passifs des extremites donnent une assise de basses inhabituelle pour ce format compact. Prevoir les 4 joints TPU (etancheite) pour en profiter pleinement.</w:t>
       </w:r>
     </w:p>
     <w:tbl>
@@ -19794,7 +19794,7 @@
                       <w:sz w:val="17"/>
                       <w:szCs w:val="17"/>
                     </w:rPr>
-                    <w:t xml:space="preserve">4 x 40 mm ACTIFS</w:t>
+                    <w:t xml:space="preserve">4 x 40 mm (2+2)</w:t>
                   </w:r>
                 </w:p>
               </w:tc>
@@ -19823,7 +19823,7 @@
                       <w:sz w:val="16"/>
                       <w:szCs w:val="16"/>
                     </w:rPr>
-                    <w:t xml:space="preserve">Ampli</w:t>
+                    <w:t xml:space="preserve">Basses</w:t>
                   </w:r>
                 </w:p>
               </w:tc>
@@ -19850,7 +19850,7 @@
                       <w:sz w:val="17"/>
                       <w:szCs w:val="17"/>
                     </w:rPr>
-                    <w:t xml:space="preserve">externe 4 voies (J3 5V)</w:t>
+                    <w:t xml:space="preserve">2 radiateurs passifs</w:t>
                   </w:r>
                 </w:p>
               </w:tc>
@@ -20142,7 +20142,7 @@
           <w:sz w:val="14"/>
           <w:szCs w:val="14"/>
         </w:rPr>
-        <w:t xml:space="preserve">Fig. 6 - Vue eclatee du boitier v6 : capot a molette + bac (4 HP actifs : 2 facade + 2 bouts).</w:t>
+        <w:t xml:space="preserve">Fig. 6 - Vue eclatee du boitier v6 : capot a molette + bac (2 HP facade, 2 radiateurs aux bouts).</w:t>
       </w:r>
     </w:p>
     <w:tbl>
@@ -20526,7 +20526,7 @@
                             <w:sz w:val="17"/>
                             <w:szCs w:val="17"/>
                           </w:rPr>
-                          <w:t xml:space="preserve">ESP32-S3, PCM5102, sortie ligne (jack) - carte 76,7 x 108 mm</w:t>
+                          <w:t xml:space="preserve">ESP32-S3, PCM5102, ampli PAM8403 - carte 76,7 x 108 mm</w:t>
                         </w:r>
                       </w:p>
                     </w:tc>
@@ -20611,7 +20611,7 @@
                             <w:sz w:val="16"/>
                             <w:szCs w:val="16"/>
                           </w:rPr>
-                          <w:t xml:space="preserve">7. HP cotes (x2)</w:t>
+                          <w:t xml:space="preserve">7. Radiateurs (x2)</w:t>
                         </w:r>
                       </w:p>
                     </w:tc>
@@ -20638,7 +20638,7 @@
                             <w:sz w:val="17"/>
                             <w:szCs w:val="17"/>
                           </w:rPr>
-                          <w:t xml:space="preserve">40 mm actifs, sur les 2 bouts +-X, logo DOMOKAMI relief</w:t>
+                          <w:t xml:space="preserve">40 mm passifs, sur les 2 bouts +-X, logo DOMOKAMI relief</w:t>
                         </w:r>
                       </w:p>
                     </w:tc>
@@ -20836,7 +20836,7 @@
                             <w:sz w:val="16"/>
                             <w:szCs w:val="16"/>
                           </w:rPr>
-                          <w:t xml:space="preserve">4 HP 40 mm ACTIFS</w:t>
+                          <w:t xml:space="preserve">4 haut-parleurs 40 mm</w:t>
                         </w:r>
                       </w:p>
                     </w:tc>
@@ -20863,7 +20863,7 @@
                             <w:sz w:val="17"/>
                             <w:szCs w:val="17"/>
                           </w:rPr>
-                          <w:t xml:space="preserve">2 facade + 2 bouts (cotes)</w:t>
+                          <w:t xml:space="preserve">2 actifs facade + 2 radiateurs bouts</w:t>
                         </w:r>
                       </w:p>
                     </w:tc>
@@ -20892,7 +20892,7 @@
                             <w:sz w:val="16"/>
                             <w:szCs w:val="16"/>
                           </w:rPr>
-                          <w:t xml:space="preserve">Ampli externe 4 voies</w:t>
+                          <w:t xml:space="preserve">Radiateurs sur les bouts</w:t>
                         </w:r>
                       </w:p>
                     </w:tc>
@@ -20919,7 +20919,7 @@
                             <w:sz w:val="17"/>
                             <w:szCs w:val="17"/>
                           </w:rPr>
-                          <w:t xml:space="preserve">LOTHYE (2x PAM8403), via jack + 5V</w:t>
+                          <w:t xml:space="preserve">reflexion de basse (style JBL)</w:t>
                         </w:r>
                       </w:p>
                     </w:tc>
@@ -22773,7 +22773,7 @@
             </w:tcMar>
           </w:tcPr>
           <w:p>
-            <w:hyperlink w:history="1" r:id="rIdzuwmsonh6ceyyoi1tb5up">
+            <w:hyperlink w:history="1" r:id="rIdgyibsh9zj7bbuswxjg8t-">
               <w:r>
                 <w:rPr>
                   <w:rFonts w:ascii="Courier New" w:cs="Courier New" w:eastAsia="Courier New" w:hAnsi="Courier New"/>
@@ -22804,7 +22804,7 @@
             </w:tcMar>
           </w:tcPr>
           <w:p>
-            <w:hyperlink w:history="1" r:id="rIdi8tdvfr1cyafk7flejuiv">
+            <w:hyperlink w:history="1" r:id="rIdfb4ereunhvewygi01vyc2">
               <w:r>
                 <w:rPr>
                   <w:rFonts w:ascii="Courier New" w:cs="Courier New" w:eastAsia="Courier New" w:hAnsi="Courier New"/>
@@ -22892,7 +22892,7 @@
             </w:tcMar>
           </w:tcPr>
           <w:p>
-            <w:hyperlink w:history="1" r:id="rIdu7dcknxhczq4g2pcasloi">
+            <w:hyperlink w:history="1" r:id="rIdlungdee8mjft-x-zy3yt8">
               <w:r>
                 <w:rPr>
                   <w:rFonts w:ascii="Courier New" w:cs="Courier New" w:eastAsia="Courier New" w:hAnsi="Courier New"/>
@@ -22923,7 +22923,7 @@
             </w:tcMar>
           </w:tcPr>
           <w:p>
-            <w:hyperlink w:history="1" r:id="rIdywogefkld2_ouzptm_qbv">
+            <w:hyperlink w:history="1" r:id="rIdf0axykxoeyqgvx_i-599u">
               <w:r>
                 <w:rPr>
                   <w:rFonts w:ascii="Courier New" w:cs="Courier New" w:eastAsia="Courier New" w:hAnsi="Courier New"/>
@@ -23011,7 +23011,7 @@
             </w:tcMar>
           </w:tcPr>
           <w:p>
-            <w:hyperlink w:history="1" r:id="rIdtkipegv1s4s-_dbupnfbm">
+            <w:hyperlink w:history="1" r:id="rIdbrcfhobwiq6c29v2xxjnl">
               <w:r>
                 <w:rPr>
                   <w:rFonts w:ascii="Courier New" w:cs="Courier New" w:eastAsia="Courier New" w:hAnsi="Courier New"/>
@@ -23042,7 +23042,7 @@
             </w:tcMar>
           </w:tcPr>
           <w:p>
-            <w:hyperlink w:history="1" r:id="rIdad_i-2k9fadh8ic0daair">
+            <w:hyperlink w:history="1" r:id="rId7wkf4b7zdsvz-azj04ig8">
               <w:r>
                 <w:rPr>
                   <w:rFonts w:ascii="Courier New" w:cs="Courier New" w:eastAsia="Courier New" w:hAnsi="Courier New"/>
@@ -23104,7 +23104,7 @@
             </w:tcMar>
           </w:tcPr>
           <w:p>
-            <w:hyperlink w:history="1" r:id="rIdy2kzijv7fdgiqsg9flrbc">
+            <w:hyperlink w:history="1" r:id="rIdglnnbk68tzwo6olxyocl_">
               <w:r>
                 <w:rPr>
                   <w:rFonts w:ascii="Courier New" w:cs="Courier New" w:eastAsia="Courier New" w:hAnsi="Courier New"/>
@@ -25979,7 +25979,7 @@
             </w:tcMar>
           </w:tcPr>
           <w:p>
-            <w:hyperlink w:history="1" r:id="rIdrso0quv2a_cbceijp61an">
+            <w:hyperlink w:history="1" r:id="rId8chpdjd3rzz8ebsvim2ob">
               <w:r>
                 <w:rPr>
                   <w:rFonts w:ascii="Courier New" w:cs="Courier New" w:eastAsia="Courier New" w:hAnsi="Courier New"/>

</xml_diff>